<commit_message>
Fix child dev click bug and SELF_PROVIDER loading
</commit_message>
<xml_diff>
--- a/archive/notes.docx
+++ b/archive/notes.docx
@@ -16,7 +16,7 @@
           <w:bCs/>
           <w:highlight w:val="yellow"/>
         </w:rPr>
-        <w:t>3/18/2026</w:t>
+        <w:t>Next to-dos:</w:t>
       </w:r>
     </w:p>
     <w:p>
@@ -24,41 +24,11 @@
         <w:pStyle w:val="ListParagraph"/>
         <w:numPr>
           <w:ilvl w:val="0"/>
-          <w:numId w:val="4"/>
-        </w:numPr>
-        <w:rPr>
-          <w:highlight w:val="yellow"/>
-        </w:rPr>
-      </w:pPr>
-      <w:r>
-        <w:rPr>
-          <w:highlight w:val="yellow"/>
-        </w:rPr>
-        <w:t>2 Provider</w:t>
-      </w:r>
-    </w:p>
-    <w:p>
-      <w:pPr>
-        <w:pStyle w:val="ListParagraph"/>
-        <w:numPr>
-          <w:ilvl w:val="1"/>
-          <w:numId w:val="4"/>
-        </w:numPr>
-        <w:rPr>
-          <w:highlight w:val="yellow"/>
-        </w:rPr>
-      </w:pPr>
-      <w:r>
-        <w:rPr>
-          <w:highlight w:val="yellow"/>
-        </w:rPr>
-        <w:t xml:space="preserve">Have the first caregiver in the providers tab be pre-loaded as myself in </w:t>
-      </w:r>
-      <w:r>
-        <w:rPr>
-          <w:highlight w:val="yellow"/>
-        </w:rPr>
-        <w:t>a neutral grey color</w:t>
+          <w:numId w:val="5"/>
+        </w:numPr>
+      </w:pPr>
+      <w:r>
+        <w:t>Figure out exact child questions</w:t>
       </w:r>
     </w:p>
     <w:p>
@@ -66,49 +36,11 @@
         <w:pStyle w:val="ListParagraph"/>
         <w:numPr>
           <w:ilvl w:val="0"/>
-          <w:numId w:val="4"/>
-        </w:numPr>
-        <w:rPr>
-          <w:strike/>
-        </w:rPr>
-      </w:pPr>
-      <w:r>
-        <w:rPr>
-          <w:strike/>
-        </w:rPr>
-        <w:t>3 affordability</w:t>
-      </w:r>
-    </w:p>
-    <w:p>
-      <w:pPr>
-        <w:pStyle w:val="ListParagraph"/>
-        <w:numPr>
-          <w:ilvl w:val="1"/>
-          <w:numId w:val="4"/>
-        </w:numPr>
-        <w:rPr>
-          <w:strike/>
-        </w:rPr>
-      </w:pPr>
-      <w:r>
-        <w:rPr>
-          <w:strike/>
-        </w:rPr>
-        <w:t xml:space="preserve">Have </w:t>
-      </w:r>
-      <w:proofErr w:type="gramStart"/>
-      <w:r>
-        <w:rPr>
-          <w:strike/>
-        </w:rPr>
-        <w:t>them</w:t>
-      </w:r>
-      <w:proofErr w:type="gramEnd"/>
-      <w:r>
-        <w:rPr>
-          <w:strike/>
-        </w:rPr>
-        <w:t xml:space="preserve"> put the percentage open. Include instruction: if you don’t know exactly, you can put an approximation</w:t>
+          <w:numId w:val="5"/>
+        </w:numPr>
+      </w:pPr>
+      <w:r>
+        <w:t>Including entry question about relationship to child (i.e., biological mother, etc)</w:t>
       </w:r>
     </w:p>
     <w:p>
@@ -116,92 +48,11 @@
         <w:pStyle w:val="ListParagraph"/>
         <w:numPr>
           <w:ilvl w:val="0"/>
-          <w:numId w:val="4"/>
-        </w:numPr>
-      </w:pPr>
-      <w:r>
-        <w:t xml:space="preserve">4 </w:t>
-      </w:r>
-      <w:proofErr w:type="gramStart"/>
-      <w:r>
-        <w:t>effort</w:t>
-      </w:r>
-      <w:proofErr w:type="gramEnd"/>
-    </w:p>
-    <w:p>
-      <w:pPr>
-        <w:pStyle w:val="ListParagraph"/>
-        <w:numPr>
-          <w:ilvl w:val="1"/>
-          <w:numId w:val="4"/>
-        </w:numPr>
-        <w:rPr>
-          <w:strike/>
-        </w:rPr>
-      </w:pPr>
-      <w:r>
-        <w:rPr>
-          <w:strike/>
-        </w:rPr>
-        <w:t>Have them put minutes openly instead of choosing</w:t>
-      </w:r>
-    </w:p>
-    <w:p>
-      <w:pPr>
-        <w:pStyle w:val="ListParagraph"/>
-        <w:numPr>
-          <w:ilvl w:val="1"/>
-          <w:numId w:val="4"/>
-        </w:numPr>
-        <w:rPr>
-          <w:strike/>
-        </w:rPr>
-      </w:pPr>
-      <w:r>
-        <w:rPr>
-          <w:strike/>
-        </w:rPr>
-        <w:t xml:space="preserve">Last question “how difficult” </w:t>
-      </w:r>
-      <w:r>
-        <w:rPr>
-          <w:strike/>
-        </w:rPr>
-        <w:t xml:space="preserve">-&gt; do not </w:t>
-      </w:r>
-      <w:proofErr w:type="gramStart"/>
-      <w:r>
-        <w:rPr>
-          <w:strike/>
-        </w:rPr>
-        <w:t>have not</w:t>
-      </w:r>
-      <w:proofErr w:type="gramEnd"/>
-      <w:r>
-        <w:rPr>
-          <w:strike/>
-        </w:rPr>
-        <w:t xml:space="preserve"> applicable as 0</w:t>
-      </w:r>
-    </w:p>
-    <w:p>
-      <w:pPr>
-        <w:pStyle w:val="ListParagraph"/>
-        <w:numPr>
-          <w:ilvl w:val="1"/>
-          <w:numId w:val="4"/>
-        </w:numPr>
-      </w:pPr>
-      <w:r>
-        <w:t>For every question, include a side-option as “</w:t>
-      </w:r>
-      <w:proofErr w:type="spellStart"/>
-      <w:r>
-        <w:t>Don’t’know</w:t>
-      </w:r>
-      <w:proofErr w:type="spellEnd"/>
-      <w:r>
-        <w:t>/Not applicable”</w:t>
+          <w:numId w:val="5"/>
+        </w:numPr>
+      </w:pPr>
+      <w:r>
+        <w:t>Figure out Stanford Server</w:t>
       </w:r>
     </w:p>
     <w:p>
@@ -209,40 +60,11 @@
         <w:pStyle w:val="ListParagraph"/>
         <w:numPr>
           <w:ilvl w:val="0"/>
-          <w:numId w:val="4"/>
-        </w:numPr>
-      </w:pPr>
-      <w:r>
-        <w:t>5 child dev</w:t>
-      </w:r>
-    </w:p>
-    <w:p>
-      <w:pPr>
-        <w:pStyle w:val="ListParagraph"/>
-        <w:numPr>
-          <w:ilvl w:val="1"/>
-          <w:numId w:val="4"/>
-        </w:numPr>
-      </w:pPr>
-      <w:r>
-        <w:t xml:space="preserve">Not allowing me to click </w:t>
-      </w:r>
-      <w:r>
-        <w:t xml:space="preserve">any of the </w:t>
-      </w:r>
-      <w:proofErr w:type="gramStart"/>
-      <w:r>
-        <w:t>multiple choice</w:t>
-      </w:r>
-      <w:proofErr w:type="gramEnd"/>
-      <w:r>
-        <w:t xml:space="preserve"> question</w:t>
-      </w:r>
-      <w:r>
-        <w:t>s in this section</w:t>
-      </w:r>
-      <w:r>
-        <w:t xml:space="preserve">. There might be something wrong with the questions settings here. </w:t>
+          <w:numId w:val="5"/>
+        </w:numPr>
+      </w:pPr>
+      <w:r>
+        <w:t>Figure out entry vs weekly</w:t>
       </w:r>
     </w:p>
     <w:p>
@@ -250,63 +72,11 @@
         <w:pStyle w:val="ListParagraph"/>
         <w:numPr>
           <w:ilvl w:val="0"/>
-          <w:numId w:val="4"/>
-        </w:numPr>
-        <w:rPr>
-          <w:highlight w:val="yellow"/>
-        </w:rPr>
-      </w:pPr>
-      <w:r>
-        <w:rPr>
-          <w:highlight w:val="yellow"/>
-        </w:rPr>
-        <w:t xml:space="preserve">11 </w:t>
-      </w:r>
-      <w:proofErr w:type="gramStart"/>
-      <w:r>
-        <w:rPr>
-          <w:highlight w:val="yellow"/>
-        </w:rPr>
-        <w:t>review</w:t>
-      </w:r>
-      <w:proofErr w:type="gramEnd"/>
-      <w:r>
-        <w:rPr>
-          <w:highlight w:val="yellow"/>
-        </w:rPr>
-        <w:t xml:space="preserve"> and </w:t>
-      </w:r>
-      <w:proofErr w:type="gramStart"/>
-      <w:r>
-        <w:rPr>
-          <w:highlight w:val="yellow"/>
-        </w:rPr>
-        <w:t>submit</w:t>
-      </w:r>
-      <w:proofErr w:type="gramEnd"/>
-      <w:r>
-        <w:rPr>
-          <w:highlight w:val="yellow"/>
-        </w:rPr>
-        <w:t>:</w:t>
-      </w:r>
-    </w:p>
-    <w:p>
-      <w:pPr>
-        <w:pStyle w:val="ListParagraph"/>
-        <w:numPr>
-          <w:ilvl w:val="1"/>
-          <w:numId w:val="4"/>
-        </w:numPr>
-        <w:rPr>
-          <w:highlight w:val="yellow"/>
-        </w:rPr>
-      </w:pPr>
-      <w:r>
-        <w:rPr>
-          <w:highlight w:val="yellow"/>
-        </w:rPr>
-        <w:t>Do not show summary like that, leave it open for now</w:t>
+          <w:numId w:val="5"/>
+        </w:numPr>
+      </w:pPr>
+      <w:r>
+        <w:t>Figure out qualtrics adaptation</w:t>
       </w:r>
     </w:p>
     <w:p>
@@ -314,233 +84,11 @@
         <w:pStyle w:val="ListParagraph"/>
         <w:numPr>
           <w:ilvl w:val="0"/>
-          <w:numId w:val="4"/>
-        </w:numPr>
-      </w:pPr>
-      <w:r>
-        <w:t>Weekly check in</w:t>
-      </w:r>
-    </w:p>
-    <w:p>
-      <w:pPr>
-        <w:pStyle w:val="ListParagraph"/>
-        <w:numPr>
-          <w:ilvl w:val="1"/>
-          <w:numId w:val="4"/>
-        </w:numPr>
-        <w:rPr>
-          <w:strike/>
-        </w:rPr>
-      </w:pPr>
-      <w:r>
-        <w:rPr>
-          <w:strike/>
-        </w:rPr>
-        <w:t>Exclude new waitlist question</w:t>
-      </w:r>
-    </w:p>
-    <w:p>
-      <w:pPr>
-        <w:pStyle w:val="ListParagraph"/>
-        <w:numPr>
-          <w:ilvl w:val="1"/>
-          <w:numId w:val="4"/>
-        </w:numPr>
-        <w:rPr>
-          <w:strike/>
-        </w:rPr>
-      </w:pPr>
-      <w:r>
-        <w:rPr>
-          <w:strike/>
-        </w:rPr>
-        <w:t xml:space="preserve">For “removed from waitlist question”. Phrase it differently like “did you get </w:t>
-      </w:r>
-      <w:proofErr w:type="gramStart"/>
-      <w:r>
-        <w:rPr>
-          <w:strike/>
-        </w:rPr>
-        <w:t>off of</w:t>
-      </w:r>
-      <w:proofErr w:type="gramEnd"/>
-      <w:r>
-        <w:rPr>
-          <w:strike/>
-        </w:rPr>
-        <w:t xml:space="preserve"> any waitlists, as in, got a spot in a </w:t>
-      </w:r>
-      <w:r>
-        <w:rPr>
-          <w:strike/>
-        </w:rPr>
-        <w:t xml:space="preserve">new childcare </w:t>
-      </w:r>
-      <w:r>
-        <w:rPr>
-          <w:strike/>
-        </w:rPr>
-        <w:t>option where you were previously on a waitlist</w:t>
-      </w:r>
-      <w:r>
-        <w:rPr>
-          <w:strike/>
-        </w:rPr>
-        <w:t>?</w:t>
-      </w:r>
-    </w:p>
-    <w:p>
-      <w:pPr>
-        <w:pStyle w:val="ListParagraph"/>
-        <w:numPr>
-          <w:ilvl w:val="2"/>
-          <w:numId w:val="4"/>
-        </w:numPr>
-        <w:rPr>
-          <w:strike/>
-        </w:rPr>
-      </w:pPr>
-      <w:r>
-        <w:rPr>
-          <w:strike/>
-        </w:rPr>
-        <w:t xml:space="preserve">If yes, </w:t>
-      </w:r>
-      <w:r>
-        <w:rPr>
-          <w:strike/>
-        </w:rPr>
-        <w:t xml:space="preserve">ask if any other potential “confounders” also changed and thus </w:t>
-      </w:r>
-      <w:r>
-        <w:rPr>
-          <w:strike/>
-        </w:rPr>
-        <w:t>led to getting of the waitlist like “got a new job”, “got a raise”</w:t>
-      </w:r>
-      <w:r>
-        <w:rPr>
-          <w:strike/>
-        </w:rPr>
-        <w:t>, “moved to a new home”, etc.</w:t>
-      </w:r>
-    </w:p>
-    <w:p>
-      <w:pPr>
-        <w:pStyle w:val="ListParagraph"/>
-        <w:numPr>
-          <w:ilvl w:val="1"/>
-          <w:numId w:val="4"/>
-        </w:numPr>
-        <w:rPr>
-          <w:highlight w:val="yellow"/>
-        </w:rPr>
-      </w:pPr>
-      <w:r>
-        <w:rPr>
-          <w:highlight w:val="yellow"/>
-        </w:rPr>
-        <w:t>Do not display review or computed metrics to participant</w:t>
-      </w:r>
-    </w:p>
-    <w:p>
-      <w:pPr>
-        <w:pStyle w:val="ListParagraph"/>
-        <w:numPr>
-          <w:ilvl w:val="0"/>
-          <w:numId w:val="4"/>
-        </w:numPr>
-        <w:rPr>
-          <w:strike/>
-        </w:rPr>
-      </w:pPr>
-      <w:r>
-        <w:rPr>
-          <w:strike/>
-        </w:rPr>
-        <w:t>Other edits:</w:t>
-      </w:r>
-    </w:p>
-    <w:p>
-      <w:pPr>
-        <w:pStyle w:val="ListParagraph"/>
-        <w:numPr>
-          <w:ilvl w:val="1"/>
-          <w:numId w:val="4"/>
-        </w:numPr>
-        <w:rPr>
-          <w:strike/>
-        </w:rPr>
-      </w:pPr>
-      <w:r>
-        <w:rPr>
-          <w:strike/>
-        </w:rPr>
-        <w:t xml:space="preserve">I edited the file structure, now there is </w:t>
-      </w:r>
-      <w:proofErr w:type="gramStart"/>
-      <w:r>
-        <w:rPr>
-          <w:strike/>
-        </w:rPr>
-        <w:t>not</w:t>
-      </w:r>
-      <w:proofErr w:type="gramEnd"/>
-      <w:r>
-        <w:rPr>
-          <w:strike/>
-        </w:rPr>
-        <w:t xml:space="preserve"> parent folder anymore, it is just the childcare-precarity-tool folder. </w:t>
-      </w:r>
-    </w:p>
-    <w:p>
-      <w:pPr>
-        <w:pStyle w:val="ListParagraph"/>
-        <w:numPr>
-          <w:ilvl w:val="1"/>
-          <w:numId w:val="4"/>
-        </w:numPr>
-        <w:rPr>
-          <w:strike/>
-        </w:rPr>
-      </w:pPr>
-      <w:r>
-        <w:rPr>
-          <w:strike/>
-        </w:rPr>
-        <w:t xml:space="preserve">I excluded some files and moved some to a folder called archive. Please have </w:t>
-      </w:r>
-      <w:proofErr w:type="spellStart"/>
-      <w:r>
-        <w:rPr>
-          <w:strike/>
-        </w:rPr>
-        <w:t>github</w:t>
-      </w:r>
-      <w:proofErr w:type="spellEnd"/>
-      <w:r>
-        <w:rPr>
-          <w:strike/>
-        </w:rPr>
-        <w:t xml:space="preserve"> ignore and not </w:t>
-      </w:r>
-      <w:r>
-        <w:rPr>
-          <w:strike/>
-        </w:rPr>
-        <w:t>synchronize this folder, I want it locally only</w:t>
-      </w:r>
-    </w:p>
-    <w:p>
-      <w:pPr>
-        <w:pStyle w:val="ListParagraph"/>
-        <w:numPr>
-          <w:ilvl w:val="1"/>
-          <w:numId w:val="4"/>
-        </w:numPr>
-      </w:pPr>
-      <w:r>
-        <w:br/>
+          <w:numId w:val="5"/>
+        </w:numPr>
+      </w:pPr>
+      <w:r>
+        <w:t>Check on the items below</w:t>
       </w:r>
     </w:p>
     <w:p>
@@ -551,21 +99,13 @@
           <w:highlight w:val="yellow"/>
         </w:rPr>
       </w:pPr>
-    </w:p>
-    <w:p>
-      <w:pPr>
-        <w:rPr>
-          <w:b/>
-          <w:bCs/>
-        </w:rPr>
-      </w:pPr>
       <w:r>
         <w:rPr>
           <w:b/>
           <w:bCs/>
           <w:highlight w:val="yellow"/>
         </w:rPr>
-        <w:t>3/17/2026</w:t>
+        <w:t>3/18/2026</w:t>
       </w:r>
     </w:p>
     <w:p>
@@ -573,109 +113,434 @@
         <w:pStyle w:val="ListParagraph"/>
         <w:numPr>
           <w:ilvl w:val="0"/>
-          <w:numId w:val="3"/>
-        </w:numPr>
+          <w:numId w:val="4"/>
+        </w:numPr>
+        <w:rPr>
+          <w:highlight w:val="yellow"/>
+        </w:rPr>
+      </w:pPr>
+      <w:r>
+        <w:rPr>
+          <w:highlight w:val="yellow"/>
+        </w:rPr>
+        <w:t>2 Provider</w:t>
+      </w:r>
+    </w:p>
+    <w:p>
+      <w:pPr>
+        <w:pStyle w:val="ListParagraph"/>
+        <w:numPr>
+          <w:ilvl w:val="1"/>
+          <w:numId w:val="4"/>
+        </w:numPr>
+        <w:rPr>
+          <w:highlight w:val="yellow"/>
+        </w:rPr>
+      </w:pPr>
+      <w:r>
+        <w:rPr>
+          <w:highlight w:val="yellow"/>
+        </w:rPr>
+        <w:t xml:space="preserve">Have the first caregiver in the providers tab be pre-loaded as myself in </w:t>
+      </w:r>
+      <w:r>
+        <w:rPr>
+          <w:highlight w:val="yellow"/>
+        </w:rPr>
+        <w:t>a neutral grey color</w:t>
+      </w:r>
+    </w:p>
+    <w:p>
+      <w:pPr>
+        <w:pStyle w:val="ListParagraph"/>
+        <w:numPr>
+          <w:ilvl w:val="0"/>
+          <w:numId w:val="4"/>
+        </w:numPr>
+        <w:rPr>
+          <w:strike/>
+        </w:rPr>
+      </w:pPr>
+      <w:r>
+        <w:rPr>
+          <w:strike/>
+        </w:rPr>
+        <w:t>3 affordability</w:t>
+      </w:r>
+    </w:p>
+    <w:p>
+      <w:pPr>
+        <w:pStyle w:val="ListParagraph"/>
+        <w:numPr>
+          <w:ilvl w:val="1"/>
+          <w:numId w:val="4"/>
+        </w:numPr>
+        <w:rPr>
+          <w:strike/>
+        </w:rPr>
+      </w:pPr>
+      <w:r>
+        <w:rPr>
+          <w:strike/>
+        </w:rPr>
+        <w:t>Have them put the percentage open. Include instruction: if you don’t know exactly, you can put an approximation</w:t>
+      </w:r>
+    </w:p>
+    <w:p>
+      <w:pPr>
+        <w:pStyle w:val="ListParagraph"/>
+        <w:numPr>
+          <w:ilvl w:val="0"/>
+          <w:numId w:val="4"/>
+        </w:numPr>
+      </w:pPr>
+      <w:r>
+        <w:t>4 effort</w:t>
+      </w:r>
+    </w:p>
+    <w:p>
+      <w:pPr>
+        <w:pStyle w:val="ListParagraph"/>
+        <w:numPr>
+          <w:ilvl w:val="1"/>
+          <w:numId w:val="4"/>
+        </w:numPr>
+        <w:rPr>
+          <w:strike/>
+        </w:rPr>
+      </w:pPr>
+      <w:r>
+        <w:rPr>
+          <w:strike/>
+        </w:rPr>
+        <w:t>Have them put minutes openly instead of choosing</w:t>
+      </w:r>
+    </w:p>
+    <w:p>
+      <w:pPr>
+        <w:pStyle w:val="ListParagraph"/>
+        <w:numPr>
+          <w:ilvl w:val="1"/>
+          <w:numId w:val="4"/>
+        </w:numPr>
+        <w:rPr>
+          <w:strike/>
+        </w:rPr>
+      </w:pPr>
+      <w:r>
+        <w:rPr>
+          <w:strike/>
+        </w:rPr>
+        <w:t xml:space="preserve">Last question “how difficult” </w:t>
+      </w:r>
+      <w:r>
+        <w:rPr>
+          <w:strike/>
+        </w:rPr>
+        <w:t>-&gt; do not have not applicable as 0</w:t>
+      </w:r>
+    </w:p>
+    <w:p>
+      <w:pPr>
+        <w:pStyle w:val="ListParagraph"/>
+        <w:numPr>
+          <w:ilvl w:val="1"/>
+          <w:numId w:val="4"/>
+        </w:numPr>
+      </w:pPr>
+      <w:r>
+        <w:t>For every question, include a side-option as “Don’t’know/Not applicable”</w:t>
+      </w:r>
+    </w:p>
+    <w:p>
+      <w:pPr>
+        <w:pStyle w:val="ListParagraph"/>
+        <w:numPr>
+          <w:ilvl w:val="0"/>
+          <w:numId w:val="4"/>
+        </w:numPr>
+      </w:pPr>
+      <w:r>
+        <w:t>5 child dev</w:t>
+      </w:r>
+    </w:p>
+    <w:p>
+      <w:pPr>
+        <w:pStyle w:val="ListParagraph"/>
+        <w:numPr>
+          <w:ilvl w:val="1"/>
+          <w:numId w:val="4"/>
+        </w:numPr>
+      </w:pPr>
+      <w:r>
+        <w:t xml:space="preserve">Not allowing me to click </w:t>
+      </w:r>
+      <w:r>
+        <w:t>any of the multiple choice</w:t>
+      </w:r>
+      <w:r>
+        <w:t xml:space="preserve"> question</w:t>
+      </w:r>
+      <w:r>
+        <w:t>s in this section</w:t>
+      </w:r>
+      <w:r>
+        <w:t xml:space="preserve">. There might be something wrong with the questions settings here. </w:t>
+      </w:r>
+    </w:p>
+    <w:p>
+      <w:pPr>
+        <w:pStyle w:val="ListParagraph"/>
+        <w:numPr>
+          <w:ilvl w:val="0"/>
+          <w:numId w:val="4"/>
+        </w:numPr>
+        <w:rPr>
+          <w:strike/>
+        </w:rPr>
+      </w:pPr>
+      <w:r>
+        <w:rPr>
+          <w:strike/>
+        </w:rPr>
+        <w:t>11 review and submit:</w:t>
+      </w:r>
+    </w:p>
+    <w:p>
+      <w:pPr>
+        <w:pStyle w:val="ListParagraph"/>
+        <w:numPr>
+          <w:ilvl w:val="1"/>
+          <w:numId w:val="4"/>
+        </w:numPr>
+        <w:rPr>
+          <w:strike/>
+        </w:rPr>
+      </w:pPr>
+      <w:r>
+        <w:rPr>
+          <w:strike/>
+        </w:rPr>
+        <w:t>Do not show summary like that, leave it open for now</w:t>
+      </w:r>
+    </w:p>
+    <w:p>
+      <w:pPr>
+        <w:pStyle w:val="ListParagraph"/>
+        <w:numPr>
+          <w:ilvl w:val="0"/>
+          <w:numId w:val="4"/>
+        </w:numPr>
+      </w:pPr>
+      <w:r>
+        <w:t>Weekly check in</w:t>
+      </w:r>
+    </w:p>
+    <w:p>
+      <w:pPr>
+        <w:pStyle w:val="ListParagraph"/>
+        <w:numPr>
+          <w:ilvl w:val="1"/>
+          <w:numId w:val="4"/>
+        </w:numPr>
+        <w:rPr>
+          <w:strike/>
+        </w:rPr>
+      </w:pPr>
+      <w:r>
+        <w:rPr>
+          <w:strike/>
+        </w:rPr>
+        <w:t>Exclude new waitlist question</w:t>
+      </w:r>
+    </w:p>
+    <w:p>
+      <w:pPr>
+        <w:pStyle w:val="ListParagraph"/>
+        <w:numPr>
+          <w:ilvl w:val="1"/>
+          <w:numId w:val="4"/>
+        </w:numPr>
+        <w:rPr>
+          <w:strike/>
+        </w:rPr>
+      </w:pPr>
+      <w:r>
+        <w:rPr>
+          <w:strike/>
+        </w:rPr>
+        <w:t xml:space="preserve">For “removed from waitlist question”. Phrase it differently like “did you get off of any waitlists, as in, got a spot in a </w:t>
+      </w:r>
+      <w:r>
+        <w:rPr>
+          <w:strike/>
+        </w:rPr>
+        <w:t xml:space="preserve">new childcare </w:t>
+      </w:r>
+      <w:r>
+        <w:rPr>
+          <w:strike/>
+        </w:rPr>
+        <w:t>option where you were previously on a waitlist</w:t>
+      </w:r>
+      <w:r>
+        <w:rPr>
+          <w:strike/>
+        </w:rPr>
+        <w:t>?</w:t>
+      </w:r>
+    </w:p>
+    <w:p>
+      <w:pPr>
+        <w:pStyle w:val="ListParagraph"/>
+        <w:numPr>
+          <w:ilvl w:val="2"/>
+          <w:numId w:val="4"/>
+        </w:numPr>
+        <w:rPr>
+          <w:strike/>
+        </w:rPr>
+      </w:pPr>
+      <w:r>
+        <w:rPr>
+          <w:strike/>
+        </w:rPr>
+        <w:t xml:space="preserve">If yes, </w:t>
+      </w:r>
+      <w:r>
+        <w:rPr>
+          <w:strike/>
+        </w:rPr>
+        <w:t xml:space="preserve">ask if any other potential “confounders” also changed and thus </w:t>
+      </w:r>
+      <w:r>
+        <w:rPr>
+          <w:strike/>
+        </w:rPr>
+        <w:t>led to getting of the waitlist like “got a new job”, “got a raise”</w:t>
+      </w:r>
+      <w:r>
+        <w:rPr>
+          <w:strike/>
+        </w:rPr>
+        <w:t>, “moved to a new home”, etc.</w:t>
+      </w:r>
+    </w:p>
+    <w:p>
+      <w:pPr>
+        <w:pStyle w:val="ListParagraph"/>
+        <w:numPr>
+          <w:ilvl w:val="1"/>
+          <w:numId w:val="4"/>
+        </w:numPr>
+        <w:rPr>
+          <w:strike/>
+        </w:rPr>
+      </w:pPr>
+      <w:r>
+        <w:rPr>
+          <w:strike/>
+        </w:rPr>
+        <w:t>Do not display review or computed metrics to participant</w:t>
+      </w:r>
+    </w:p>
+    <w:p>
+      <w:pPr>
+        <w:pStyle w:val="ListParagraph"/>
+        <w:numPr>
+          <w:ilvl w:val="0"/>
+          <w:numId w:val="4"/>
+        </w:numPr>
+        <w:rPr>
+          <w:strike/>
+        </w:rPr>
+      </w:pPr>
+      <w:r>
+        <w:rPr>
+          <w:strike/>
+        </w:rPr>
+        <w:t>Other edits:</w:t>
+      </w:r>
+    </w:p>
+    <w:p>
+      <w:pPr>
+        <w:pStyle w:val="ListParagraph"/>
+        <w:numPr>
+          <w:ilvl w:val="1"/>
+          <w:numId w:val="4"/>
+        </w:numPr>
+        <w:rPr>
+          <w:strike/>
+        </w:rPr>
+      </w:pPr>
+      <w:r>
+        <w:rPr>
+          <w:strike/>
+        </w:rPr>
+        <w:t xml:space="preserve">I edited the file structure, now there is not parent folder anymore, it is just the childcare-precarity-tool folder. </w:t>
+      </w:r>
+    </w:p>
+    <w:p>
+      <w:pPr>
+        <w:pStyle w:val="ListParagraph"/>
+        <w:numPr>
+          <w:ilvl w:val="1"/>
+          <w:numId w:val="4"/>
+        </w:numPr>
+        <w:rPr>
+          <w:strike/>
+        </w:rPr>
+      </w:pPr>
+      <w:r>
+        <w:rPr>
+          <w:strike/>
+        </w:rPr>
+        <w:lastRenderedPageBreak/>
+        <w:t xml:space="preserve">I excluded some files and moved some to a folder called archive. Please have github ignore and not </w:t>
+      </w:r>
+      <w:r>
+        <w:rPr>
+          <w:strike/>
+        </w:rPr>
+        <w:t>synchronize this folder, I want it locally only</w:t>
+      </w:r>
+    </w:p>
+    <w:p>
+      <w:pPr>
+        <w:pStyle w:val="ListParagraph"/>
+        <w:numPr>
+          <w:ilvl w:val="1"/>
+          <w:numId w:val="4"/>
+        </w:numPr>
+      </w:pPr>
+      <w:r>
+        <w:br/>
+      </w:r>
+    </w:p>
+    <w:p>
+      <w:pPr>
         <w:rPr>
           <w:b/>
           <w:bCs/>
-        </w:rPr>
-      </w:pPr>
-      <w:r>
+          <w:highlight w:val="yellow"/>
+        </w:rPr>
+      </w:pPr>
+    </w:p>
+    <w:p>
+      <w:pPr>
         <w:rPr>
           <w:b/>
           <w:bCs/>
         </w:rPr>
-        <w:t>Entry and exit</w:t>
-      </w:r>
+      </w:pPr>
       <w:r>
         <w:rPr>
           <w:b/>
           <w:bCs/>
-        </w:rPr>
-        <w:t xml:space="preserve"> ~30 minutes</w:t>
-      </w:r>
-    </w:p>
-    <w:p>
-      <w:pPr>
-        <w:pStyle w:val="ListParagraph"/>
-        <w:numPr>
-          <w:ilvl w:val="1"/>
-          <w:numId w:val="3"/>
-        </w:numPr>
-      </w:pPr>
-      <w:r>
-        <w:t>Demographics</w:t>
-      </w:r>
-    </w:p>
-    <w:p>
-      <w:pPr>
-        <w:pStyle w:val="ListParagraph"/>
-        <w:numPr>
-          <w:ilvl w:val="1"/>
-          <w:numId w:val="3"/>
-        </w:numPr>
-      </w:pPr>
-      <w:r>
-        <w:lastRenderedPageBreak/>
-        <w:t>Access + precarity</w:t>
-      </w:r>
-      <w:r>
-        <w:t xml:space="preserve"> (full on entry)</w:t>
-      </w:r>
-    </w:p>
-    <w:p>
-      <w:pPr>
-        <w:pStyle w:val="ListParagraph"/>
-        <w:numPr>
-          <w:ilvl w:val="1"/>
-          <w:numId w:val="3"/>
-        </w:numPr>
-      </w:pPr>
-      <w:r>
-        <w:t>Parent emotional</w:t>
-      </w:r>
-    </w:p>
-    <w:p>
-      <w:pPr>
-        <w:pStyle w:val="ListParagraph"/>
-        <w:numPr>
-          <w:ilvl w:val="1"/>
-          <w:numId w:val="3"/>
-        </w:numPr>
-      </w:pPr>
-      <w:r>
-        <w:t>Child emotional</w:t>
-      </w:r>
-    </w:p>
-    <w:p>
-      <w:pPr>
-        <w:pStyle w:val="ListParagraph"/>
-        <w:numPr>
-          <w:ilvl w:val="1"/>
-          <w:numId w:val="3"/>
-        </w:numPr>
-      </w:pPr>
-      <w:r>
-        <w:t>Child Cognition</w:t>
-      </w:r>
-    </w:p>
-    <w:p>
-      <w:pPr>
-        <w:pStyle w:val="ListParagraph"/>
-        <w:numPr>
-          <w:ilvl w:val="1"/>
-          <w:numId w:val="3"/>
-        </w:numPr>
-      </w:pPr>
-      <w:r>
-        <w:t>Parent cognition</w:t>
-      </w:r>
-    </w:p>
-    <w:p>
-      <w:pPr>
-        <w:pStyle w:val="ListParagraph"/>
-        <w:ind w:left="1440"/>
-      </w:pPr>
+          <w:highlight w:val="yellow"/>
+        </w:rPr>
+        <w:t>3/17/2026</w:t>
+      </w:r>
     </w:p>
     <w:p>
       <w:pPr>
@@ -694,14 +559,26 @@
           <w:b/>
           <w:bCs/>
         </w:rPr>
-        <w:t>Weekly</w:t>
+        <w:t>Entry and exit</w:t>
       </w:r>
       <w:r>
         <w:rPr>
           <w:b/>
           <w:bCs/>
         </w:rPr>
-        <w:t xml:space="preserve"> ~ 5 minutes</w:t>
+        <w:t xml:space="preserve"> ~30 minutes</w:t>
+      </w:r>
+    </w:p>
+    <w:p>
+      <w:pPr>
+        <w:pStyle w:val="ListParagraph"/>
+        <w:numPr>
+          <w:ilvl w:val="1"/>
+          <w:numId w:val="3"/>
+        </w:numPr>
+      </w:pPr>
+      <w:r>
+        <w:t>Demographics</w:t>
       </w:r>
     </w:p>
     <w:p>
@@ -716,7 +593,19 @@
         <w:t>Access + precarity</w:t>
       </w:r>
       <w:r>
-        <w:t xml:space="preserve"> (calendar)</w:t>
+        <w:t xml:space="preserve"> (full on entry)</w:t>
+      </w:r>
+    </w:p>
+    <w:p>
+      <w:pPr>
+        <w:pStyle w:val="ListParagraph"/>
+        <w:numPr>
+          <w:ilvl w:val="1"/>
+          <w:numId w:val="3"/>
+        </w:numPr>
+      </w:pPr>
+      <w:r>
+        <w:t>Parent emotional</w:t>
       </w:r>
     </w:p>
     <w:p>
@@ -740,19 +629,19 @@
         </w:numPr>
       </w:pPr>
       <w:r>
-        <w:t>Parent emotional</w:t>
-      </w:r>
-    </w:p>
-    <w:p>
-      <w:pPr>
-        <w:pStyle w:val="ListParagraph"/>
-        <w:numPr>
-          <w:ilvl w:val="1"/>
-          <w:numId w:val="3"/>
-        </w:numPr>
-      </w:pPr>
-      <w:r>
-        <w:t>Waitlist status</w:t>
+        <w:t>Child Cognition</w:t>
+      </w:r>
+    </w:p>
+    <w:p>
+      <w:pPr>
+        <w:pStyle w:val="ListParagraph"/>
+        <w:numPr>
+          <w:ilvl w:val="1"/>
+          <w:numId w:val="3"/>
+        </w:numPr>
+      </w:pPr>
+      <w:r>
+        <w:t>Parent cognition</w:t>
       </w:r>
     </w:p>
     <w:p>
@@ -778,319 +667,394 @@
           <w:b/>
           <w:bCs/>
         </w:rPr>
-        <w:t>Access + precarity</w:t>
-      </w:r>
-    </w:p>
-    <w:p>
-      <w:pPr>
-        <w:pStyle w:val="ListParagraph"/>
-        <w:numPr>
-          <w:ilvl w:val="1"/>
-          <w:numId w:val="3"/>
-        </w:numPr>
-      </w:pPr>
-      <w:r>
-        <w:t xml:space="preserve">Affordability: </w:t>
-      </w:r>
-    </w:p>
-    <w:p>
-      <w:pPr>
-        <w:pStyle w:val="ListParagraph"/>
-        <w:numPr>
-          <w:ilvl w:val="2"/>
-          <w:numId w:val="3"/>
-        </w:numPr>
-      </w:pPr>
-      <w:r>
-        <w:t>% of income</w:t>
-      </w:r>
-    </w:p>
-    <w:p>
-      <w:pPr>
-        <w:pStyle w:val="ListParagraph"/>
-        <w:numPr>
-          <w:ilvl w:val="2"/>
-          <w:numId w:val="3"/>
-        </w:numPr>
-      </w:pPr>
-      <w:r>
-        <w:t>Subsidy?</w:t>
-      </w:r>
-    </w:p>
-    <w:p>
-      <w:pPr>
-        <w:pStyle w:val="ListParagraph"/>
-        <w:numPr>
-          <w:ilvl w:val="2"/>
-          <w:numId w:val="3"/>
-        </w:numPr>
-      </w:pPr>
-      <w:r>
-        <w:t>Income bracket, family size, zip code</w:t>
-      </w:r>
-    </w:p>
-    <w:p>
-      <w:pPr>
-        <w:pStyle w:val="ListParagraph"/>
-        <w:numPr>
-          <w:ilvl w:val="1"/>
-          <w:numId w:val="3"/>
-        </w:numPr>
-      </w:pPr>
-      <w:r>
-        <w:t>Reasonable effort:</w:t>
-      </w:r>
-      <w:r>
-        <w:t xml:space="preserve"> </w:t>
-      </w:r>
-    </w:p>
-    <w:p>
-      <w:pPr>
-        <w:pStyle w:val="ListParagraph"/>
-        <w:numPr>
-          <w:ilvl w:val="2"/>
-          <w:numId w:val="3"/>
-        </w:numPr>
-      </w:pPr>
-      <w:r>
-        <w:t>geographical location + location of each provider</w:t>
-      </w:r>
-    </w:p>
-    <w:p>
-      <w:pPr>
-        <w:pStyle w:val="ListParagraph"/>
-        <w:numPr>
-          <w:ilvl w:val="2"/>
-          <w:numId w:val="3"/>
-        </w:numPr>
-        <w:rPr>
-          <w:highlight w:val="yellow"/>
-        </w:rPr>
-      </w:pPr>
-      <w:r>
-        <w:t xml:space="preserve">having trouble finding? On waitlist? </w:t>
-      </w:r>
-      <w:r>
-        <w:rPr>
-          <w:highlight w:val="yellow"/>
-        </w:rPr>
-        <w:t>[improve]</w:t>
-      </w:r>
-    </w:p>
-    <w:p>
-      <w:pPr>
-        <w:pStyle w:val="ListParagraph"/>
-        <w:numPr>
-          <w:ilvl w:val="2"/>
-          <w:numId w:val="3"/>
-        </w:numPr>
-        <w:rPr>
-          <w:highlight w:val="yellow"/>
-        </w:rPr>
-      </w:pPr>
-      <w:r>
-        <w:t>transportation</w:t>
-      </w:r>
-      <w:r>
-        <w:rPr>
-          <w:highlight w:val="yellow"/>
-        </w:rPr>
-        <w:t xml:space="preserve"> [improve]</w:t>
-      </w:r>
-    </w:p>
-    <w:p>
-      <w:pPr>
-        <w:pStyle w:val="ListParagraph"/>
-        <w:numPr>
-          <w:ilvl w:val="1"/>
-          <w:numId w:val="3"/>
-        </w:numPr>
-      </w:pPr>
-      <w:r>
-        <w:t>supports child dev</w:t>
-      </w:r>
-      <w:r>
-        <w:t xml:space="preserve"> [for each provider]</w:t>
-      </w:r>
-    </w:p>
-    <w:p>
-      <w:pPr>
-        <w:pStyle w:val="ListParagraph"/>
-        <w:numPr>
-          <w:ilvl w:val="2"/>
-          <w:numId w:val="3"/>
-        </w:numPr>
-      </w:pPr>
-      <w:r>
-        <w:t>accredited</w:t>
-      </w:r>
-      <w:r>
-        <w:t xml:space="preserve">? </w:t>
-      </w:r>
-      <w:r>
-        <w:t xml:space="preserve">Provider has </w:t>
-      </w:r>
-      <w:proofErr w:type="gramStart"/>
-      <w:r>
-        <w:t>degree?</w:t>
-      </w:r>
-      <w:proofErr w:type="gramEnd"/>
-    </w:p>
-    <w:p>
-      <w:pPr>
-        <w:pStyle w:val="ListParagraph"/>
-        <w:numPr>
-          <w:ilvl w:val="2"/>
-          <w:numId w:val="3"/>
-        </w:numPr>
-      </w:pPr>
-      <w:r>
-        <w:t>Head start?</w:t>
-      </w:r>
-    </w:p>
-    <w:p>
-      <w:pPr>
-        <w:pStyle w:val="ListParagraph"/>
-        <w:numPr>
-          <w:ilvl w:val="2"/>
-          <w:numId w:val="3"/>
-        </w:numPr>
-      </w:pPr>
-      <w:r>
-        <w:t>School-based?</w:t>
-      </w:r>
-    </w:p>
-    <w:p>
-      <w:pPr>
-        <w:pStyle w:val="ListParagraph"/>
-        <w:numPr>
-          <w:ilvl w:val="2"/>
-          <w:numId w:val="3"/>
-        </w:numPr>
-      </w:pPr>
-      <w:r>
-        <w:t>L</w:t>
-      </w:r>
-      <w:r>
-        <w:t>anguage</w:t>
-      </w:r>
-    </w:p>
-    <w:p>
-      <w:pPr>
-        <w:pStyle w:val="ListParagraph"/>
-        <w:numPr>
-          <w:ilvl w:val="1"/>
-          <w:numId w:val="3"/>
-        </w:numPr>
-      </w:pPr>
-      <w:proofErr w:type="gramStart"/>
-      <w:r>
-        <w:t>Meet</w:t>
-      </w:r>
-      <w:proofErr w:type="gramEnd"/>
-      <w:r>
-        <w:t xml:space="preserve"> parents’ needs</w:t>
-      </w:r>
-    </w:p>
-    <w:p>
-      <w:pPr>
-        <w:pStyle w:val="ListParagraph"/>
-        <w:numPr>
-          <w:ilvl w:val="2"/>
-          <w:numId w:val="3"/>
-        </w:numPr>
-      </w:pPr>
-      <w:r>
-        <w:t>Is this your “preferred” care? [</w:t>
-      </w:r>
-      <w:r>
-        <w:rPr>
-          <w:highlight w:val="yellow"/>
-        </w:rPr>
-        <w:t>improve</w:t>
-      </w:r>
-      <w:r>
-        <w:t>]</w:t>
-      </w:r>
-    </w:p>
-    <w:p>
-      <w:pPr>
-        <w:pStyle w:val="ListParagraph"/>
-        <w:numPr>
-          <w:ilvl w:val="2"/>
-          <w:numId w:val="3"/>
-        </w:numPr>
-      </w:pPr>
-      <w:r>
-        <w:t>Does it work well with work schedule? [</w:t>
-      </w:r>
-      <w:r>
-        <w:rPr>
-          <w:highlight w:val="yellow"/>
-        </w:rPr>
-        <w:t>improve</w:t>
-      </w:r>
-      <w:r>
-        <w:t>]</w:t>
-      </w:r>
-    </w:p>
-    <w:p>
-      <w:pPr>
-        <w:pStyle w:val="ListParagraph"/>
-        <w:numPr>
-          <w:ilvl w:val="1"/>
-          <w:numId w:val="3"/>
-        </w:numPr>
-      </w:pPr>
-      <w:r>
-        <w:t>Precarity/instability</w:t>
-      </w:r>
-    </w:p>
-    <w:p>
-      <w:pPr>
-        <w:pStyle w:val="ListParagraph"/>
-        <w:numPr>
-          <w:ilvl w:val="2"/>
-          <w:numId w:val="3"/>
-        </w:numPr>
-      </w:pPr>
-      <w:r>
-        <w:t>C</w:t>
-      </w:r>
-      <w:r>
-        <w:t>alendar</w:t>
-      </w:r>
-    </w:p>
-    <w:p>
-      <w:pPr>
-        <w:pStyle w:val="ListParagraph"/>
-        <w:ind w:left="2160"/>
-      </w:pPr>
-    </w:p>
-    <w:p>
-      <w:pPr>
-        <w:pStyle w:val="ListParagraph"/>
-        <w:numPr>
-          <w:ilvl w:val="0"/>
-          <w:numId w:val="3"/>
-        </w:numPr>
+        <w:t>Weekly</w:t>
+      </w:r>
+      <w:r>
         <w:rPr>
           <w:b/>
           <w:bCs/>
         </w:rPr>
-      </w:pPr>
-      <w:r>
+        <w:t xml:space="preserve"> ~ 5 minutes</w:t>
+      </w:r>
+    </w:p>
+    <w:p>
+      <w:pPr>
+        <w:pStyle w:val="ListParagraph"/>
+        <w:numPr>
+          <w:ilvl w:val="1"/>
+          <w:numId w:val="3"/>
+        </w:numPr>
+      </w:pPr>
+      <w:r>
+        <w:t>Access + precarity</w:t>
+      </w:r>
+      <w:r>
+        <w:t xml:space="preserve"> (calendar)</w:t>
+      </w:r>
+    </w:p>
+    <w:p>
+      <w:pPr>
+        <w:pStyle w:val="ListParagraph"/>
+        <w:numPr>
+          <w:ilvl w:val="1"/>
+          <w:numId w:val="3"/>
+        </w:numPr>
+      </w:pPr>
+      <w:r>
+        <w:t>Child emotional</w:t>
+      </w:r>
+    </w:p>
+    <w:p>
+      <w:pPr>
+        <w:pStyle w:val="ListParagraph"/>
+        <w:numPr>
+          <w:ilvl w:val="1"/>
+          <w:numId w:val="3"/>
+        </w:numPr>
+      </w:pPr>
+      <w:r>
+        <w:t>Parent emotional</w:t>
+      </w:r>
+    </w:p>
+    <w:p>
+      <w:pPr>
+        <w:pStyle w:val="ListParagraph"/>
+        <w:numPr>
+          <w:ilvl w:val="1"/>
+          <w:numId w:val="3"/>
+        </w:numPr>
+      </w:pPr>
+      <w:r>
+        <w:t>Waitlist status</w:t>
+      </w:r>
+    </w:p>
+    <w:p>
+      <w:pPr>
+        <w:pStyle w:val="ListParagraph"/>
+        <w:ind w:left="1440"/>
+      </w:pPr>
+    </w:p>
+    <w:p>
+      <w:pPr>
+        <w:pStyle w:val="ListParagraph"/>
+        <w:numPr>
+          <w:ilvl w:val="0"/>
+          <w:numId w:val="3"/>
+        </w:numPr>
         <w:rPr>
           <w:b/>
           <w:bCs/>
         </w:rPr>
-        <w:t>Demographics</w:t>
-      </w:r>
+      </w:pPr>
       <w:r>
         <w:rPr>
           <w:b/>
           <w:bCs/>
         </w:rPr>
+        <w:t>Access + precarity</w:t>
+      </w:r>
+    </w:p>
+    <w:p>
+      <w:pPr>
+        <w:pStyle w:val="ListParagraph"/>
+        <w:numPr>
+          <w:ilvl w:val="1"/>
+          <w:numId w:val="3"/>
+        </w:numPr>
+      </w:pPr>
+      <w:r>
+        <w:t xml:space="preserve">Affordability: </w:t>
+      </w:r>
+    </w:p>
+    <w:p>
+      <w:pPr>
+        <w:pStyle w:val="ListParagraph"/>
+        <w:numPr>
+          <w:ilvl w:val="2"/>
+          <w:numId w:val="3"/>
+        </w:numPr>
+      </w:pPr>
+      <w:r>
+        <w:t>% of income</w:t>
+      </w:r>
+    </w:p>
+    <w:p>
+      <w:pPr>
+        <w:pStyle w:val="ListParagraph"/>
+        <w:numPr>
+          <w:ilvl w:val="2"/>
+          <w:numId w:val="3"/>
+        </w:numPr>
+      </w:pPr>
+      <w:r>
+        <w:t>Subsidy?</w:t>
+      </w:r>
+    </w:p>
+    <w:p>
+      <w:pPr>
+        <w:pStyle w:val="ListParagraph"/>
+        <w:numPr>
+          <w:ilvl w:val="2"/>
+          <w:numId w:val="3"/>
+        </w:numPr>
+      </w:pPr>
+      <w:r>
+        <w:t>Income bracket, family size, zip code</w:t>
+      </w:r>
+    </w:p>
+    <w:p>
+      <w:pPr>
+        <w:pStyle w:val="ListParagraph"/>
+        <w:numPr>
+          <w:ilvl w:val="1"/>
+          <w:numId w:val="3"/>
+        </w:numPr>
+      </w:pPr>
+      <w:r>
+        <w:t>Reasonable effort:</w:t>
+      </w:r>
+      <w:r>
+        <w:t xml:space="preserve"> </w:t>
+      </w:r>
+    </w:p>
+    <w:p>
+      <w:pPr>
+        <w:pStyle w:val="ListParagraph"/>
+        <w:numPr>
+          <w:ilvl w:val="2"/>
+          <w:numId w:val="3"/>
+        </w:numPr>
+      </w:pPr>
+      <w:r>
+        <w:t>geographical location + location of each provider</w:t>
+      </w:r>
+    </w:p>
+    <w:p>
+      <w:pPr>
+        <w:pStyle w:val="ListParagraph"/>
+        <w:numPr>
+          <w:ilvl w:val="2"/>
+          <w:numId w:val="3"/>
+        </w:numPr>
+        <w:rPr>
+          <w:highlight w:val="yellow"/>
+        </w:rPr>
+      </w:pPr>
+      <w:r>
+        <w:t xml:space="preserve">having trouble finding? On waitlist? </w:t>
+      </w:r>
+      <w:r>
+        <w:rPr>
+          <w:highlight w:val="yellow"/>
+        </w:rPr>
+        <w:t>[improve]</w:t>
+      </w:r>
+    </w:p>
+    <w:p>
+      <w:pPr>
+        <w:pStyle w:val="ListParagraph"/>
+        <w:numPr>
+          <w:ilvl w:val="2"/>
+          <w:numId w:val="3"/>
+        </w:numPr>
+        <w:rPr>
+          <w:highlight w:val="yellow"/>
+        </w:rPr>
+      </w:pPr>
+      <w:r>
+        <w:t>transportation</w:t>
+      </w:r>
+      <w:r>
+        <w:rPr>
+          <w:highlight w:val="yellow"/>
+        </w:rPr>
+        <w:t xml:space="preserve"> [improve]</w:t>
+      </w:r>
+    </w:p>
+    <w:p>
+      <w:pPr>
+        <w:pStyle w:val="ListParagraph"/>
+        <w:numPr>
+          <w:ilvl w:val="1"/>
+          <w:numId w:val="3"/>
+        </w:numPr>
+      </w:pPr>
+      <w:r>
+        <w:t>supports child dev</w:t>
+      </w:r>
+      <w:r>
+        <w:t xml:space="preserve"> [for each provider]</w:t>
+      </w:r>
+    </w:p>
+    <w:p>
+      <w:pPr>
+        <w:pStyle w:val="ListParagraph"/>
+        <w:numPr>
+          <w:ilvl w:val="2"/>
+          <w:numId w:val="3"/>
+        </w:numPr>
+      </w:pPr>
+      <w:r>
+        <w:t>accredited</w:t>
+      </w:r>
+      <w:r>
+        <w:t xml:space="preserve">? </w:t>
+      </w:r>
+      <w:r>
+        <w:t>Provider has degree?</w:t>
+      </w:r>
+    </w:p>
+    <w:p>
+      <w:pPr>
+        <w:pStyle w:val="ListParagraph"/>
+        <w:numPr>
+          <w:ilvl w:val="2"/>
+          <w:numId w:val="3"/>
+        </w:numPr>
+      </w:pPr>
+      <w:r>
+        <w:t>Head start?</w:t>
+      </w:r>
+    </w:p>
+    <w:p>
+      <w:pPr>
+        <w:pStyle w:val="ListParagraph"/>
+        <w:numPr>
+          <w:ilvl w:val="2"/>
+          <w:numId w:val="3"/>
+        </w:numPr>
+      </w:pPr>
+      <w:r>
+        <w:t>School-based?</w:t>
+      </w:r>
+    </w:p>
+    <w:p>
+      <w:pPr>
+        <w:pStyle w:val="ListParagraph"/>
+        <w:numPr>
+          <w:ilvl w:val="2"/>
+          <w:numId w:val="3"/>
+        </w:numPr>
+      </w:pPr>
+      <w:r>
+        <w:t>L</w:t>
+      </w:r>
+      <w:r>
+        <w:t>anguage</w:t>
+      </w:r>
+    </w:p>
+    <w:p>
+      <w:pPr>
+        <w:pStyle w:val="ListParagraph"/>
+        <w:numPr>
+          <w:ilvl w:val="1"/>
+          <w:numId w:val="3"/>
+        </w:numPr>
+      </w:pPr>
+      <w:r>
+        <w:t>Meet parents’ needs</w:t>
+      </w:r>
+    </w:p>
+    <w:p>
+      <w:pPr>
+        <w:pStyle w:val="ListParagraph"/>
+        <w:numPr>
+          <w:ilvl w:val="2"/>
+          <w:numId w:val="3"/>
+        </w:numPr>
+      </w:pPr>
+      <w:r>
+        <w:t>Is this your “preferred” care? [</w:t>
+      </w:r>
+      <w:r>
+        <w:rPr>
+          <w:highlight w:val="yellow"/>
+        </w:rPr>
+        <w:t>improve</w:t>
+      </w:r>
+      <w:r>
+        <w:t>]</w:t>
+      </w:r>
+    </w:p>
+    <w:p>
+      <w:pPr>
+        <w:pStyle w:val="ListParagraph"/>
+        <w:numPr>
+          <w:ilvl w:val="2"/>
+          <w:numId w:val="3"/>
+        </w:numPr>
+      </w:pPr>
+      <w:r>
+        <w:lastRenderedPageBreak/>
+        <w:t>Does it work well with work schedule? [</w:t>
+      </w:r>
+      <w:r>
+        <w:rPr>
+          <w:highlight w:val="yellow"/>
+        </w:rPr>
+        <w:t>improve</w:t>
+      </w:r>
+      <w:r>
+        <w:t>]</w:t>
+      </w:r>
+    </w:p>
+    <w:p>
+      <w:pPr>
+        <w:pStyle w:val="ListParagraph"/>
+        <w:numPr>
+          <w:ilvl w:val="1"/>
+          <w:numId w:val="3"/>
+        </w:numPr>
+      </w:pPr>
+      <w:r>
+        <w:t>Precarity/instability</w:t>
+      </w:r>
+    </w:p>
+    <w:p>
+      <w:pPr>
+        <w:pStyle w:val="ListParagraph"/>
+        <w:numPr>
+          <w:ilvl w:val="2"/>
+          <w:numId w:val="3"/>
+        </w:numPr>
+      </w:pPr>
+      <w:r>
+        <w:t>C</w:t>
+      </w:r>
+      <w:r>
+        <w:t>alendar</w:t>
+      </w:r>
+    </w:p>
+    <w:p>
+      <w:pPr>
+        <w:pStyle w:val="ListParagraph"/>
+        <w:ind w:left="2160"/>
+      </w:pPr>
+    </w:p>
+    <w:p>
+      <w:pPr>
+        <w:pStyle w:val="ListParagraph"/>
+        <w:numPr>
+          <w:ilvl w:val="0"/>
+          <w:numId w:val="3"/>
+        </w:numPr>
+        <w:rPr>
+          <w:b/>
+          <w:bCs/>
+        </w:rPr>
+      </w:pPr>
+      <w:r>
+        <w:rPr>
+          <w:b/>
+          <w:bCs/>
+        </w:rPr>
+        <w:t>Demographics</w:t>
+      </w:r>
+      <w:r>
+        <w:rPr>
+          <w:b/>
+          <w:bCs/>
+        </w:rPr>
         <w:t xml:space="preserve"> (full on entry)</w:t>
       </w:r>
     </w:p>
@@ -1169,7 +1133,6 @@
         </w:numPr>
       </w:pPr>
       <w:r>
-        <w:lastRenderedPageBreak/>
         <w:t>Languages spoken</w:t>
       </w:r>
     </w:p>
@@ -1400,6 +1363,7 @@
         </w:tabs>
       </w:pPr>
       <w:r>
+        <w:lastRenderedPageBreak/>
         <w:t>Within-person design (people are their own control group)</w:t>
       </w:r>
     </w:p>
@@ -1462,11 +1426,9 @@
           <w:tab w:val="left" w:pos="7898"/>
         </w:tabs>
       </w:pPr>
-      <w:proofErr w:type="spellStart"/>
       <w:r>
         <w:t>Etc</w:t>
       </w:r>
-      <w:proofErr w:type="spellEnd"/>
     </w:p>
     <w:p>
       <w:pPr>
@@ -1495,15 +1457,7 @@
         </w:tabs>
       </w:pPr>
       <w:r>
-        <w:t xml:space="preserve">Parents: precarity (instability + </w:t>
-      </w:r>
-      <w:proofErr w:type="spellStart"/>
-      <w:r>
-        <w:t>smth</w:t>
-      </w:r>
-      <w:proofErr w:type="spellEnd"/>
-      <w:r>
-        <w:t>), work-status, stress, cognition?</w:t>
+        <w:t>Parents: precarity (instability + smth), work-status, stress, cognition?</w:t>
       </w:r>
     </w:p>
     <w:p>
@@ -1551,16 +1505,7 @@
         </w:tabs>
       </w:pPr>
       <w:r>
-        <w:lastRenderedPageBreak/>
-        <w:t xml:space="preserve">Think about design carefully: how much time, when to measure, how long </w:t>
-      </w:r>
-      <w:proofErr w:type="gramStart"/>
-      <w:r>
-        <w:t>should the study</w:t>
-      </w:r>
-      <w:proofErr w:type="gramEnd"/>
-      <w:r>
-        <w:t xml:space="preserve"> be, etc. </w:t>
+        <w:t xml:space="preserve">Think about design carefully: how much time, when to measure, how long should the study be, etc. </w:t>
       </w:r>
     </w:p>
     <w:p>
@@ -1604,13 +1549,8 @@
         <w:t xml:space="preserve">Phil said to go community based, </w:t>
       </w:r>
       <w:r>
-        <w:t xml:space="preserve">make it useful, </w:t>
-      </w:r>
-      <w:proofErr w:type="spellStart"/>
-      <w:r>
-        <w:t>blablabla</w:t>
-      </w:r>
-      <w:proofErr w:type="spellEnd"/>
+        <w:t>make it useful, blablabla</w:t>
+      </w:r>
     </w:p>
     <w:p>
       <w:pPr>
@@ -2153,6 +2093,119 @@
     </w:lvl>
   </w:abstractNum>
   <w:abstractNum w:abstractNumId="3" w15:restartNumberingAfterBreak="0">
+    <w:nsid w:val="453A0D2D"/>
+    <w:multiLevelType w:val="hybridMultilevel"/>
+    <w:tmpl w:val="57F4930A"/>
+    <w:lvl w:ilvl="0" w:tplc="04090003">
+      <w:start w:val="1"/>
+      <w:numFmt w:val="bullet"/>
+      <w:lvlText w:val="o"/>
+      <w:lvlJc w:val="left"/>
+      <w:pPr>
+        <w:ind w:left="720" w:hanging="360"/>
+      </w:pPr>
+      <w:rPr>
+        <w:rFonts w:ascii="Courier New" w:hAnsi="Courier New" w:cs="Courier New" w:hint="default"/>
+      </w:rPr>
+    </w:lvl>
+    <w:lvl w:ilvl="1" w:tplc="04090003" w:tentative="1">
+      <w:start w:val="1"/>
+      <w:numFmt w:val="bullet"/>
+      <w:lvlText w:val="o"/>
+      <w:lvlJc w:val="left"/>
+      <w:pPr>
+        <w:ind w:left="1440" w:hanging="360"/>
+      </w:pPr>
+      <w:rPr>
+        <w:rFonts w:ascii="Courier New" w:hAnsi="Courier New" w:cs="Courier New" w:hint="default"/>
+      </w:rPr>
+    </w:lvl>
+    <w:lvl w:ilvl="2" w:tplc="04090005" w:tentative="1">
+      <w:start w:val="1"/>
+      <w:numFmt w:val="bullet"/>
+      <w:lvlText w:val=""/>
+      <w:lvlJc w:val="left"/>
+      <w:pPr>
+        <w:ind w:left="2160" w:hanging="360"/>
+      </w:pPr>
+      <w:rPr>
+        <w:rFonts w:ascii="Wingdings" w:hAnsi="Wingdings" w:hint="default"/>
+      </w:rPr>
+    </w:lvl>
+    <w:lvl w:ilvl="3" w:tplc="04090001" w:tentative="1">
+      <w:start w:val="1"/>
+      <w:numFmt w:val="bullet"/>
+      <w:lvlText w:val=""/>
+      <w:lvlJc w:val="left"/>
+      <w:pPr>
+        <w:ind w:left="2880" w:hanging="360"/>
+      </w:pPr>
+      <w:rPr>
+        <w:rFonts w:ascii="Symbol" w:hAnsi="Symbol" w:hint="default"/>
+      </w:rPr>
+    </w:lvl>
+    <w:lvl w:ilvl="4" w:tplc="04090003" w:tentative="1">
+      <w:start w:val="1"/>
+      <w:numFmt w:val="bullet"/>
+      <w:lvlText w:val="o"/>
+      <w:lvlJc w:val="left"/>
+      <w:pPr>
+        <w:ind w:left="3600" w:hanging="360"/>
+      </w:pPr>
+      <w:rPr>
+        <w:rFonts w:ascii="Courier New" w:hAnsi="Courier New" w:cs="Courier New" w:hint="default"/>
+      </w:rPr>
+    </w:lvl>
+    <w:lvl w:ilvl="5" w:tplc="04090005" w:tentative="1">
+      <w:start w:val="1"/>
+      <w:numFmt w:val="bullet"/>
+      <w:lvlText w:val=""/>
+      <w:lvlJc w:val="left"/>
+      <w:pPr>
+        <w:ind w:left="4320" w:hanging="360"/>
+      </w:pPr>
+      <w:rPr>
+        <w:rFonts w:ascii="Wingdings" w:hAnsi="Wingdings" w:hint="default"/>
+      </w:rPr>
+    </w:lvl>
+    <w:lvl w:ilvl="6" w:tplc="04090001" w:tentative="1">
+      <w:start w:val="1"/>
+      <w:numFmt w:val="bullet"/>
+      <w:lvlText w:val=""/>
+      <w:lvlJc w:val="left"/>
+      <w:pPr>
+        <w:ind w:left="5040" w:hanging="360"/>
+      </w:pPr>
+      <w:rPr>
+        <w:rFonts w:ascii="Symbol" w:hAnsi="Symbol" w:hint="default"/>
+      </w:rPr>
+    </w:lvl>
+    <w:lvl w:ilvl="7" w:tplc="04090003" w:tentative="1">
+      <w:start w:val="1"/>
+      <w:numFmt w:val="bullet"/>
+      <w:lvlText w:val="o"/>
+      <w:lvlJc w:val="left"/>
+      <w:pPr>
+        <w:ind w:left="5760" w:hanging="360"/>
+      </w:pPr>
+      <w:rPr>
+        <w:rFonts w:ascii="Courier New" w:hAnsi="Courier New" w:cs="Courier New" w:hint="default"/>
+      </w:rPr>
+    </w:lvl>
+    <w:lvl w:ilvl="8" w:tplc="04090005" w:tentative="1">
+      <w:start w:val="1"/>
+      <w:numFmt w:val="bullet"/>
+      <w:lvlText w:val=""/>
+      <w:lvlJc w:val="left"/>
+      <w:pPr>
+        <w:ind w:left="6480" w:hanging="360"/>
+      </w:pPr>
+      <w:rPr>
+        <w:rFonts w:ascii="Wingdings" w:hAnsi="Wingdings" w:hint="default"/>
+      </w:rPr>
+    </w:lvl>
+  </w:abstractNum>
+  <w:abstractNum w:abstractNumId="4" w15:restartNumberingAfterBreak="0">
     <w:nsid w:val="69C87589"/>
     <w:multiLevelType w:val="hybridMultilevel"/>
     <w:tmpl w:val="D20EEE36"/>
@@ -2275,6 +2328,9 @@
     <w:abstractNumId w:val="2"/>
   </w:num>
   <w:num w:numId="4" w16cid:durableId="396711410">
+    <w:abstractNumId w:val="4"/>
+  </w:num>
+  <w:num w:numId="5" w16cid:durableId="54668405">
     <w:abstractNumId w:val="3"/>
   </w:num>
 </w:numbering>

</xml_diff>

<commit_message>
changed child age, caregiver relationship, and mobile usability
</commit_message>
<xml_diff>
--- a/archive/notes.docx
+++ b/archive/notes.docx
@@ -28,7 +28,7 @@
         </w:numPr>
       </w:pPr>
       <w:r>
-        <w:t>Figure out exact child questions</w:t>
+        <w:t>Change name to caremometer</w:t>
       </w:r>
     </w:p>
     <w:p>
@@ -40,7 +40,7 @@
         </w:numPr>
       </w:pPr>
       <w:r>
-        <w:t>Including entry question about relationship to child (i.e., biological mother, etc)</w:t>
+        <w:t>Have the first caregiver in the providers tab be pre-loaded as myself in a neutral grey color</w:t>
       </w:r>
     </w:p>
     <w:p>
@@ -52,7 +52,7 @@
         </w:numPr>
       </w:pPr>
       <w:r>
-        <w:t>Figure out Stanford Server</w:t>
+        <w:t>Figure out exact child questions</w:t>
       </w:r>
     </w:p>
     <w:p>
@@ -64,7 +64,7 @@
         </w:numPr>
       </w:pPr>
       <w:r>
-        <w:t>Figure out entry vs weekly</w:t>
+        <w:t>Including entry question about relationship to child (i.e., biological mother, etc)</w:t>
       </w:r>
     </w:p>
     <w:p>
@@ -74,9 +74,15 @@
           <w:ilvl w:val="0"/>
           <w:numId w:val="5"/>
         </w:numPr>
-      </w:pPr>
-      <w:r>
-        <w:t>Figure out qualtrics adaptation</w:t>
+        <w:rPr>
+          <w:strike/>
+        </w:rPr>
+      </w:pPr>
+      <w:r>
+        <w:rPr>
+          <w:strike/>
+        </w:rPr>
+        <w:t>Figure out Stanford Server</w:t>
       </w:r>
     </w:p>
     <w:p>
@@ -88,7 +94,61 @@
         </w:numPr>
       </w:pPr>
       <w:r>
+        <w:t>Figure out entry vs weekly</w:t>
+      </w:r>
+    </w:p>
+    <w:p>
+      <w:pPr>
+        <w:pStyle w:val="ListParagraph"/>
+        <w:numPr>
+          <w:ilvl w:val="0"/>
+          <w:numId w:val="5"/>
+        </w:numPr>
+      </w:pPr>
+      <w:r>
+        <w:t>Figure out qualtrics adaptation</w:t>
+      </w:r>
+    </w:p>
+    <w:p>
+      <w:pPr>
+        <w:pStyle w:val="ListParagraph"/>
+        <w:numPr>
+          <w:ilvl w:val="0"/>
+          <w:numId w:val="5"/>
+        </w:numPr>
+      </w:pPr>
+      <w:r>
+        <w:t>Figure out mobile browser version</w:t>
+      </w:r>
+    </w:p>
+    <w:p>
+      <w:pPr>
+        <w:pStyle w:val="ListParagraph"/>
+        <w:numPr>
+          <w:ilvl w:val="0"/>
+          <w:numId w:val="5"/>
+        </w:numPr>
+        <w:rPr>
+          <w:strike/>
+        </w:rPr>
+      </w:pPr>
+      <w:r>
+        <w:rPr>
+          <w:strike/>
+        </w:rPr>
         <w:t>Check on the items below</w:t>
+      </w:r>
+    </w:p>
+    <w:p>
+      <w:pPr>
+        <w:pStyle w:val="ListParagraph"/>
+        <w:numPr>
+          <w:ilvl w:val="0"/>
+          <w:numId w:val="5"/>
+        </w:numPr>
+      </w:pPr>
+      <w:r>
+        <w:t>Adjust child age</w:t>
       </w:r>
     </w:p>
     <w:p>
@@ -116,38 +176,14 @@
           <w:numId w:val="4"/>
         </w:numPr>
         <w:rPr>
-          <w:highlight w:val="yellow"/>
-        </w:rPr>
-      </w:pPr>
-      <w:r>
-        <w:rPr>
-          <w:highlight w:val="yellow"/>
+          <w:strike/>
+        </w:rPr>
+      </w:pPr>
+      <w:r>
+        <w:rPr>
+          <w:strike/>
         </w:rPr>
         <w:t>2 Provider</w:t>
-      </w:r>
-    </w:p>
-    <w:p>
-      <w:pPr>
-        <w:pStyle w:val="ListParagraph"/>
-        <w:numPr>
-          <w:ilvl w:val="1"/>
-          <w:numId w:val="4"/>
-        </w:numPr>
-        <w:rPr>
-          <w:highlight w:val="yellow"/>
-        </w:rPr>
-      </w:pPr>
-      <w:r>
-        <w:rPr>
-          <w:highlight w:val="yellow"/>
-        </w:rPr>
-        <w:t xml:space="preserve">Have the first caregiver in the providers tab be pre-loaded as myself in </w:t>
-      </w:r>
-      <w:r>
-        <w:rPr>
-          <w:highlight w:val="yellow"/>
-        </w:rPr>
-        <w:t>a neutral grey color</w:t>
       </w:r>
     </w:p>
     <w:p>
@@ -477,6 +513,7 @@
         <w:rPr>
           <w:strike/>
         </w:rPr>
+        <w:lastRenderedPageBreak/>
         <w:t xml:space="preserve">I edited the file structure, now there is not parent folder anymore, it is just the childcare-precarity-tool folder. </w:t>
       </w:r>
     </w:p>
@@ -495,7 +532,6 @@
         <w:rPr>
           <w:strike/>
         </w:rPr>
-        <w:lastRenderedPageBreak/>
         <w:t xml:space="preserve">I excluded some files and moved some to a folder called archive. Please have github ignore and not </w:t>
       </w:r>
       <w:r>
@@ -952,6 +988,7 @@
         </w:numPr>
       </w:pPr>
       <w:r>
+        <w:lastRenderedPageBreak/>
         <w:t>Meet parents’ needs</w:t>
       </w:r>
     </w:p>
@@ -985,7 +1022,6 @@
         </w:numPr>
       </w:pPr>
       <w:r>
-        <w:lastRenderedPageBreak/>
         <w:t>Does it work well with work schedule? [</w:t>
       </w:r>
       <w:r>
@@ -1330,6 +1366,7 @@
         </w:tabs>
       </w:pPr>
       <w:r>
+        <w:lastRenderedPageBreak/>
         <w:t>For real:</w:t>
       </w:r>
     </w:p>
@@ -1363,7 +1400,6 @@
         </w:tabs>
       </w:pPr>
       <w:r>
-        <w:lastRenderedPageBreak/>
         <w:t>Within-person design (people are their own control group)</w:t>
       </w:r>
     </w:p>
@@ -2108,7 +2144,7 @@
         <w:rFonts w:ascii="Courier New" w:hAnsi="Courier New" w:cs="Courier New" w:hint="default"/>
       </w:rPr>
     </w:lvl>
-    <w:lvl w:ilvl="1" w:tplc="04090003" w:tentative="1">
+    <w:lvl w:ilvl="1" w:tplc="04090003">
       <w:start w:val="1"/>
       <w:numFmt w:val="bullet"/>
       <w:lvlText w:val="o"/>

</xml_diff>

<commit_message>
changed aesthetics and separated entry, check-in, and exit form
</commit_message>
<xml_diff>
--- a/archive/notes.docx
+++ b/archive/notes.docx
@@ -16,7 +16,7 @@
           <w:bCs/>
           <w:highlight w:val="yellow"/>
         </w:rPr>
-        <w:t>3/21/2026</w:t>
+        <w:t>3/23/2026</w:t>
       </w:r>
     </w:p>
     <w:p>
@@ -28,13 +28,8 @@
         </w:numPr>
       </w:pPr>
       <w:r>
-        <w:t xml:space="preserve">Change name to </w:t>
-      </w:r>
-      <w:proofErr w:type="spellStart"/>
-      <w:r>
-        <w:t>caremometer</w:t>
-      </w:r>
-      <w:proofErr w:type="spellEnd"/>
+        <w:t>Have the first caregiver in the providers tab be pre-loaded as myself in a neutral grey color</w:t>
+      </w:r>
     </w:p>
     <w:p>
       <w:pPr>
@@ -45,7 +40,7 @@
         </w:numPr>
       </w:pPr>
       <w:r>
-        <w:t>Have the first caregiver in the providers tab be pre-loaded as myself in a neutral grey color</w:t>
+        <w:t>Figure out exact child questions</w:t>
       </w:r>
     </w:p>
     <w:p>
@@ -57,7 +52,7 @@
         </w:numPr>
       </w:pPr>
       <w:r>
-        <w:t>Figure out exact child questions</w:t>
+        <w:t>Figure out entry vs weekly</w:t>
       </w:r>
     </w:p>
     <w:p>
@@ -67,155 +62,17 @@
           <w:ilvl w:val="0"/>
           <w:numId w:val="5"/>
         </w:numPr>
-        <w:rPr>
-          <w:strike/>
-        </w:rPr>
-      </w:pPr>
-      <w:r>
-        <w:rPr>
-          <w:strike/>
-        </w:rPr>
-        <w:t xml:space="preserve">Including entry question about relationship </w:t>
-      </w:r>
-      <w:proofErr w:type="gramStart"/>
-      <w:r>
-        <w:rPr>
-          <w:strike/>
-        </w:rPr>
-        <w:t>to</w:t>
-      </w:r>
-      <w:proofErr w:type="gramEnd"/>
-      <w:r>
-        <w:rPr>
-          <w:strike/>
-        </w:rPr>
-        <w:t xml:space="preserve"> child (i.e., biological mother, </w:t>
+      </w:pPr>
+      <w:r>
+        <w:t xml:space="preserve">Figure out </w:t>
       </w:r>
       <w:proofErr w:type="spellStart"/>
       <w:r>
-        <w:rPr>
-          <w:strike/>
-        </w:rPr>
-        <w:t>etc</w:t>
+        <w:t>qualtrics</w:t>
       </w:r>
       <w:proofErr w:type="spellEnd"/>
       <w:r>
-        <w:rPr>
-          <w:strike/>
-        </w:rPr>
-        <w:t>)</w:t>
-      </w:r>
-    </w:p>
-    <w:p>
-      <w:pPr>
-        <w:pStyle w:val="ListParagraph"/>
-        <w:numPr>
-          <w:ilvl w:val="0"/>
-          <w:numId w:val="5"/>
-        </w:numPr>
-        <w:rPr>
-          <w:strike/>
-        </w:rPr>
-      </w:pPr>
-      <w:r>
-        <w:rPr>
-          <w:strike/>
-        </w:rPr>
-        <w:t>Figure out Stanford Server</w:t>
-      </w:r>
-    </w:p>
-    <w:p>
-      <w:pPr>
-        <w:pStyle w:val="ListParagraph"/>
-        <w:numPr>
-          <w:ilvl w:val="0"/>
-          <w:numId w:val="5"/>
-        </w:numPr>
-      </w:pPr>
-      <w:r>
-        <w:t>Figure out entry vs weekly</w:t>
-      </w:r>
-    </w:p>
-    <w:p>
-      <w:pPr>
-        <w:pStyle w:val="ListParagraph"/>
-        <w:numPr>
-          <w:ilvl w:val="0"/>
-          <w:numId w:val="5"/>
-        </w:numPr>
-      </w:pPr>
-      <w:r>
-        <w:t xml:space="preserve">Figure out </w:t>
-      </w:r>
-      <w:proofErr w:type="spellStart"/>
-      <w:r>
-        <w:t>qualtrics</w:t>
-      </w:r>
-      <w:proofErr w:type="spellEnd"/>
-      <w:r>
         <w:t xml:space="preserve"> adaptation</w:t>
-      </w:r>
-    </w:p>
-    <w:p>
-      <w:pPr>
-        <w:pStyle w:val="ListParagraph"/>
-        <w:numPr>
-          <w:ilvl w:val="0"/>
-          <w:numId w:val="5"/>
-        </w:numPr>
-        <w:rPr>
-          <w:strike/>
-        </w:rPr>
-      </w:pPr>
-      <w:r>
-        <w:rPr>
-          <w:strike/>
-        </w:rPr>
-        <w:t>Figure out mobile browser version</w:t>
-      </w:r>
-    </w:p>
-    <w:p>
-      <w:pPr>
-        <w:pStyle w:val="ListParagraph"/>
-        <w:numPr>
-          <w:ilvl w:val="0"/>
-          <w:numId w:val="5"/>
-        </w:numPr>
-        <w:rPr>
-          <w:strike/>
-        </w:rPr>
-      </w:pPr>
-      <w:proofErr w:type="gramStart"/>
-      <w:r>
-        <w:rPr>
-          <w:strike/>
-        </w:rPr>
-        <w:t>Check on</w:t>
-      </w:r>
-      <w:proofErr w:type="gramEnd"/>
-      <w:r>
-        <w:rPr>
-          <w:strike/>
-        </w:rPr>
-        <w:t xml:space="preserve"> the items below</w:t>
-      </w:r>
-    </w:p>
-    <w:p>
-      <w:pPr>
-        <w:pStyle w:val="ListParagraph"/>
-        <w:numPr>
-          <w:ilvl w:val="0"/>
-          <w:numId w:val="5"/>
-        </w:numPr>
-        <w:rPr>
-          <w:strike/>
-        </w:rPr>
-      </w:pPr>
-      <w:r>
-        <w:rPr>
-          <w:strike/>
-        </w:rPr>
-        <w:t>Adjust child age</w:t>
       </w:r>
     </w:p>
     <w:p>
@@ -226,752 +83,986 @@
           <w:highlight w:val="yellow"/>
         </w:rPr>
       </w:pPr>
-      <w:r>
+    </w:p>
+    <w:p>
+      <w:pPr>
         <w:rPr>
           <w:b/>
           <w:bCs/>
           <w:highlight w:val="yellow"/>
         </w:rPr>
-        <w:t>3/18/2026</w:t>
-      </w:r>
-    </w:p>
-    <w:p>
-      <w:pPr>
-        <w:pStyle w:val="ListParagraph"/>
-        <w:numPr>
-          <w:ilvl w:val="0"/>
-          <w:numId w:val="4"/>
-        </w:numPr>
-        <w:rPr>
-          <w:strike/>
-        </w:rPr>
-      </w:pPr>
-      <w:r>
-        <w:rPr>
-          <w:strike/>
-        </w:rPr>
-        <w:t>2 Provider</w:t>
-      </w:r>
-    </w:p>
-    <w:p>
-      <w:pPr>
-        <w:pStyle w:val="ListParagraph"/>
-        <w:numPr>
-          <w:ilvl w:val="0"/>
-          <w:numId w:val="4"/>
-        </w:numPr>
-        <w:rPr>
-          <w:strike/>
-        </w:rPr>
-      </w:pPr>
-      <w:r>
-        <w:rPr>
-          <w:strike/>
-        </w:rPr>
-        <w:t>3 affordability</w:t>
-      </w:r>
-    </w:p>
-    <w:p>
-      <w:pPr>
-        <w:pStyle w:val="ListParagraph"/>
-        <w:numPr>
-          <w:ilvl w:val="1"/>
-          <w:numId w:val="4"/>
-        </w:numPr>
-        <w:rPr>
-          <w:strike/>
-        </w:rPr>
-      </w:pPr>
-      <w:r>
-        <w:rPr>
-          <w:strike/>
-        </w:rPr>
-        <w:t xml:space="preserve">Have </w:t>
-      </w:r>
-      <w:proofErr w:type="gramStart"/>
-      <w:r>
-        <w:rPr>
-          <w:strike/>
-        </w:rPr>
-        <w:t>them</w:t>
-      </w:r>
-      <w:proofErr w:type="gramEnd"/>
-      <w:r>
-        <w:rPr>
-          <w:strike/>
-        </w:rPr>
-        <w:t xml:space="preserve"> put the percentage open. Include instruction: if you don’t know exactly, you can put an approximation</w:t>
-      </w:r>
-    </w:p>
-    <w:p>
-      <w:pPr>
-        <w:pStyle w:val="ListParagraph"/>
-        <w:numPr>
-          <w:ilvl w:val="0"/>
-          <w:numId w:val="4"/>
-        </w:numPr>
-      </w:pPr>
-      <w:r>
-        <w:t xml:space="preserve">4 </w:t>
-      </w:r>
-      <w:proofErr w:type="gramStart"/>
-      <w:r>
-        <w:t>effort</w:t>
-      </w:r>
-      <w:proofErr w:type="gramEnd"/>
-    </w:p>
-    <w:p>
-      <w:pPr>
-        <w:pStyle w:val="ListParagraph"/>
-        <w:numPr>
-          <w:ilvl w:val="1"/>
-          <w:numId w:val="4"/>
-        </w:numPr>
-        <w:rPr>
-          <w:strike/>
-        </w:rPr>
-      </w:pPr>
-      <w:r>
-        <w:rPr>
-          <w:strike/>
-        </w:rPr>
-        <w:t>Have them put minutes openly instead of choosing</w:t>
-      </w:r>
-    </w:p>
-    <w:p>
-      <w:pPr>
-        <w:pStyle w:val="ListParagraph"/>
-        <w:numPr>
-          <w:ilvl w:val="1"/>
-          <w:numId w:val="4"/>
-        </w:numPr>
-        <w:rPr>
-          <w:strike/>
-        </w:rPr>
-      </w:pPr>
-      <w:r>
-        <w:rPr>
-          <w:strike/>
-        </w:rPr>
-        <w:t xml:space="preserve">Last question “how difficult” </w:t>
-      </w:r>
-      <w:r>
-        <w:rPr>
-          <w:strike/>
-        </w:rPr>
-        <w:t xml:space="preserve">-&gt; do not </w:t>
-      </w:r>
-      <w:proofErr w:type="gramStart"/>
-      <w:r>
-        <w:rPr>
-          <w:strike/>
-        </w:rPr>
-        <w:t>have not</w:t>
-      </w:r>
-      <w:proofErr w:type="gramEnd"/>
-      <w:r>
-        <w:rPr>
-          <w:strike/>
-        </w:rPr>
-        <w:t xml:space="preserve"> applicable as 0</w:t>
-      </w:r>
-    </w:p>
-    <w:p>
-      <w:pPr>
-        <w:pStyle w:val="ListParagraph"/>
-        <w:numPr>
-          <w:ilvl w:val="1"/>
-          <w:numId w:val="4"/>
-        </w:numPr>
-      </w:pPr>
-      <w:r>
-        <w:t>For every question, include a side-option as “</w:t>
-      </w:r>
-      <w:proofErr w:type="spellStart"/>
-      <w:r>
-        <w:t>Don’t’know</w:t>
-      </w:r>
-      <w:proofErr w:type="spellEnd"/>
-      <w:r>
-        <w:t>/Not applicable”</w:t>
-      </w:r>
-    </w:p>
-    <w:p>
-      <w:pPr>
-        <w:pStyle w:val="ListParagraph"/>
-        <w:numPr>
-          <w:ilvl w:val="0"/>
-          <w:numId w:val="4"/>
-        </w:numPr>
-      </w:pPr>
-      <w:r>
-        <w:t>5 child dev</w:t>
-      </w:r>
-    </w:p>
-    <w:p>
-      <w:pPr>
-        <w:pStyle w:val="ListParagraph"/>
-        <w:numPr>
-          <w:ilvl w:val="1"/>
-          <w:numId w:val="4"/>
-        </w:numPr>
-      </w:pPr>
-      <w:r>
-        <w:t xml:space="preserve">Not allowing me to click </w:t>
-      </w:r>
-      <w:r>
-        <w:t xml:space="preserve">any of the </w:t>
-      </w:r>
-      <w:proofErr w:type="gramStart"/>
-      <w:r>
-        <w:t>multiple choice</w:t>
-      </w:r>
-      <w:proofErr w:type="gramEnd"/>
-      <w:r>
-        <w:t xml:space="preserve"> question</w:t>
-      </w:r>
-      <w:r>
-        <w:t>s in this section</w:t>
-      </w:r>
-      <w:r>
-        <w:t xml:space="preserve">. There might be something wrong with the questions settings here. </w:t>
-      </w:r>
-    </w:p>
-    <w:p>
-      <w:pPr>
-        <w:pStyle w:val="ListParagraph"/>
-        <w:numPr>
-          <w:ilvl w:val="0"/>
-          <w:numId w:val="4"/>
-        </w:numPr>
-        <w:rPr>
-          <w:strike/>
-        </w:rPr>
-      </w:pPr>
-      <w:r>
-        <w:rPr>
-          <w:strike/>
-        </w:rPr>
-        <w:t xml:space="preserve">11 </w:t>
-      </w:r>
-      <w:proofErr w:type="gramStart"/>
-      <w:r>
-        <w:rPr>
-          <w:strike/>
-        </w:rPr>
-        <w:t>review</w:t>
-      </w:r>
-      <w:proofErr w:type="gramEnd"/>
-      <w:r>
-        <w:rPr>
-          <w:strike/>
-        </w:rPr>
-        <w:t xml:space="preserve"> and </w:t>
-      </w:r>
-      <w:proofErr w:type="gramStart"/>
-      <w:r>
-        <w:rPr>
-          <w:strike/>
-        </w:rPr>
-        <w:t>submit</w:t>
-      </w:r>
-      <w:proofErr w:type="gramEnd"/>
-      <w:r>
-        <w:rPr>
-          <w:strike/>
-        </w:rPr>
-        <w:t>:</w:t>
-      </w:r>
-    </w:p>
-    <w:p>
-      <w:pPr>
-        <w:pStyle w:val="ListParagraph"/>
-        <w:numPr>
-          <w:ilvl w:val="1"/>
-          <w:numId w:val="4"/>
-        </w:numPr>
-        <w:rPr>
-          <w:strike/>
-        </w:rPr>
-      </w:pPr>
-      <w:r>
-        <w:rPr>
-          <w:strike/>
-        </w:rPr>
-        <w:t>Do not show summary like that, leave it open for now</w:t>
-      </w:r>
-    </w:p>
-    <w:p>
-      <w:pPr>
-        <w:pStyle w:val="ListParagraph"/>
-        <w:numPr>
-          <w:ilvl w:val="0"/>
-          <w:numId w:val="4"/>
-        </w:numPr>
-      </w:pPr>
-      <w:r>
-        <w:t>Weekly check in</w:t>
-      </w:r>
-    </w:p>
-    <w:p>
-      <w:pPr>
-        <w:pStyle w:val="ListParagraph"/>
-        <w:numPr>
-          <w:ilvl w:val="1"/>
-          <w:numId w:val="4"/>
-        </w:numPr>
-        <w:rPr>
-          <w:strike/>
-        </w:rPr>
-      </w:pPr>
-      <w:r>
-        <w:rPr>
-          <w:strike/>
-        </w:rPr>
-        <w:t>Exclude new waitlist question</w:t>
-      </w:r>
-    </w:p>
-    <w:p>
-      <w:pPr>
-        <w:pStyle w:val="ListParagraph"/>
-        <w:numPr>
-          <w:ilvl w:val="1"/>
-          <w:numId w:val="4"/>
-        </w:numPr>
-        <w:rPr>
-          <w:strike/>
-        </w:rPr>
-      </w:pPr>
-      <w:r>
-        <w:rPr>
-          <w:strike/>
-        </w:rPr>
-        <w:t xml:space="preserve">For “removed from waitlist question”. Phrase it differently like “did you get </w:t>
-      </w:r>
-      <w:proofErr w:type="gramStart"/>
-      <w:r>
-        <w:rPr>
-          <w:strike/>
-        </w:rPr>
-        <w:t>off of</w:t>
-      </w:r>
-      <w:proofErr w:type="gramEnd"/>
-      <w:r>
-        <w:rPr>
-          <w:strike/>
-        </w:rPr>
-        <w:t xml:space="preserve"> any waitlists, as in, got a spot in a </w:t>
-      </w:r>
-      <w:r>
-        <w:rPr>
-          <w:strike/>
-        </w:rPr>
-        <w:t xml:space="preserve">new childcare </w:t>
-      </w:r>
-      <w:r>
-        <w:rPr>
-          <w:strike/>
-        </w:rPr>
-        <w:t>option where you were previously on a waitlist</w:t>
-      </w:r>
-      <w:r>
-        <w:rPr>
-          <w:strike/>
-        </w:rPr>
-        <w:t>?</w:t>
-      </w:r>
-    </w:p>
-    <w:p>
-      <w:pPr>
-        <w:pStyle w:val="ListParagraph"/>
-        <w:numPr>
-          <w:ilvl w:val="2"/>
-          <w:numId w:val="4"/>
-        </w:numPr>
-        <w:rPr>
-          <w:strike/>
-        </w:rPr>
-      </w:pPr>
-      <w:r>
-        <w:rPr>
-          <w:strike/>
-        </w:rPr>
-        <w:t xml:space="preserve">If yes, </w:t>
-      </w:r>
-      <w:r>
-        <w:rPr>
-          <w:strike/>
-        </w:rPr>
-        <w:t xml:space="preserve">ask if any other potential “confounders” also changed and thus </w:t>
-      </w:r>
-      <w:r>
-        <w:rPr>
-          <w:strike/>
-        </w:rPr>
-        <w:t>led to getting of the waitlist like “got a new job”, “got a raise”</w:t>
-      </w:r>
-      <w:r>
-        <w:rPr>
-          <w:strike/>
-        </w:rPr>
-        <w:t>, “moved to a new home”, etc.</w:t>
-      </w:r>
-    </w:p>
-    <w:p>
-      <w:pPr>
-        <w:pStyle w:val="ListParagraph"/>
-        <w:numPr>
-          <w:ilvl w:val="1"/>
-          <w:numId w:val="4"/>
-        </w:numPr>
-        <w:rPr>
-          <w:strike/>
-        </w:rPr>
-      </w:pPr>
-      <w:r>
-        <w:rPr>
-          <w:strike/>
-        </w:rPr>
-        <w:t>Do not display review or computed metrics to participant</w:t>
-      </w:r>
-    </w:p>
-    <w:p>
-      <w:pPr>
-        <w:pStyle w:val="ListParagraph"/>
-        <w:numPr>
-          <w:ilvl w:val="0"/>
-          <w:numId w:val="4"/>
-        </w:numPr>
-        <w:rPr>
-          <w:strike/>
-        </w:rPr>
-      </w:pPr>
-      <w:r>
-        <w:rPr>
-          <w:strike/>
-        </w:rPr>
-        <w:t>Other edits:</w:t>
-      </w:r>
-    </w:p>
-    <w:p>
-      <w:pPr>
-        <w:pStyle w:val="ListParagraph"/>
-        <w:numPr>
-          <w:ilvl w:val="1"/>
-          <w:numId w:val="4"/>
-        </w:numPr>
-        <w:rPr>
-          <w:strike/>
-        </w:rPr>
-      </w:pPr>
-      <w:r>
-        <w:rPr>
-          <w:strike/>
-        </w:rPr>
-        <w:lastRenderedPageBreak/>
-        <w:t xml:space="preserve">I edited the file structure, now there is </w:t>
-      </w:r>
-      <w:proofErr w:type="gramStart"/>
-      <w:r>
-        <w:rPr>
-          <w:strike/>
-        </w:rPr>
-        <w:t>not</w:t>
-      </w:r>
-      <w:proofErr w:type="gramEnd"/>
-      <w:r>
-        <w:rPr>
-          <w:strike/>
-        </w:rPr>
-        <w:t xml:space="preserve"> parent folder anymore, it is just the childcare-precarity-tool folder. </w:t>
-      </w:r>
-    </w:p>
-    <w:p>
-      <w:pPr>
-        <w:pStyle w:val="ListParagraph"/>
-        <w:numPr>
-          <w:ilvl w:val="1"/>
-          <w:numId w:val="4"/>
-        </w:numPr>
-        <w:rPr>
-          <w:strike/>
-        </w:rPr>
-      </w:pPr>
-      <w:r>
-        <w:rPr>
-          <w:strike/>
-        </w:rPr>
-        <w:t xml:space="preserve">I excluded some files and moved some to a folder called archive. Please have </w:t>
-      </w:r>
-      <w:proofErr w:type="spellStart"/>
-      <w:r>
-        <w:rPr>
-          <w:strike/>
-        </w:rPr>
-        <w:t>github</w:t>
-      </w:r>
-      <w:proofErr w:type="spellEnd"/>
-      <w:r>
-        <w:rPr>
-          <w:strike/>
-        </w:rPr>
-        <w:t xml:space="preserve"> ignore and not </w:t>
-      </w:r>
-      <w:r>
-        <w:rPr>
-          <w:strike/>
-        </w:rPr>
-        <w:t>synchronize this folder, I want it locally only</w:t>
-      </w:r>
-    </w:p>
-    <w:p>
-      <w:pPr>
-        <w:pStyle w:val="ListParagraph"/>
-        <w:numPr>
-          <w:ilvl w:val="1"/>
-          <w:numId w:val="4"/>
-        </w:numPr>
-      </w:pPr>
-      <w:r>
-        <w:br/>
-      </w:r>
-    </w:p>
-    <w:p>
-      <w:pPr>
+      </w:pPr>
+      <w:r>
         <w:rPr>
           <w:b/>
           <w:bCs/>
           <w:highlight w:val="yellow"/>
         </w:rPr>
-      </w:pPr>
-    </w:p>
-    <w:p>
-      <w:pPr>
-        <w:rPr>
-          <w:b/>
-          <w:bCs/>
-        </w:rPr>
-      </w:pPr>
-      <w:r>
+        <w:t>3/21/2026</w:t>
+      </w:r>
+    </w:p>
+    <w:p>
+      <w:pPr>
+        <w:pStyle w:val="ListParagraph"/>
+        <w:numPr>
+          <w:ilvl w:val="0"/>
+          <w:numId w:val="5"/>
+        </w:numPr>
+        <w:rPr>
+          <w:strike/>
+        </w:rPr>
+      </w:pPr>
+      <w:r>
+        <w:rPr>
+          <w:strike/>
+        </w:rPr>
+        <w:t xml:space="preserve">Change name to </w:t>
+      </w:r>
+      <w:proofErr w:type="spellStart"/>
+      <w:r>
+        <w:rPr>
+          <w:strike/>
+        </w:rPr>
+        <w:t>caremometer</w:t>
+      </w:r>
+      <w:proofErr w:type="spellEnd"/>
+    </w:p>
+    <w:p>
+      <w:pPr>
+        <w:pStyle w:val="ListParagraph"/>
+        <w:numPr>
+          <w:ilvl w:val="0"/>
+          <w:numId w:val="5"/>
+        </w:numPr>
+      </w:pPr>
+      <w:r>
+        <w:t>Have the first caregiver in the providers tab be pre-loaded as myself in a neutral grey color</w:t>
+      </w:r>
+    </w:p>
+    <w:p>
+      <w:pPr>
+        <w:pStyle w:val="ListParagraph"/>
+        <w:numPr>
+          <w:ilvl w:val="0"/>
+          <w:numId w:val="5"/>
+        </w:numPr>
+      </w:pPr>
+      <w:r>
+        <w:t>Figure out exact child questions</w:t>
+      </w:r>
+    </w:p>
+    <w:p>
+      <w:pPr>
+        <w:pStyle w:val="ListParagraph"/>
+        <w:numPr>
+          <w:ilvl w:val="0"/>
+          <w:numId w:val="5"/>
+        </w:numPr>
+        <w:rPr>
+          <w:strike/>
+        </w:rPr>
+      </w:pPr>
+      <w:r>
+        <w:rPr>
+          <w:strike/>
+        </w:rPr>
+        <w:t xml:space="preserve">Including entry question about relationship </w:t>
+      </w:r>
+      <w:proofErr w:type="gramStart"/>
+      <w:r>
+        <w:rPr>
+          <w:strike/>
+        </w:rPr>
+        <w:t>to</w:t>
+      </w:r>
+      <w:proofErr w:type="gramEnd"/>
+      <w:r>
+        <w:rPr>
+          <w:strike/>
+        </w:rPr>
+        <w:t xml:space="preserve"> child (i.e., biological mother, </w:t>
+      </w:r>
+      <w:proofErr w:type="spellStart"/>
+      <w:r>
+        <w:rPr>
+          <w:strike/>
+        </w:rPr>
+        <w:t>etc</w:t>
+      </w:r>
+      <w:proofErr w:type="spellEnd"/>
+      <w:r>
+        <w:rPr>
+          <w:strike/>
+        </w:rPr>
+        <w:t>)</w:t>
+      </w:r>
+    </w:p>
+    <w:p>
+      <w:pPr>
+        <w:pStyle w:val="ListParagraph"/>
+        <w:numPr>
+          <w:ilvl w:val="0"/>
+          <w:numId w:val="5"/>
+        </w:numPr>
+        <w:rPr>
+          <w:strike/>
+        </w:rPr>
+      </w:pPr>
+      <w:r>
+        <w:rPr>
+          <w:strike/>
+        </w:rPr>
+        <w:t>Figure out Stanford Server</w:t>
+      </w:r>
+    </w:p>
+    <w:p>
+      <w:pPr>
+        <w:pStyle w:val="ListParagraph"/>
+        <w:numPr>
+          <w:ilvl w:val="0"/>
+          <w:numId w:val="5"/>
+        </w:numPr>
+      </w:pPr>
+      <w:r>
+        <w:t>Figure out entry vs weekly</w:t>
+      </w:r>
+    </w:p>
+    <w:p>
+      <w:pPr>
+        <w:pStyle w:val="ListParagraph"/>
+        <w:numPr>
+          <w:ilvl w:val="0"/>
+          <w:numId w:val="5"/>
+        </w:numPr>
+      </w:pPr>
+      <w:r>
+        <w:t xml:space="preserve">Figure out </w:t>
+      </w:r>
+      <w:proofErr w:type="spellStart"/>
+      <w:r>
+        <w:t>qualtrics</w:t>
+      </w:r>
+      <w:proofErr w:type="spellEnd"/>
+      <w:r>
+        <w:t xml:space="preserve"> adaptation</w:t>
+      </w:r>
+    </w:p>
+    <w:p>
+      <w:pPr>
+        <w:pStyle w:val="ListParagraph"/>
+        <w:numPr>
+          <w:ilvl w:val="0"/>
+          <w:numId w:val="5"/>
+        </w:numPr>
+        <w:rPr>
+          <w:strike/>
+        </w:rPr>
+      </w:pPr>
+      <w:r>
+        <w:rPr>
+          <w:strike/>
+        </w:rPr>
+        <w:t>Figure out mobile browser version</w:t>
+      </w:r>
+    </w:p>
+    <w:p>
+      <w:pPr>
+        <w:pStyle w:val="ListParagraph"/>
+        <w:numPr>
+          <w:ilvl w:val="0"/>
+          <w:numId w:val="5"/>
+        </w:numPr>
+        <w:rPr>
+          <w:strike/>
+        </w:rPr>
+      </w:pPr>
+      <w:proofErr w:type="gramStart"/>
+      <w:r>
+        <w:rPr>
+          <w:strike/>
+        </w:rPr>
+        <w:t>Check on</w:t>
+      </w:r>
+      <w:proofErr w:type="gramEnd"/>
+      <w:r>
+        <w:rPr>
+          <w:strike/>
+        </w:rPr>
+        <w:t xml:space="preserve"> the items below</w:t>
+      </w:r>
+    </w:p>
+    <w:p>
+      <w:pPr>
+        <w:pStyle w:val="ListParagraph"/>
+        <w:numPr>
+          <w:ilvl w:val="0"/>
+          <w:numId w:val="5"/>
+        </w:numPr>
+        <w:rPr>
+          <w:strike/>
+        </w:rPr>
+      </w:pPr>
+      <w:r>
+        <w:rPr>
+          <w:strike/>
+        </w:rPr>
+        <w:t>Adjust child age</w:t>
+      </w:r>
+    </w:p>
+    <w:p>
+      <w:pPr>
         <w:rPr>
           <w:b/>
           <w:bCs/>
           <w:highlight w:val="yellow"/>
         </w:rPr>
-        <w:t>3/17/2026</w:t>
-      </w:r>
-    </w:p>
-    <w:p>
-      <w:pPr>
-        <w:pStyle w:val="ListParagraph"/>
-        <w:numPr>
-          <w:ilvl w:val="0"/>
-          <w:numId w:val="3"/>
-        </w:numPr>
+      </w:pPr>
+      <w:r>
         <w:rPr>
           <w:b/>
           <w:bCs/>
-        </w:rPr>
-      </w:pPr>
-      <w:r>
+          <w:highlight w:val="yellow"/>
+        </w:rPr>
+        <w:t>3/18/2026</w:t>
+      </w:r>
+    </w:p>
+    <w:p>
+      <w:pPr>
+        <w:pStyle w:val="ListParagraph"/>
+        <w:numPr>
+          <w:ilvl w:val="0"/>
+          <w:numId w:val="4"/>
+        </w:numPr>
+        <w:rPr>
+          <w:strike/>
+        </w:rPr>
+      </w:pPr>
+      <w:r>
+        <w:rPr>
+          <w:strike/>
+        </w:rPr>
+        <w:t>2 Provider</w:t>
+      </w:r>
+    </w:p>
+    <w:p>
+      <w:pPr>
+        <w:pStyle w:val="ListParagraph"/>
+        <w:numPr>
+          <w:ilvl w:val="0"/>
+          <w:numId w:val="4"/>
+        </w:numPr>
+        <w:rPr>
+          <w:strike/>
+        </w:rPr>
+      </w:pPr>
+      <w:r>
+        <w:rPr>
+          <w:strike/>
+        </w:rPr>
+        <w:t>3 affordability</w:t>
+      </w:r>
+    </w:p>
+    <w:p>
+      <w:pPr>
+        <w:pStyle w:val="ListParagraph"/>
+        <w:numPr>
+          <w:ilvl w:val="1"/>
+          <w:numId w:val="4"/>
+        </w:numPr>
+        <w:rPr>
+          <w:strike/>
+        </w:rPr>
+      </w:pPr>
+      <w:r>
+        <w:rPr>
+          <w:strike/>
+        </w:rPr>
+        <w:t xml:space="preserve">Have </w:t>
+      </w:r>
+      <w:proofErr w:type="gramStart"/>
+      <w:r>
+        <w:rPr>
+          <w:strike/>
+        </w:rPr>
+        <w:t>them</w:t>
+      </w:r>
+      <w:proofErr w:type="gramEnd"/>
+      <w:r>
+        <w:rPr>
+          <w:strike/>
+        </w:rPr>
+        <w:t xml:space="preserve"> put the percentage open. Include instruction: if you don’t know exactly, you can put an approximation</w:t>
+      </w:r>
+    </w:p>
+    <w:p>
+      <w:pPr>
+        <w:pStyle w:val="ListParagraph"/>
+        <w:numPr>
+          <w:ilvl w:val="0"/>
+          <w:numId w:val="4"/>
+        </w:numPr>
+      </w:pPr>
+      <w:r>
+        <w:t xml:space="preserve">4 </w:t>
+      </w:r>
+      <w:proofErr w:type="gramStart"/>
+      <w:r>
+        <w:t>effort</w:t>
+      </w:r>
+      <w:proofErr w:type="gramEnd"/>
+    </w:p>
+    <w:p>
+      <w:pPr>
+        <w:pStyle w:val="ListParagraph"/>
+        <w:numPr>
+          <w:ilvl w:val="1"/>
+          <w:numId w:val="4"/>
+        </w:numPr>
+        <w:rPr>
+          <w:strike/>
+        </w:rPr>
+      </w:pPr>
+      <w:r>
+        <w:rPr>
+          <w:strike/>
+        </w:rPr>
+        <w:t>Have them put minutes openly instead of choosing</w:t>
+      </w:r>
+    </w:p>
+    <w:p>
+      <w:pPr>
+        <w:pStyle w:val="ListParagraph"/>
+        <w:numPr>
+          <w:ilvl w:val="1"/>
+          <w:numId w:val="4"/>
+        </w:numPr>
+        <w:rPr>
+          <w:strike/>
+        </w:rPr>
+      </w:pPr>
+      <w:r>
+        <w:rPr>
+          <w:strike/>
+        </w:rPr>
+        <w:t xml:space="preserve">Last question “how difficult” </w:t>
+      </w:r>
+      <w:r>
+        <w:rPr>
+          <w:strike/>
+        </w:rPr>
+        <w:t xml:space="preserve">-&gt; do not </w:t>
+      </w:r>
+      <w:proofErr w:type="gramStart"/>
+      <w:r>
+        <w:rPr>
+          <w:strike/>
+        </w:rPr>
+        <w:t>have not</w:t>
+      </w:r>
+      <w:proofErr w:type="gramEnd"/>
+      <w:r>
+        <w:rPr>
+          <w:strike/>
+        </w:rPr>
+        <w:t xml:space="preserve"> applicable as 0</w:t>
+      </w:r>
+    </w:p>
+    <w:p>
+      <w:pPr>
+        <w:pStyle w:val="ListParagraph"/>
+        <w:numPr>
+          <w:ilvl w:val="1"/>
+          <w:numId w:val="4"/>
+        </w:numPr>
+      </w:pPr>
+      <w:r>
+        <w:t>For every question, include a side-option as “</w:t>
+      </w:r>
+      <w:proofErr w:type="spellStart"/>
+      <w:r>
+        <w:t>Don’t’know</w:t>
+      </w:r>
+      <w:proofErr w:type="spellEnd"/>
+      <w:r>
+        <w:t>/Not applicable”</w:t>
+      </w:r>
+    </w:p>
+    <w:p>
+      <w:pPr>
+        <w:pStyle w:val="ListParagraph"/>
+        <w:numPr>
+          <w:ilvl w:val="0"/>
+          <w:numId w:val="4"/>
+        </w:numPr>
+      </w:pPr>
+      <w:r>
+        <w:t>5 child dev</w:t>
+      </w:r>
+    </w:p>
+    <w:p>
+      <w:pPr>
+        <w:pStyle w:val="ListParagraph"/>
+        <w:numPr>
+          <w:ilvl w:val="1"/>
+          <w:numId w:val="4"/>
+        </w:numPr>
+      </w:pPr>
+      <w:r>
+        <w:t xml:space="preserve">Not allowing me to click </w:t>
+      </w:r>
+      <w:r>
+        <w:t xml:space="preserve">any of the </w:t>
+      </w:r>
+      <w:proofErr w:type="gramStart"/>
+      <w:r>
+        <w:t>multiple choice</w:t>
+      </w:r>
+      <w:proofErr w:type="gramEnd"/>
+      <w:r>
+        <w:t xml:space="preserve"> question</w:t>
+      </w:r>
+      <w:r>
+        <w:t>s in this section</w:t>
+      </w:r>
+      <w:r>
+        <w:t xml:space="preserve">. There might be something wrong with the questions settings here. </w:t>
+      </w:r>
+    </w:p>
+    <w:p>
+      <w:pPr>
+        <w:pStyle w:val="ListParagraph"/>
+        <w:numPr>
+          <w:ilvl w:val="0"/>
+          <w:numId w:val="4"/>
+        </w:numPr>
+        <w:rPr>
+          <w:strike/>
+        </w:rPr>
+      </w:pPr>
+      <w:r>
+        <w:rPr>
+          <w:strike/>
+        </w:rPr>
+        <w:t xml:space="preserve">11 </w:t>
+      </w:r>
+      <w:proofErr w:type="gramStart"/>
+      <w:r>
+        <w:rPr>
+          <w:strike/>
+        </w:rPr>
+        <w:t>review</w:t>
+      </w:r>
+      <w:proofErr w:type="gramEnd"/>
+      <w:r>
+        <w:rPr>
+          <w:strike/>
+        </w:rPr>
+        <w:t xml:space="preserve"> and </w:t>
+      </w:r>
+      <w:proofErr w:type="gramStart"/>
+      <w:r>
+        <w:rPr>
+          <w:strike/>
+        </w:rPr>
+        <w:t>submit</w:t>
+      </w:r>
+      <w:proofErr w:type="gramEnd"/>
+      <w:r>
+        <w:rPr>
+          <w:strike/>
+        </w:rPr>
+        <w:t>:</w:t>
+      </w:r>
+    </w:p>
+    <w:p>
+      <w:pPr>
+        <w:pStyle w:val="ListParagraph"/>
+        <w:numPr>
+          <w:ilvl w:val="1"/>
+          <w:numId w:val="4"/>
+        </w:numPr>
+        <w:rPr>
+          <w:strike/>
+        </w:rPr>
+      </w:pPr>
+      <w:r>
+        <w:rPr>
+          <w:strike/>
+        </w:rPr>
+        <w:t>Do not show summary like that, leave it open for now</w:t>
+      </w:r>
+    </w:p>
+    <w:p>
+      <w:pPr>
+        <w:pStyle w:val="ListParagraph"/>
+        <w:numPr>
+          <w:ilvl w:val="0"/>
+          <w:numId w:val="4"/>
+        </w:numPr>
+      </w:pPr>
+      <w:r>
+        <w:t>Weekly check in</w:t>
+      </w:r>
+    </w:p>
+    <w:p>
+      <w:pPr>
+        <w:pStyle w:val="ListParagraph"/>
+        <w:numPr>
+          <w:ilvl w:val="1"/>
+          <w:numId w:val="4"/>
+        </w:numPr>
+        <w:rPr>
+          <w:strike/>
+        </w:rPr>
+      </w:pPr>
+      <w:r>
+        <w:rPr>
+          <w:strike/>
+        </w:rPr>
+        <w:t>Exclude new waitlist question</w:t>
+      </w:r>
+    </w:p>
+    <w:p>
+      <w:pPr>
+        <w:pStyle w:val="ListParagraph"/>
+        <w:numPr>
+          <w:ilvl w:val="1"/>
+          <w:numId w:val="4"/>
+        </w:numPr>
+        <w:rPr>
+          <w:strike/>
+        </w:rPr>
+      </w:pPr>
+      <w:r>
+        <w:rPr>
+          <w:strike/>
+        </w:rPr>
+        <w:lastRenderedPageBreak/>
+        <w:t xml:space="preserve">For “removed from waitlist question”. Phrase it differently like “did you get </w:t>
+      </w:r>
+      <w:proofErr w:type="gramStart"/>
+      <w:r>
+        <w:rPr>
+          <w:strike/>
+        </w:rPr>
+        <w:t>off of</w:t>
+      </w:r>
+      <w:proofErr w:type="gramEnd"/>
+      <w:r>
+        <w:rPr>
+          <w:strike/>
+        </w:rPr>
+        <w:t xml:space="preserve"> any waitlists, as in, got a spot in a </w:t>
+      </w:r>
+      <w:r>
+        <w:rPr>
+          <w:strike/>
+        </w:rPr>
+        <w:t xml:space="preserve">new childcare </w:t>
+      </w:r>
+      <w:r>
+        <w:rPr>
+          <w:strike/>
+        </w:rPr>
+        <w:t>option where you were previously on a waitlist</w:t>
+      </w:r>
+      <w:r>
+        <w:rPr>
+          <w:strike/>
+        </w:rPr>
+        <w:t>?</w:t>
+      </w:r>
+    </w:p>
+    <w:p>
+      <w:pPr>
+        <w:pStyle w:val="ListParagraph"/>
+        <w:numPr>
+          <w:ilvl w:val="2"/>
+          <w:numId w:val="4"/>
+        </w:numPr>
+        <w:rPr>
+          <w:strike/>
+        </w:rPr>
+      </w:pPr>
+      <w:r>
+        <w:rPr>
+          <w:strike/>
+        </w:rPr>
+        <w:t xml:space="preserve">If yes, </w:t>
+      </w:r>
+      <w:r>
+        <w:rPr>
+          <w:strike/>
+        </w:rPr>
+        <w:t xml:space="preserve">ask if any other potential “confounders” also changed and thus </w:t>
+      </w:r>
+      <w:r>
+        <w:rPr>
+          <w:strike/>
+        </w:rPr>
+        <w:t>led to getting of the waitlist like “got a new job”, “got a raise”</w:t>
+      </w:r>
+      <w:r>
+        <w:rPr>
+          <w:strike/>
+        </w:rPr>
+        <w:t>, “moved to a new home”, etc.</w:t>
+      </w:r>
+    </w:p>
+    <w:p>
+      <w:pPr>
+        <w:pStyle w:val="ListParagraph"/>
+        <w:numPr>
+          <w:ilvl w:val="1"/>
+          <w:numId w:val="4"/>
+        </w:numPr>
+        <w:rPr>
+          <w:strike/>
+        </w:rPr>
+      </w:pPr>
+      <w:r>
+        <w:rPr>
+          <w:strike/>
+        </w:rPr>
+        <w:t>Do not display review or computed metrics to participant</w:t>
+      </w:r>
+    </w:p>
+    <w:p>
+      <w:pPr>
+        <w:pStyle w:val="ListParagraph"/>
+        <w:numPr>
+          <w:ilvl w:val="0"/>
+          <w:numId w:val="4"/>
+        </w:numPr>
+        <w:rPr>
+          <w:strike/>
+        </w:rPr>
+      </w:pPr>
+      <w:r>
+        <w:rPr>
+          <w:strike/>
+        </w:rPr>
+        <w:t>Other edits:</w:t>
+      </w:r>
+    </w:p>
+    <w:p>
+      <w:pPr>
+        <w:pStyle w:val="ListParagraph"/>
+        <w:numPr>
+          <w:ilvl w:val="1"/>
+          <w:numId w:val="4"/>
+        </w:numPr>
+        <w:rPr>
+          <w:strike/>
+        </w:rPr>
+      </w:pPr>
+      <w:r>
+        <w:rPr>
+          <w:strike/>
+        </w:rPr>
+        <w:t xml:space="preserve">I edited the file structure, now there is </w:t>
+      </w:r>
+      <w:proofErr w:type="gramStart"/>
+      <w:r>
+        <w:rPr>
+          <w:strike/>
+        </w:rPr>
+        <w:t>not</w:t>
+      </w:r>
+      <w:proofErr w:type="gramEnd"/>
+      <w:r>
+        <w:rPr>
+          <w:strike/>
+        </w:rPr>
+        <w:t xml:space="preserve"> parent folder anymore, it is just the childcare-precarity-tool folder. </w:t>
+      </w:r>
+    </w:p>
+    <w:p>
+      <w:pPr>
+        <w:pStyle w:val="ListParagraph"/>
+        <w:numPr>
+          <w:ilvl w:val="1"/>
+          <w:numId w:val="4"/>
+        </w:numPr>
+        <w:rPr>
+          <w:strike/>
+        </w:rPr>
+      </w:pPr>
+      <w:r>
+        <w:rPr>
+          <w:strike/>
+        </w:rPr>
+        <w:t xml:space="preserve">I excluded some files and moved some to a folder called archive. Please have </w:t>
+      </w:r>
+      <w:proofErr w:type="spellStart"/>
+      <w:r>
+        <w:rPr>
+          <w:strike/>
+        </w:rPr>
+        <w:t>github</w:t>
+      </w:r>
+      <w:proofErr w:type="spellEnd"/>
+      <w:r>
+        <w:rPr>
+          <w:strike/>
+        </w:rPr>
+        <w:t xml:space="preserve"> ignore and not </w:t>
+      </w:r>
+      <w:r>
+        <w:rPr>
+          <w:strike/>
+        </w:rPr>
+        <w:t>synchronize this folder, I want it locally only</w:t>
+      </w:r>
+    </w:p>
+    <w:p>
+      <w:pPr>
+        <w:pStyle w:val="ListParagraph"/>
+        <w:numPr>
+          <w:ilvl w:val="1"/>
+          <w:numId w:val="4"/>
+        </w:numPr>
+      </w:pPr>
+      <w:r>
+        <w:br/>
+      </w:r>
+    </w:p>
+    <w:p>
+      <w:pPr>
         <w:rPr>
           <w:b/>
           <w:bCs/>
-        </w:rPr>
-        <w:t>Entry and exit</w:t>
-      </w:r>
-      <w:r>
+          <w:highlight w:val="yellow"/>
+        </w:rPr>
+      </w:pPr>
+    </w:p>
+    <w:p>
+      <w:pPr>
         <w:rPr>
           <w:b/>
           <w:bCs/>
         </w:rPr>
-        <w:t xml:space="preserve"> ~30 minutes</w:t>
-      </w:r>
-    </w:p>
-    <w:p>
-      <w:pPr>
-        <w:pStyle w:val="ListParagraph"/>
-        <w:numPr>
-          <w:ilvl w:val="1"/>
-          <w:numId w:val="3"/>
-        </w:numPr>
-      </w:pPr>
-      <w:r>
-        <w:t>Demographics</w:t>
-      </w:r>
-    </w:p>
-    <w:p>
-      <w:pPr>
-        <w:pStyle w:val="ListParagraph"/>
-        <w:numPr>
-          <w:ilvl w:val="1"/>
-          <w:numId w:val="3"/>
-        </w:numPr>
-      </w:pPr>
-      <w:r>
-        <w:t>Access + precarity</w:t>
-      </w:r>
-      <w:r>
-        <w:t xml:space="preserve"> (full on entry)</w:t>
-      </w:r>
-    </w:p>
-    <w:p>
-      <w:pPr>
-        <w:pStyle w:val="ListParagraph"/>
-        <w:numPr>
-          <w:ilvl w:val="1"/>
-          <w:numId w:val="3"/>
-        </w:numPr>
-      </w:pPr>
-      <w:r>
-        <w:t>Parent emotional</w:t>
-      </w:r>
-    </w:p>
-    <w:p>
-      <w:pPr>
-        <w:pStyle w:val="ListParagraph"/>
-        <w:numPr>
-          <w:ilvl w:val="1"/>
-          <w:numId w:val="3"/>
-        </w:numPr>
-      </w:pPr>
-      <w:r>
-        <w:t>Child emotional</w:t>
-      </w:r>
-    </w:p>
-    <w:p>
-      <w:pPr>
-        <w:pStyle w:val="ListParagraph"/>
-        <w:numPr>
-          <w:ilvl w:val="1"/>
-          <w:numId w:val="3"/>
-        </w:numPr>
-      </w:pPr>
-      <w:r>
-        <w:t>Child Cognition</w:t>
-      </w:r>
-    </w:p>
-    <w:p>
-      <w:pPr>
-        <w:pStyle w:val="ListParagraph"/>
-        <w:numPr>
-          <w:ilvl w:val="1"/>
-          <w:numId w:val="3"/>
-        </w:numPr>
-      </w:pPr>
-      <w:r>
-        <w:t>Parent cognition</w:t>
-      </w:r>
-    </w:p>
-    <w:p>
-      <w:pPr>
-        <w:pStyle w:val="ListParagraph"/>
-        <w:ind w:left="1440"/>
-      </w:pPr>
-    </w:p>
-    <w:p>
-      <w:pPr>
-        <w:pStyle w:val="ListParagraph"/>
-        <w:numPr>
-          <w:ilvl w:val="0"/>
-          <w:numId w:val="3"/>
-        </w:numPr>
+      </w:pPr>
+      <w:r>
         <w:rPr>
           <w:b/>
           <w:bCs/>
-        </w:rPr>
-      </w:pPr>
-      <w:r>
+          <w:highlight w:val="yellow"/>
+        </w:rPr>
+        <w:t>3/17/2026</w:t>
+      </w:r>
+    </w:p>
+    <w:p>
+      <w:pPr>
+        <w:pStyle w:val="ListParagraph"/>
+        <w:numPr>
+          <w:ilvl w:val="0"/>
+          <w:numId w:val="3"/>
+        </w:numPr>
         <w:rPr>
           <w:b/>
           <w:bCs/>
         </w:rPr>
-        <w:t>Weekly</w:t>
-      </w:r>
+      </w:pPr>
       <w:r>
         <w:rPr>
           <w:b/>
           <w:bCs/>
         </w:rPr>
-        <w:t xml:space="preserve"> ~ 5 minutes</w:t>
-      </w:r>
-    </w:p>
-    <w:p>
-      <w:pPr>
-        <w:pStyle w:val="ListParagraph"/>
-        <w:numPr>
-          <w:ilvl w:val="1"/>
-          <w:numId w:val="3"/>
-        </w:numPr>
-      </w:pPr>
-      <w:r>
-        <w:t>Access + precarity</w:t>
-      </w:r>
-      <w:r>
-        <w:t xml:space="preserve"> (calendar)</w:t>
-      </w:r>
-    </w:p>
-    <w:p>
-      <w:pPr>
-        <w:pStyle w:val="ListParagraph"/>
-        <w:numPr>
-          <w:ilvl w:val="1"/>
-          <w:numId w:val="3"/>
-        </w:numPr>
-      </w:pPr>
-      <w:r>
-        <w:t>Child emotional</w:t>
-      </w:r>
-    </w:p>
-    <w:p>
-      <w:pPr>
-        <w:pStyle w:val="ListParagraph"/>
-        <w:numPr>
-          <w:ilvl w:val="1"/>
-          <w:numId w:val="3"/>
-        </w:numPr>
-      </w:pPr>
-      <w:r>
-        <w:t>Parent emotional</w:t>
-      </w:r>
-    </w:p>
-    <w:p>
-      <w:pPr>
-        <w:pStyle w:val="ListParagraph"/>
-        <w:numPr>
-          <w:ilvl w:val="1"/>
-          <w:numId w:val="3"/>
-        </w:numPr>
-      </w:pPr>
-      <w:r>
-        <w:t>Waitlist status</w:t>
-      </w:r>
-    </w:p>
-    <w:p>
-      <w:pPr>
-        <w:pStyle w:val="ListParagraph"/>
-        <w:ind w:left="1440"/>
-      </w:pPr>
-    </w:p>
-    <w:p>
-      <w:pPr>
-        <w:pStyle w:val="ListParagraph"/>
-        <w:numPr>
-          <w:ilvl w:val="0"/>
-          <w:numId w:val="3"/>
-        </w:numPr>
+        <w:t>Entry and exit</w:t>
+      </w:r>
+      <w:r>
         <w:rPr>
           <w:b/>
           <w:bCs/>
         </w:rPr>
-      </w:pPr>
-      <w:r>
+        <w:t xml:space="preserve"> ~30 minutes</w:t>
+      </w:r>
+    </w:p>
+    <w:p>
+      <w:pPr>
+        <w:pStyle w:val="ListParagraph"/>
+        <w:numPr>
+          <w:ilvl w:val="1"/>
+          <w:numId w:val="3"/>
+        </w:numPr>
+      </w:pPr>
+      <w:r>
+        <w:t>Demographics</w:t>
+      </w:r>
+    </w:p>
+    <w:p>
+      <w:pPr>
+        <w:pStyle w:val="ListParagraph"/>
+        <w:numPr>
+          <w:ilvl w:val="1"/>
+          <w:numId w:val="3"/>
+        </w:numPr>
+      </w:pPr>
+      <w:r>
+        <w:t>Access + precarity</w:t>
+      </w:r>
+      <w:r>
+        <w:t xml:space="preserve"> (full on entry)</w:t>
+      </w:r>
+    </w:p>
+    <w:p>
+      <w:pPr>
+        <w:pStyle w:val="ListParagraph"/>
+        <w:numPr>
+          <w:ilvl w:val="1"/>
+          <w:numId w:val="3"/>
+        </w:numPr>
+      </w:pPr>
+      <w:r>
+        <w:t>Parent emotional</w:t>
+      </w:r>
+    </w:p>
+    <w:p>
+      <w:pPr>
+        <w:pStyle w:val="ListParagraph"/>
+        <w:numPr>
+          <w:ilvl w:val="1"/>
+          <w:numId w:val="3"/>
+        </w:numPr>
+      </w:pPr>
+      <w:r>
+        <w:t>Child emotional</w:t>
+      </w:r>
+    </w:p>
+    <w:p>
+      <w:pPr>
+        <w:pStyle w:val="ListParagraph"/>
+        <w:numPr>
+          <w:ilvl w:val="1"/>
+          <w:numId w:val="3"/>
+        </w:numPr>
+      </w:pPr>
+      <w:r>
+        <w:t>Child Cognition</w:t>
+      </w:r>
+    </w:p>
+    <w:p>
+      <w:pPr>
+        <w:pStyle w:val="ListParagraph"/>
+        <w:numPr>
+          <w:ilvl w:val="1"/>
+          <w:numId w:val="3"/>
+        </w:numPr>
+      </w:pPr>
+      <w:r>
+        <w:t>Parent cognition</w:t>
+      </w:r>
+    </w:p>
+    <w:p>
+      <w:pPr>
+        <w:pStyle w:val="ListParagraph"/>
+        <w:ind w:left="1440"/>
+      </w:pPr>
+    </w:p>
+    <w:p>
+      <w:pPr>
+        <w:pStyle w:val="ListParagraph"/>
+        <w:numPr>
+          <w:ilvl w:val="0"/>
+          <w:numId w:val="3"/>
+        </w:numPr>
         <w:rPr>
           <w:b/>
           <w:bCs/>
         </w:rPr>
+      </w:pPr>
+      <w:r>
+        <w:rPr>
+          <w:b/>
+          <w:bCs/>
+        </w:rPr>
+        <w:t>Weekly</w:t>
+      </w:r>
+      <w:r>
+        <w:rPr>
+          <w:b/>
+          <w:bCs/>
+        </w:rPr>
+        <w:t xml:space="preserve"> ~ 5 minutes</w:t>
+      </w:r>
+    </w:p>
+    <w:p>
+      <w:pPr>
+        <w:pStyle w:val="ListParagraph"/>
+        <w:numPr>
+          <w:ilvl w:val="1"/>
+          <w:numId w:val="3"/>
+        </w:numPr>
+      </w:pPr>
+      <w:r>
         <w:t>Access + precarity</w:t>
       </w:r>
+      <w:r>
+        <w:t xml:space="preserve"> (calendar)</w:t>
+      </w:r>
+    </w:p>
+    <w:p>
+      <w:pPr>
+        <w:pStyle w:val="ListParagraph"/>
+        <w:numPr>
+          <w:ilvl w:val="1"/>
+          <w:numId w:val="3"/>
+        </w:numPr>
+      </w:pPr>
+      <w:r>
+        <w:t>Child emotional</w:t>
+      </w:r>
+    </w:p>
+    <w:p>
+      <w:pPr>
+        <w:pStyle w:val="ListParagraph"/>
+        <w:numPr>
+          <w:ilvl w:val="1"/>
+          <w:numId w:val="3"/>
+        </w:numPr>
+      </w:pPr>
+      <w:r>
+        <w:t>Parent emotional</w:t>
+      </w:r>
+    </w:p>
+    <w:p>
+      <w:pPr>
+        <w:pStyle w:val="ListParagraph"/>
+        <w:numPr>
+          <w:ilvl w:val="1"/>
+          <w:numId w:val="3"/>
+        </w:numPr>
+      </w:pPr>
+      <w:r>
+        <w:t>Waitlist status</w:t>
+      </w:r>
+    </w:p>
+    <w:p>
+      <w:pPr>
+        <w:pStyle w:val="ListParagraph"/>
+        <w:ind w:left="1440"/>
+      </w:pPr>
+    </w:p>
+    <w:p>
+      <w:pPr>
+        <w:pStyle w:val="ListParagraph"/>
+        <w:numPr>
+          <w:ilvl w:val="0"/>
+          <w:numId w:val="3"/>
+        </w:numPr>
+        <w:rPr>
+          <w:b/>
+          <w:bCs/>
+        </w:rPr>
+      </w:pPr>
+      <w:r>
+        <w:rPr>
+          <w:b/>
+          <w:bCs/>
+        </w:rPr>
+        <w:t>Access + precarity</w:t>
+      </w:r>
     </w:p>
     <w:p>
       <w:pPr>
@@ -1045,6 +1136,7 @@
         </w:numPr>
       </w:pPr>
       <w:r>
+        <w:lastRenderedPageBreak/>
         <w:t>geographical location + location of each provider</w:t>
       </w:r>
     </w:p>
@@ -1177,7 +1269,6 @@
       </w:pPr>
       <w:proofErr w:type="gramStart"/>
       <w:r>
-        <w:lastRenderedPageBreak/>
         <w:t>Meet</w:t>
       </w:r>
       <w:proofErr w:type="gramEnd"/>
@@ -1559,7 +1650,6 @@
         </w:tabs>
       </w:pPr>
       <w:r>
-        <w:lastRenderedPageBreak/>
         <w:t>For real:</w:t>
       </w:r>
     </w:p>
@@ -1982,6 +2072,7 @@
         </w:tabs>
       </w:pPr>
       <w:r>
+        <w:lastRenderedPageBreak/>
         <w:t xml:space="preserve">Eventually, if they are searching, we can even help them FIND IT. </w:t>
       </w:r>
     </w:p>
@@ -2354,7 +2445,7 @@
       <w:lvlText w:val="o"/>
       <w:lvlJc w:val="left"/>
       <w:pPr>
-        <w:ind w:left="720" w:hanging="360"/>
+        <w:ind w:left="360" w:hanging="360"/>
       </w:pPr>
       <w:rPr>
         <w:rFonts w:ascii="Courier New" w:hAnsi="Courier New" w:cs="Courier New" w:hint="default"/>
@@ -2366,7 +2457,7 @@
       <w:lvlText w:val="o"/>
       <w:lvlJc w:val="left"/>
       <w:pPr>
-        <w:ind w:left="1440" w:hanging="360"/>
+        <w:ind w:left="1080" w:hanging="360"/>
       </w:pPr>
       <w:rPr>
         <w:rFonts w:ascii="Courier New" w:hAnsi="Courier New" w:cs="Courier New" w:hint="default"/>
@@ -2378,7 +2469,7 @@
       <w:lvlText w:val=""/>
       <w:lvlJc w:val="left"/>
       <w:pPr>
-        <w:ind w:left="2160" w:hanging="360"/>
+        <w:ind w:left="1800" w:hanging="360"/>
       </w:pPr>
       <w:rPr>
         <w:rFonts w:ascii="Wingdings" w:hAnsi="Wingdings" w:hint="default"/>
@@ -2390,7 +2481,7 @@
       <w:lvlText w:val=""/>
       <w:lvlJc w:val="left"/>
       <w:pPr>
-        <w:ind w:left="2880" w:hanging="360"/>
+        <w:ind w:left="2520" w:hanging="360"/>
       </w:pPr>
       <w:rPr>
         <w:rFonts w:ascii="Symbol" w:hAnsi="Symbol" w:hint="default"/>
@@ -2402,7 +2493,7 @@
       <w:lvlText w:val="o"/>
       <w:lvlJc w:val="left"/>
       <w:pPr>
-        <w:ind w:left="3600" w:hanging="360"/>
+        <w:ind w:left="3240" w:hanging="360"/>
       </w:pPr>
       <w:rPr>
         <w:rFonts w:ascii="Courier New" w:hAnsi="Courier New" w:cs="Courier New" w:hint="default"/>
@@ -2414,7 +2505,7 @@
       <w:lvlText w:val=""/>
       <w:lvlJc w:val="left"/>
       <w:pPr>
-        <w:ind w:left="4320" w:hanging="360"/>
+        <w:ind w:left="3960" w:hanging="360"/>
       </w:pPr>
       <w:rPr>
         <w:rFonts w:ascii="Wingdings" w:hAnsi="Wingdings" w:hint="default"/>
@@ -2426,7 +2517,7 @@
       <w:lvlText w:val=""/>
       <w:lvlJc w:val="left"/>
       <w:pPr>
-        <w:ind w:left="5040" w:hanging="360"/>
+        <w:ind w:left="4680" w:hanging="360"/>
       </w:pPr>
       <w:rPr>
         <w:rFonts w:ascii="Symbol" w:hAnsi="Symbol" w:hint="default"/>
@@ -2438,7 +2529,7 @@
       <w:lvlText w:val="o"/>
       <w:lvlJc w:val="left"/>
       <w:pPr>
-        <w:ind w:left="5760" w:hanging="360"/>
+        <w:ind w:left="5400" w:hanging="360"/>
       </w:pPr>
       <w:rPr>
         <w:rFonts w:ascii="Courier New" w:hAnsi="Courier New" w:cs="Courier New" w:hint="default"/>
@@ -2450,7 +2541,7 @@
       <w:lvlText w:val=""/>
       <w:lvlJc w:val="left"/>
       <w:pPr>
-        <w:ind w:left="6480" w:hanging="360"/>
+        <w:ind w:left="6120" w:hanging="360"/>
       </w:pPr>
       <w:rPr>
         <w:rFonts w:ascii="Wingdings" w:hAnsi="Wingdings" w:hint="default"/>

</xml_diff>

<commit_message>
made alterations to files and readme
</commit_message>
<xml_diff>
--- a/archive/notes.docx
+++ b/archive/notes.docx
@@ -94,16 +94,28 @@
           <w:ilvl w:val="0"/>
           <w:numId w:val="5"/>
         </w:numPr>
-      </w:pPr>
-      <w:r>
+        <w:rPr>
+          <w:strike/>
+        </w:rPr>
+      </w:pPr>
+      <w:r>
+        <w:rPr>
+          <w:strike/>
+        </w:rPr>
         <w:t xml:space="preserve">Take out summaries in the end in all surveys, </w:t>
       </w:r>
       <w:proofErr w:type="spellStart"/>
       <w:r>
+        <w:rPr>
+          <w:strike/>
+        </w:rPr>
         <w:t>parcitipants</w:t>
       </w:r>
       <w:proofErr w:type="spellEnd"/>
       <w:r>
+        <w:rPr>
+          <w:strike/>
+        </w:rPr>
         <w:t xml:space="preserve"> should not view their summaries.</w:t>
       </w:r>
     </w:p>

</xml_diff>

<commit_message>
Asked Codex to go over claude's code and fix any bugs
</commit_message>
<xml_diff>
--- a/archive/notes.docx
+++ b/archive/notes.docx
@@ -3,170 +3,6 @@
 <w:document xmlns:wpc="http://schemas.microsoft.com/office/word/2010/wordprocessingCanvas" xmlns:cx="http://schemas.microsoft.com/office/drawing/2014/chartex" xmlns:cx1="http://schemas.microsoft.com/office/drawing/2015/9/8/chartex" xmlns:cx2="http://schemas.microsoft.com/office/drawing/2015/10/21/chartex" xmlns:cx3="http://schemas.microsoft.com/office/drawing/2016/5/9/chartex" xmlns:cx4="http://schemas.microsoft.com/office/drawing/2016/5/10/chartex" xmlns:cx5="http://schemas.microsoft.com/office/drawing/2016/5/11/chartex" xmlns:cx6="http://schemas.microsoft.com/office/drawing/2016/5/12/chartex" xmlns:cx7="http://schemas.microsoft.com/office/drawing/2016/5/13/chartex" xmlns:cx8="http://schemas.microsoft.com/office/drawing/2016/5/14/chartex" xmlns:mc="http://schemas.openxmlformats.org/markup-compatibility/2006" xmlns:aink="http://schemas.microsoft.com/office/drawing/2016/ink" xmlns:am3d="http://schemas.microsoft.com/office/drawing/2017/model3d" xmlns:o="urn:schemas-microsoft-com:office:office" xmlns:oel="http://schemas.microsoft.com/office/2019/extlst" xmlns:r="http://schemas.openxmlformats.org/officeDocument/2006/relationships" xmlns:m="http://schemas.openxmlformats.org/officeDocument/2006/math" xmlns:v="urn:schemas-microsoft-com:vml" xmlns:wp14="http://schemas.microsoft.com/office/word/2010/wordprocessingDrawing" xmlns:wp="http://schemas.openxmlformats.org/drawingml/2006/wordprocessingDrawing" xmlns:w10="urn:schemas-microsoft-com:office:word" xmlns:w="http://schemas.openxmlformats.org/wordprocessingml/2006/main" xmlns:w14="http://schemas.microsoft.com/office/word/2010/wordml" xmlns:w15="http://schemas.microsoft.com/office/word/2012/wordml" xmlns:w16cex="http://schemas.microsoft.com/office/word/2018/wordml/cex" xmlns:w16cid="http://schemas.microsoft.com/office/word/2016/wordml/cid" xmlns:w16="http://schemas.microsoft.com/office/word/2018/wordml" xmlns:w16du="http://schemas.microsoft.com/office/word/2023/wordml/word16du" xmlns:w16sdtdh="http://schemas.microsoft.com/office/word/2020/wordml/sdtdatahash" xmlns:w16sdtfl="http://schemas.microsoft.com/office/word/2024/wordml/sdtformatlock" xmlns:w16se="http://schemas.microsoft.com/office/word/2015/wordml/symex" xmlns:wpg="http://schemas.microsoft.com/office/word/2010/wordprocessingGroup" xmlns:wpi="http://schemas.microsoft.com/office/word/2010/wordprocessingInk" xmlns:wne="http://schemas.microsoft.com/office/word/2006/wordml" xmlns:wps="http://schemas.microsoft.com/office/word/2010/wordprocessingShape" mc:Ignorable="w14 w15 w16se w16cid w16 w16cex w16sdtdh w16sdtfl w16du wp14">
   <w:body>
     <w:p>
-      <w:r>
-        <w:rPr>
-          <w:highlight w:val="yellow"/>
-        </w:rPr>
-        <w:t>Next to-do’s</w:t>
-      </w:r>
-    </w:p>
-    <w:p>
-      <w:pPr>
-        <w:pStyle w:val="ListParagraph"/>
-        <w:numPr>
-          <w:ilvl w:val="0"/>
-          <w:numId w:val="6"/>
-        </w:numPr>
-      </w:pPr>
-      <w:r>
-        <w:t>Make home page an eligibility questionnaire</w:t>
-      </w:r>
-    </w:p>
-    <w:p>
-      <w:pPr>
-        <w:pStyle w:val="ListParagraph"/>
-        <w:numPr>
-          <w:ilvl w:val="1"/>
-          <w:numId w:val="6"/>
-        </w:numPr>
-      </w:pPr>
-      <w:r>
-        <w:t>Do you have a child younger than 5?</w:t>
-      </w:r>
-    </w:p>
-    <w:p>
-      <w:pPr>
-        <w:pStyle w:val="ListParagraph"/>
-        <w:numPr>
-          <w:ilvl w:val="1"/>
-          <w:numId w:val="6"/>
-        </w:numPr>
-      </w:pPr>
-      <w:r>
-        <w:t>Are you currently on a waitlist to secure a spot at a childcare facility or provider?</w:t>
-      </w:r>
-    </w:p>
-    <w:p>
-      <w:pPr>
-        <w:pStyle w:val="ListParagraph"/>
-        <w:numPr>
-          <w:ilvl w:val="1"/>
-          <w:numId w:val="6"/>
-        </w:numPr>
-      </w:pPr>
-      <w:r>
-        <w:t xml:space="preserve">Are you over 18? </w:t>
-      </w:r>
-    </w:p>
-    <w:p>
-      <w:pPr>
-        <w:pStyle w:val="ListParagraph"/>
-        <w:numPr>
-          <w:ilvl w:val="1"/>
-          <w:numId w:val="6"/>
-        </w:numPr>
-      </w:pPr>
-      <w:r>
-        <w:t>Do you speak English?</w:t>
-      </w:r>
-    </w:p>
-    <w:p>
-      <w:pPr>
-        <w:pStyle w:val="ListParagraph"/>
-        <w:numPr>
-          <w:ilvl w:val="1"/>
-          <w:numId w:val="6"/>
-        </w:numPr>
-      </w:pPr>
-      <w:r>
-        <w:t>Email and phone number?</w:t>
-      </w:r>
-    </w:p>
-    <w:p>
-      <w:pPr>
-        <w:pStyle w:val="ListParagraph"/>
-        <w:numPr>
-          <w:ilvl w:val="2"/>
-          <w:numId w:val="6"/>
-        </w:numPr>
-      </w:pPr>
-      <w:r>
-        <w:t xml:space="preserve">Talk to claude to see what’s the most IRB-compliant way to do this eligibility screener, waiver of consent and etc. </w:t>
-      </w:r>
-    </w:p>
-    <w:p>
-      <w:pPr>
-        <w:pStyle w:val="ListParagraph"/>
-        <w:numPr>
-          <w:ilvl w:val="0"/>
-          <w:numId w:val="6"/>
-        </w:numPr>
-      </w:pPr>
-      <w:r>
-        <w:t>Parent cognition</w:t>
-      </w:r>
-    </w:p>
-    <w:p>
-      <w:pPr>
-        <w:pStyle w:val="ListParagraph"/>
-        <w:numPr>
-          <w:ilvl w:val="0"/>
-          <w:numId w:val="6"/>
-        </w:numPr>
-      </w:pPr>
-      <w:r>
-        <w:t>Child cognition</w:t>
-      </w:r>
-    </w:p>
-    <w:p>
-      <w:pPr>
-        <w:pStyle w:val="ListParagraph"/>
-        <w:numPr>
-          <w:ilvl w:val="0"/>
-          <w:numId w:val="6"/>
-        </w:numPr>
-      </w:pPr>
-      <w:r>
-        <w:t>Qualtrics adaptation</w:t>
-      </w:r>
-    </w:p>
-    <w:p>
-      <w:pPr>
-        <w:pStyle w:val="ListParagraph"/>
-        <w:numPr>
-          <w:ilvl w:val="0"/>
-          <w:numId w:val="6"/>
-        </w:numPr>
-      </w:pPr>
-      <w:r>
-        <w:t>Readme adaptation</w:t>
-      </w:r>
-    </w:p>
-    <w:p>
-      <w:pPr>
-        <w:pStyle w:val="ListParagraph"/>
-        <w:numPr>
-          <w:ilvl w:val="0"/>
-          <w:numId w:val="6"/>
-        </w:numPr>
-      </w:pPr>
-      <w:r>
-        <w:t>Firebase integration</w:t>
-      </w:r>
-    </w:p>
-    <w:p>
-      <w:pPr>
-        <w:pStyle w:val="ListParagraph"/>
-        <w:numPr>
-          <w:ilvl w:val="0"/>
-          <w:numId w:val="6"/>
-        </w:numPr>
-      </w:pPr>
-      <w:r>
-        <w:t>Start making IRB materials</w:t>
-      </w:r>
-    </w:p>
-    <w:p>
       <w:pPr>
         <w:rPr>
           <w:b/>
@@ -180,7 +16,7 @@
           <w:bCs/>
           <w:highlight w:val="yellow"/>
         </w:rPr>
-        <w:t>3/23/2026</w:t>
+        <w:t>Standing to-do’s</w:t>
       </w:r>
     </w:p>
     <w:p>
@@ -188,29 +24,90 @@
         <w:pStyle w:val="ListParagraph"/>
         <w:numPr>
           <w:ilvl w:val="0"/>
-          <w:numId w:val="5"/>
-        </w:numPr>
-        <w:rPr>
-          <w:strike/>
-        </w:rPr>
-      </w:pPr>
-      <w:r>
-        <w:rPr>
-          <w:strike/>
-        </w:rPr>
-        <w:t>Have the first caregiver in the providers tab be pre-loaded as myself in a neutral grey color</w:t>
-      </w:r>
+          <w:numId w:val="8"/>
+        </w:numPr>
+      </w:pPr>
+      <w:r>
+        <w:t>Qualtrics portability</w:t>
+      </w:r>
+    </w:p>
+    <w:p>
+      <w:pPr>
+        <w:pStyle w:val="ListParagraph"/>
+        <w:numPr>
+          <w:ilvl w:val="1"/>
+          <w:numId w:val="8"/>
+        </w:numPr>
+      </w:pPr>
+      <w:hyperlink r:id="rId5" w:history="1">
+        <w:r>
+          <w:rPr>
+            <w:rStyle w:val="Hyperlink"/>
+          </w:rPr>
+          <w:t>https://github.com/yrvelez/qualtrics-mcp-server</w:t>
+        </w:r>
+      </w:hyperlink>
+    </w:p>
+    <w:p>
+      <w:pPr>
+        <w:pStyle w:val="ListParagraph"/>
+        <w:numPr>
+          <w:ilvl w:val="1"/>
+          <w:numId w:val="8"/>
+        </w:numPr>
+      </w:pPr>
+      <w:hyperlink r:id="rId6" w:history="1">
+        <w:r>
+          <w:rPr>
+            <w:rStyle w:val="Hyperlink"/>
+          </w:rPr>
+          <w:t>https://lobehub.com/bg/skills/letitbk-claude-academic-setup-qualtrics-survey</w:t>
+        </w:r>
+      </w:hyperlink>
+    </w:p>
+    <w:p>
+      <w:pPr>
+        <w:pStyle w:val="ListParagraph"/>
+        <w:ind w:left="1440"/>
+      </w:pPr>
     </w:p>
     <w:p>
       <w:pPr>
         <w:pStyle w:val="ListParagraph"/>
         <w:numPr>
           <w:ilvl w:val="0"/>
-          <w:numId w:val="5"/>
-        </w:numPr>
-      </w:pPr>
-      <w:r>
-        <w:t>Figure out exact child questions</w:t>
+          <w:numId w:val="8"/>
+        </w:numPr>
+      </w:pPr>
+      <w:r>
+        <w:t>IRB</w:t>
+      </w:r>
+    </w:p>
+    <w:p>
+      <w:pPr>
+        <w:pStyle w:val="ListParagraph"/>
+        <w:numPr>
+          <w:ilvl w:val="1"/>
+          <w:numId w:val="8"/>
+        </w:numPr>
+      </w:pPr>
+      <w:r>
+        <w:t>Adjust consent and eligibility</w:t>
+      </w:r>
+    </w:p>
+    <w:p>
+      <w:pPr>
+        <w:pStyle w:val="ListParagraph"/>
+        <w:numPr>
+          <w:ilvl w:val="1"/>
+          <w:numId w:val="8"/>
+        </w:numPr>
+      </w:pPr>
+      <w:r>
+        <w:t xml:space="preserve">Create materials for </w:t>
+      </w:r>
+      <w:r>
+        <w:t>IRB protocol</w:t>
       </w:r>
     </w:p>
     <w:p>
@@ -218,17 +115,11 @@
         <w:pStyle w:val="ListParagraph"/>
         <w:numPr>
           <w:ilvl w:val="0"/>
-          <w:numId w:val="5"/>
-        </w:numPr>
-        <w:rPr>
-          <w:strike/>
-        </w:rPr>
-      </w:pPr>
-      <w:r>
-        <w:rPr>
-          <w:strike/>
-        </w:rPr>
-        <w:t>Figure out entry vs weekly</w:t>
+          <w:numId w:val="8"/>
+        </w:numPr>
+      </w:pPr>
+      <w:r>
+        <w:t>Video recording!!! Parent-child interaction</w:t>
       </w:r>
     </w:p>
     <w:p>
@@ -236,11 +127,11 @@
         <w:pStyle w:val="ListParagraph"/>
         <w:numPr>
           <w:ilvl w:val="0"/>
-          <w:numId w:val="5"/>
-        </w:numPr>
-      </w:pPr>
-      <w:r>
-        <w:t>Figure out qualtrics adaptation</w:t>
+          <w:numId w:val="8"/>
+        </w:numPr>
+      </w:pPr>
+      <w:r>
+        <w:t>Parent cognition</w:t>
       </w:r>
     </w:p>
     <w:p>
@@ -248,26 +139,21 @@
         <w:pStyle w:val="ListParagraph"/>
         <w:numPr>
           <w:ilvl w:val="0"/>
-          <w:numId w:val="5"/>
-        </w:numPr>
-        <w:rPr>
-          <w:strike/>
-        </w:rPr>
-      </w:pPr>
-      <w:r>
-        <w:rPr>
-          <w:strike/>
-        </w:rPr>
-        <w:t>Take out summaries in the end in all surveys, parcitipants should not view their summaries.</w:t>
-      </w:r>
-    </w:p>
-    <w:p>
-      <w:pPr>
-        <w:pStyle w:val="ListParagraph"/>
-        <w:numPr>
-          <w:ilvl w:val="0"/>
-          <w:numId w:val="5"/>
-        </w:numPr>
+          <w:numId w:val="8"/>
+        </w:numPr>
+      </w:pPr>
+      <w:r>
+        <w:t xml:space="preserve">Child </w:t>
+      </w:r>
+      <w:proofErr w:type="gramStart"/>
+      <w:r>
+        <w:t>cognition</w:t>
+      </w:r>
+      <w:proofErr w:type="gramEnd"/>
+    </w:p>
+    <w:p>
+      <w:pPr>
+        <w:pStyle w:val="ListParagraph"/>
       </w:pPr>
     </w:p>
     <w:p>
@@ -293,7 +179,7 @@
           <w:bCs/>
           <w:highlight w:val="yellow"/>
         </w:rPr>
-        <w:t>3/21/2026</w:t>
+        <w:t>04/01/2026</w:t>
       </w:r>
     </w:p>
     <w:p>
@@ -301,17 +187,77 @@
         <w:pStyle w:val="ListParagraph"/>
         <w:numPr>
           <w:ilvl w:val="0"/>
-          <w:numId w:val="5"/>
-        </w:numPr>
-        <w:rPr>
-          <w:strike/>
-        </w:rPr>
-      </w:pPr>
-      <w:r>
-        <w:rPr>
-          <w:strike/>
-        </w:rPr>
-        <w:t>Change name to caremometer</w:t>
+          <w:numId w:val="7"/>
+        </w:numPr>
+        <w:rPr>
+          <w:strike/>
+        </w:rPr>
+      </w:pPr>
+      <w:r>
+        <w:rPr>
+          <w:strike/>
+        </w:rPr>
+        <w:t>In step 5</w:t>
+      </w:r>
+      <w:r>
+        <w:rPr>
+          <w:strike/>
+        </w:rPr>
+        <w:t xml:space="preserve"> of entry survey</w:t>
+      </w:r>
+      <w:r>
+        <w:rPr>
+          <w:strike/>
+        </w:rPr>
+        <w:t xml:space="preserve">, </w:t>
+      </w:r>
+      <w:r>
+        <w:rPr>
+          <w:strike/>
+        </w:rPr>
+        <w:t xml:space="preserve">there is a bug when answering questions about the </w:t>
+      </w:r>
+      <w:proofErr w:type="gramStart"/>
+      <w:r>
+        <w:rPr>
+          <w:strike/>
+        </w:rPr>
+        <w:t>created arrangements</w:t>
+      </w:r>
+      <w:proofErr w:type="gramEnd"/>
+      <w:r>
+        <w:rPr>
+          <w:strike/>
+        </w:rPr>
+        <w:t xml:space="preserve">. I </w:t>
+      </w:r>
+      <w:proofErr w:type="gramStart"/>
+      <w:r>
+        <w:rPr>
+          <w:strike/>
+        </w:rPr>
+        <w:t>select</w:t>
+      </w:r>
+      <w:proofErr w:type="gramEnd"/>
+      <w:r>
+        <w:rPr>
+          <w:strike/>
+        </w:rPr>
+        <w:t xml:space="preserve">, and the button does not turn blue automatically. Then when I answer the next question, the previous button turns blue. Just </w:t>
+      </w:r>
+      <w:proofErr w:type="gramStart"/>
+      <w:r>
+        <w:rPr>
+          <w:strike/>
+        </w:rPr>
+        <w:t>take a look</w:t>
+      </w:r>
+      <w:proofErr w:type="gramEnd"/>
+      <w:r>
+        <w:rPr>
+          <w:strike/>
+        </w:rPr>
+        <w:t xml:space="preserve"> into this and fix any bugs related to step 5. </w:t>
       </w:r>
     </w:p>
     <w:p>
@@ -319,11 +265,43 @@
         <w:pStyle w:val="ListParagraph"/>
         <w:numPr>
           <w:ilvl w:val="0"/>
-          <w:numId w:val="5"/>
-        </w:numPr>
-      </w:pPr>
-      <w:r>
-        <w:t>Have the first caregiver in the providers tab be pre-loaded as myself in a neutral grey color</w:t>
+          <w:numId w:val="7"/>
+        </w:numPr>
+        <w:rPr>
+          <w:strike/>
+        </w:rPr>
+      </w:pPr>
+      <w:r>
+        <w:rPr>
+          <w:strike/>
+        </w:rPr>
+        <w:t>For step 6</w:t>
+      </w:r>
+      <w:r>
+        <w:rPr>
+          <w:strike/>
+        </w:rPr>
+        <w:t xml:space="preserve"> of entry survey</w:t>
+      </w:r>
+      <w:r>
+        <w:rPr>
+          <w:strike/>
+        </w:rPr>
+        <w:t xml:space="preserve">, transform all 4 items into </w:t>
+      </w:r>
+      <w:proofErr w:type="spellStart"/>
+      <w:r>
+        <w:rPr>
+          <w:strike/>
+        </w:rPr>
+        <w:t>likert</w:t>
+      </w:r>
+      <w:proofErr w:type="spellEnd"/>
+      <w:r>
+        <w:rPr>
+          <w:strike/>
+        </w:rPr>
+        <w:t xml:space="preserve"> scales that go from 1 to 5. </w:t>
       </w:r>
     </w:p>
     <w:p>
@@ -331,11 +309,17 @@
         <w:pStyle w:val="ListParagraph"/>
         <w:numPr>
           <w:ilvl w:val="0"/>
-          <w:numId w:val="5"/>
-        </w:numPr>
-      </w:pPr>
-      <w:r>
-        <w:t>Figure out exact child questions</w:t>
+          <w:numId w:val="7"/>
+        </w:numPr>
+        <w:rPr>
+          <w:strike/>
+        </w:rPr>
+      </w:pPr>
+      <w:r>
+        <w:rPr>
+          <w:strike/>
+        </w:rPr>
+        <w:t xml:space="preserve">For step 2 of weekly check in, only show question about cause of exit of waitlist if they answer yes to the previous question. </w:t>
       </w:r>
     </w:p>
     <w:p>
@@ -343,17 +327,176 @@
         <w:pStyle w:val="ListParagraph"/>
         <w:numPr>
           <w:ilvl w:val="0"/>
-          <w:numId w:val="5"/>
-        </w:numPr>
-        <w:rPr>
-          <w:strike/>
-        </w:rPr>
-      </w:pPr>
-      <w:r>
-        <w:rPr>
-          <w:strike/>
-        </w:rPr>
-        <w:t>Including entry question about relationship to child (i.e., biological mother, etc)</w:t>
+          <w:numId w:val="7"/>
+        </w:numPr>
+        <w:rPr>
+          <w:strike/>
+        </w:rPr>
+      </w:pPr>
+      <w:r>
+        <w:rPr>
+          <w:strike/>
+        </w:rPr>
+        <w:t>Make home page an eligibility questionnaire</w:t>
+      </w:r>
+    </w:p>
+    <w:p>
+      <w:pPr>
+        <w:pStyle w:val="ListParagraph"/>
+        <w:numPr>
+          <w:ilvl w:val="1"/>
+          <w:numId w:val="7"/>
+        </w:numPr>
+        <w:rPr>
+          <w:strike/>
+        </w:rPr>
+      </w:pPr>
+      <w:r>
+        <w:rPr>
+          <w:strike/>
+        </w:rPr>
+        <w:t>Do you have a child younger than 5?</w:t>
+      </w:r>
+    </w:p>
+    <w:p>
+      <w:pPr>
+        <w:pStyle w:val="ListParagraph"/>
+        <w:numPr>
+          <w:ilvl w:val="1"/>
+          <w:numId w:val="7"/>
+        </w:numPr>
+        <w:rPr>
+          <w:strike/>
+        </w:rPr>
+      </w:pPr>
+      <w:r>
+        <w:rPr>
+          <w:strike/>
+        </w:rPr>
+        <w:t>Are you currently on a waitlist to secure a spot at a childcare facility or provider?</w:t>
+      </w:r>
+    </w:p>
+    <w:p>
+      <w:pPr>
+        <w:pStyle w:val="ListParagraph"/>
+        <w:numPr>
+          <w:ilvl w:val="1"/>
+          <w:numId w:val="7"/>
+        </w:numPr>
+        <w:rPr>
+          <w:strike/>
+        </w:rPr>
+      </w:pPr>
+      <w:r>
+        <w:rPr>
+          <w:strike/>
+        </w:rPr>
+        <w:t xml:space="preserve">Are you over 18? </w:t>
+      </w:r>
+    </w:p>
+    <w:p>
+      <w:pPr>
+        <w:pStyle w:val="ListParagraph"/>
+        <w:numPr>
+          <w:ilvl w:val="1"/>
+          <w:numId w:val="7"/>
+        </w:numPr>
+        <w:rPr>
+          <w:strike/>
+        </w:rPr>
+      </w:pPr>
+      <w:r>
+        <w:rPr>
+          <w:strike/>
+        </w:rPr>
+        <w:t>Do you speak English?</w:t>
+      </w:r>
+    </w:p>
+    <w:p>
+      <w:pPr>
+        <w:pStyle w:val="ListParagraph"/>
+        <w:numPr>
+          <w:ilvl w:val="1"/>
+          <w:numId w:val="7"/>
+        </w:numPr>
+        <w:rPr>
+          <w:strike/>
+        </w:rPr>
+      </w:pPr>
+      <w:r>
+        <w:rPr>
+          <w:strike/>
+        </w:rPr>
+        <w:t xml:space="preserve">Email and </w:t>
+      </w:r>
+      <w:proofErr w:type="gramStart"/>
+      <w:r>
+        <w:rPr>
+          <w:strike/>
+        </w:rPr>
+        <w:t>phone number?</w:t>
+      </w:r>
+      <w:proofErr w:type="gramEnd"/>
+    </w:p>
+    <w:p>
+      <w:pPr>
+        <w:pStyle w:val="ListParagraph"/>
+        <w:numPr>
+          <w:ilvl w:val="2"/>
+          <w:numId w:val="7"/>
+        </w:numPr>
+        <w:rPr>
+          <w:strike/>
+        </w:rPr>
+      </w:pPr>
+      <w:r>
+        <w:rPr>
+          <w:strike/>
+        </w:rPr>
+        <w:t xml:space="preserve">Talk to </w:t>
+      </w:r>
+      <w:proofErr w:type="spellStart"/>
+      <w:r>
+        <w:rPr>
+          <w:strike/>
+        </w:rPr>
+        <w:t>claude</w:t>
+      </w:r>
+      <w:proofErr w:type="spellEnd"/>
+      <w:r>
+        <w:rPr>
+          <w:strike/>
+        </w:rPr>
+        <w:t xml:space="preserve"> to see what’s the most IRB-compliant way to do this eligibility screener, waiver of consent </w:t>
+      </w:r>
+      <w:proofErr w:type="gramStart"/>
+      <w:r>
+        <w:rPr>
+          <w:strike/>
+        </w:rPr>
+        <w:t>and etc.</w:t>
+      </w:r>
+      <w:proofErr w:type="gramEnd"/>
+      <w:r>
+        <w:rPr>
+          <w:strike/>
+        </w:rPr>
+        <w:t xml:space="preserve"> </w:t>
+      </w:r>
+    </w:p>
+    <w:p>
+      <w:pPr>
+        <w:rPr>
+          <w:highlight w:val="yellow"/>
+        </w:rPr>
+      </w:pPr>
+    </w:p>
+    <w:p>
+      <w:r>
+        <w:rPr>
+          <w:highlight w:val="yellow"/>
+        </w:rPr>
+        <w:t>Next to-do’s</w:t>
       </w:r>
     </w:p>
     <w:p>
@@ -361,17 +504,17 @@
         <w:pStyle w:val="ListParagraph"/>
         <w:numPr>
           <w:ilvl w:val="0"/>
-          <w:numId w:val="5"/>
-        </w:numPr>
-        <w:rPr>
-          <w:strike/>
-        </w:rPr>
-      </w:pPr>
-      <w:r>
-        <w:rPr>
-          <w:strike/>
-        </w:rPr>
-        <w:t>Figure out Stanford Server</w:t>
+          <w:numId w:val="6"/>
+        </w:numPr>
+        <w:rPr>
+          <w:strike/>
+        </w:rPr>
+      </w:pPr>
+      <w:r>
+        <w:rPr>
+          <w:strike/>
+        </w:rPr>
+        <w:t>Readme adaptation</w:t>
       </w:r>
     </w:p>
     <w:p>
@@ -379,31 +522,7 @@
         <w:pStyle w:val="ListParagraph"/>
         <w:numPr>
           <w:ilvl w:val="0"/>
-          <w:numId w:val="5"/>
-        </w:numPr>
-      </w:pPr>
-      <w:r>
-        <w:t>Figure out entry vs weekly</w:t>
-      </w:r>
-    </w:p>
-    <w:p>
-      <w:pPr>
-        <w:pStyle w:val="ListParagraph"/>
-        <w:numPr>
-          <w:ilvl w:val="0"/>
-          <w:numId w:val="5"/>
-        </w:numPr>
-      </w:pPr>
-      <w:r>
-        <w:t>Figure out qualtrics adaptation</w:t>
-      </w:r>
-    </w:p>
-    <w:p>
-      <w:pPr>
-        <w:pStyle w:val="ListParagraph"/>
-        <w:numPr>
-          <w:ilvl w:val="0"/>
-          <w:numId w:val="5"/>
+          <w:numId w:val="6"/>
         </w:numPr>
         <w:rPr>
           <w:strike/>
@@ -414,43 +533,7 @@
           <w:strike/>
         </w:rPr>
         <w:lastRenderedPageBreak/>
-        <w:t>Figure out mobile browser version</w:t>
-      </w:r>
-    </w:p>
-    <w:p>
-      <w:pPr>
-        <w:pStyle w:val="ListParagraph"/>
-        <w:numPr>
-          <w:ilvl w:val="0"/>
-          <w:numId w:val="5"/>
-        </w:numPr>
-        <w:rPr>
-          <w:strike/>
-        </w:rPr>
-      </w:pPr>
-      <w:r>
-        <w:rPr>
-          <w:strike/>
-        </w:rPr>
-        <w:t>Check on the items below</w:t>
-      </w:r>
-    </w:p>
-    <w:p>
-      <w:pPr>
-        <w:pStyle w:val="ListParagraph"/>
-        <w:numPr>
-          <w:ilvl w:val="0"/>
-          <w:numId w:val="5"/>
-        </w:numPr>
-        <w:rPr>
-          <w:strike/>
-        </w:rPr>
-      </w:pPr>
-      <w:r>
-        <w:rPr>
-          <w:strike/>
-        </w:rPr>
-        <w:t>Adjust child age</w:t>
+        <w:t>Firebase integration</w:t>
       </w:r>
     </w:p>
     <w:p>
@@ -467,7 +550,7 @@
           <w:bCs/>
           <w:highlight w:val="yellow"/>
         </w:rPr>
-        <w:t>3/18/2026</w:t>
+        <w:t>3/23/2026</w:t>
       </w:r>
     </w:p>
     <w:p>
@@ -475,17 +558,17 @@
         <w:pStyle w:val="ListParagraph"/>
         <w:numPr>
           <w:ilvl w:val="0"/>
-          <w:numId w:val="4"/>
-        </w:numPr>
-        <w:rPr>
-          <w:strike/>
-        </w:rPr>
-      </w:pPr>
-      <w:r>
-        <w:rPr>
-          <w:strike/>
-        </w:rPr>
-        <w:t>2 Provider</w:t>
+          <w:numId w:val="5"/>
+        </w:numPr>
+        <w:rPr>
+          <w:strike/>
+        </w:rPr>
+      </w:pPr>
+      <w:r>
+        <w:rPr>
+          <w:strike/>
+        </w:rPr>
+        <w:t>Have the first caregiver in the providers tab be pre-loaded as myself in a neutral grey color</w:t>
       </w:r>
     </w:p>
     <w:p>
@@ -493,35 +576,11 @@
         <w:pStyle w:val="ListParagraph"/>
         <w:numPr>
           <w:ilvl w:val="0"/>
-          <w:numId w:val="4"/>
-        </w:numPr>
-        <w:rPr>
-          <w:strike/>
-        </w:rPr>
-      </w:pPr>
-      <w:r>
-        <w:rPr>
-          <w:strike/>
-        </w:rPr>
-        <w:t>3 affordability</w:t>
-      </w:r>
-    </w:p>
-    <w:p>
-      <w:pPr>
-        <w:pStyle w:val="ListParagraph"/>
-        <w:numPr>
-          <w:ilvl w:val="1"/>
-          <w:numId w:val="4"/>
-        </w:numPr>
-        <w:rPr>
-          <w:strike/>
-        </w:rPr>
-      </w:pPr>
-      <w:r>
-        <w:rPr>
-          <w:strike/>
-        </w:rPr>
-        <w:t>Have them put the percentage open. Include instruction: if you don’t know exactly, you can put an approximation</w:t>
+          <w:numId w:val="5"/>
+        </w:numPr>
+      </w:pPr>
+      <w:r>
+        <w:t>Figure out exact child questions</w:t>
       </w:r>
     </w:p>
     <w:p>
@@ -529,65 +588,17 @@
         <w:pStyle w:val="ListParagraph"/>
         <w:numPr>
           <w:ilvl w:val="0"/>
-          <w:numId w:val="4"/>
-        </w:numPr>
-      </w:pPr>
-      <w:r>
-        <w:t>4 effort</w:t>
-      </w:r>
-    </w:p>
-    <w:p>
-      <w:pPr>
-        <w:pStyle w:val="ListParagraph"/>
-        <w:numPr>
-          <w:ilvl w:val="1"/>
-          <w:numId w:val="4"/>
-        </w:numPr>
-        <w:rPr>
-          <w:strike/>
-        </w:rPr>
-      </w:pPr>
-      <w:r>
-        <w:rPr>
-          <w:strike/>
-        </w:rPr>
-        <w:t>Have them put minutes openly instead of choosing</w:t>
-      </w:r>
-    </w:p>
-    <w:p>
-      <w:pPr>
-        <w:pStyle w:val="ListParagraph"/>
-        <w:numPr>
-          <w:ilvl w:val="1"/>
-          <w:numId w:val="4"/>
-        </w:numPr>
-        <w:rPr>
-          <w:strike/>
-        </w:rPr>
-      </w:pPr>
-      <w:r>
-        <w:rPr>
-          <w:strike/>
-        </w:rPr>
-        <w:t xml:space="preserve">Last question “how difficult” </w:t>
-      </w:r>
-      <w:r>
-        <w:rPr>
-          <w:strike/>
-        </w:rPr>
-        <w:t>-&gt; do not have not applicable as 0</w:t>
-      </w:r>
-    </w:p>
-    <w:p>
-      <w:pPr>
-        <w:pStyle w:val="ListParagraph"/>
-        <w:numPr>
-          <w:ilvl w:val="1"/>
-          <w:numId w:val="4"/>
-        </w:numPr>
-      </w:pPr>
-      <w:r>
-        <w:t>For every question, include a side-option as “Don’t’know/Not applicable”</w:t>
+          <w:numId w:val="5"/>
+        </w:numPr>
+        <w:rPr>
+          <w:strike/>
+        </w:rPr>
+      </w:pPr>
+      <w:r>
+        <w:rPr>
+          <w:strike/>
+        </w:rPr>
+        <w:t>Figure out entry vs weekly</w:t>
       </w:r>
     </w:p>
     <w:p>
@@ -595,35 +606,19 @@
         <w:pStyle w:val="ListParagraph"/>
         <w:numPr>
           <w:ilvl w:val="0"/>
-          <w:numId w:val="4"/>
-        </w:numPr>
-      </w:pPr>
-      <w:r>
-        <w:t>5 child dev</w:t>
-      </w:r>
-    </w:p>
-    <w:p>
-      <w:pPr>
-        <w:pStyle w:val="ListParagraph"/>
-        <w:numPr>
-          <w:ilvl w:val="1"/>
-          <w:numId w:val="4"/>
-        </w:numPr>
-      </w:pPr>
-      <w:r>
-        <w:t xml:space="preserve">Not allowing me to click </w:t>
-      </w:r>
-      <w:r>
-        <w:t>any of the multiple choice</w:t>
-      </w:r>
-      <w:r>
-        <w:t xml:space="preserve"> question</w:t>
-      </w:r>
-      <w:r>
-        <w:t>s in this section</w:t>
-      </w:r>
-      <w:r>
-        <w:t xml:space="preserve">. There might be something wrong with the questions settings here. </w:t>
+          <w:numId w:val="5"/>
+        </w:numPr>
+      </w:pPr>
+      <w:r>
+        <w:t xml:space="preserve">Figure out </w:t>
+      </w:r>
+      <w:proofErr w:type="spellStart"/>
+      <w:r>
+        <w:t>qualtrics</w:t>
+      </w:r>
+      <w:proofErr w:type="spellEnd"/>
+      <w:r>
+        <w:t xml:space="preserve"> adaptation</w:t>
       </w:r>
     </w:p>
     <w:p>
@@ -631,35 +626,31 @@
         <w:pStyle w:val="ListParagraph"/>
         <w:numPr>
           <w:ilvl w:val="0"/>
-          <w:numId w:val="4"/>
-        </w:numPr>
-        <w:rPr>
-          <w:strike/>
-        </w:rPr>
-      </w:pPr>
-      <w:r>
-        <w:rPr>
-          <w:strike/>
-        </w:rPr>
-        <w:t>11 review and submit:</w:t>
-      </w:r>
-    </w:p>
-    <w:p>
-      <w:pPr>
-        <w:pStyle w:val="ListParagraph"/>
-        <w:numPr>
-          <w:ilvl w:val="1"/>
-          <w:numId w:val="4"/>
-        </w:numPr>
-        <w:rPr>
-          <w:strike/>
-        </w:rPr>
-      </w:pPr>
-      <w:r>
-        <w:rPr>
-          <w:strike/>
-        </w:rPr>
-        <w:t>Do not show summary like that, leave it open for now</w:t>
+          <w:numId w:val="5"/>
+        </w:numPr>
+        <w:rPr>
+          <w:strike/>
+        </w:rPr>
+      </w:pPr>
+      <w:r>
+        <w:rPr>
+          <w:strike/>
+        </w:rPr>
+        <w:t xml:space="preserve">Take out summaries in the end in all surveys, </w:t>
+      </w:r>
+      <w:proofErr w:type="spellStart"/>
+      <w:r>
+        <w:rPr>
+          <w:strike/>
+        </w:rPr>
+        <w:t>parcitipants</w:t>
+      </w:r>
+      <w:proofErr w:type="spellEnd"/>
+      <w:r>
+        <w:rPr>
+          <w:strike/>
+        </w:rPr>
+        <w:t xml:space="preserve"> should not view their summaries.</w:t>
       </w:r>
     </w:p>
     <w:p>
@@ -667,192 +658,9 @@
         <w:pStyle w:val="ListParagraph"/>
         <w:numPr>
           <w:ilvl w:val="0"/>
-          <w:numId w:val="4"/>
-        </w:numPr>
-      </w:pPr>
-      <w:r>
-        <w:t>Weekly check in</w:t>
-      </w:r>
-    </w:p>
-    <w:p>
-      <w:pPr>
-        <w:pStyle w:val="ListParagraph"/>
-        <w:numPr>
-          <w:ilvl w:val="1"/>
-          <w:numId w:val="4"/>
-        </w:numPr>
-        <w:rPr>
-          <w:strike/>
-        </w:rPr>
-      </w:pPr>
-      <w:r>
-        <w:rPr>
-          <w:strike/>
-        </w:rPr>
-        <w:t>Exclude new waitlist question</w:t>
-      </w:r>
-    </w:p>
-    <w:p>
-      <w:pPr>
-        <w:pStyle w:val="ListParagraph"/>
-        <w:numPr>
-          <w:ilvl w:val="1"/>
-          <w:numId w:val="4"/>
-        </w:numPr>
-        <w:rPr>
-          <w:strike/>
-        </w:rPr>
-      </w:pPr>
-      <w:r>
-        <w:rPr>
-          <w:strike/>
-        </w:rPr>
-        <w:t xml:space="preserve">For “removed from waitlist question”. Phrase it differently like “did you get off of any waitlists, as in, got a spot in a </w:t>
-      </w:r>
-      <w:r>
-        <w:rPr>
-          <w:strike/>
-        </w:rPr>
-        <w:t xml:space="preserve">new childcare </w:t>
-      </w:r>
-      <w:r>
-        <w:rPr>
-          <w:strike/>
-        </w:rPr>
-        <w:t>option where you were previously on a waitlist</w:t>
-      </w:r>
-      <w:r>
-        <w:rPr>
-          <w:strike/>
-        </w:rPr>
-        <w:t>?</w:t>
-      </w:r>
-    </w:p>
-    <w:p>
-      <w:pPr>
-        <w:pStyle w:val="ListParagraph"/>
-        <w:numPr>
-          <w:ilvl w:val="2"/>
-          <w:numId w:val="4"/>
-        </w:numPr>
-        <w:rPr>
-          <w:strike/>
-        </w:rPr>
-      </w:pPr>
-      <w:r>
-        <w:rPr>
-          <w:strike/>
-        </w:rPr>
-        <w:t xml:space="preserve">If yes, </w:t>
-      </w:r>
-      <w:r>
-        <w:rPr>
-          <w:strike/>
-        </w:rPr>
-        <w:t xml:space="preserve">ask if any other potential “confounders” also changed and thus </w:t>
-      </w:r>
-      <w:r>
-        <w:rPr>
-          <w:strike/>
-        </w:rPr>
-        <w:t>led to getting of the waitlist like “got a new job”, “got a raise”</w:t>
-      </w:r>
-      <w:r>
-        <w:rPr>
-          <w:strike/>
-        </w:rPr>
-        <w:t>, “moved to a new home”, etc.</w:t>
-      </w:r>
-    </w:p>
-    <w:p>
-      <w:pPr>
-        <w:pStyle w:val="ListParagraph"/>
-        <w:numPr>
-          <w:ilvl w:val="1"/>
-          <w:numId w:val="4"/>
-        </w:numPr>
-        <w:rPr>
-          <w:strike/>
-        </w:rPr>
-      </w:pPr>
-      <w:r>
-        <w:rPr>
-          <w:strike/>
-        </w:rPr>
-        <w:t>Do not display review or computed metrics to participant</w:t>
-      </w:r>
-    </w:p>
-    <w:p>
-      <w:pPr>
-        <w:pStyle w:val="ListParagraph"/>
-        <w:numPr>
-          <w:ilvl w:val="0"/>
-          <w:numId w:val="4"/>
-        </w:numPr>
-        <w:rPr>
-          <w:strike/>
-        </w:rPr>
-      </w:pPr>
-      <w:r>
-        <w:rPr>
-          <w:strike/>
-        </w:rPr>
-        <w:t>Other edits:</w:t>
-      </w:r>
-    </w:p>
-    <w:p>
-      <w:pPr>
-        <w:pStyle w:val="ListParagraph"/>
-        <w:numPr>
-          <w:ilvl w:val="1"/>
-          <w:numId w:val="4"/>
-        </w:numPr>
-        <w:rPr>
-          <w:strike/>
-        </w:rPr>
-      </w:pPr>
-      <w:r>
-        <w:rPr>
-          <w:strike/>
-        </w:rPr>
-        <w:t xml:space="preserve">I edited the file structure, now there is not parent folder anymore, it is just the childcare-precarity-tool folder. </w:t>
-      </w:r>
-    </w:p>
-    <w:p>
-      <w:pPr>
-        <w:pStyle w:val="ListParagraph"/>
-        <w:numPr>
-          <w:ilvl w:val="1"/>
-          <w:numId w:val="4"/>
-        </w:numPr>
-        <w:rPr>
-          <w:strike/>
-        </w:rPr>
-      </w:pPr>
-      <w:r>
-        <w:rPr>
-          <w:strike/>
-        </w:rPr>
-        <w:t xml:space="preserve">I excluded some files and moved some to a folder called archive. Please have github ignore and not </w:t>
-      </w:r>
-      <w:r>
-        <w:rPr>
-          <w:strike/>
-        </w:rPr>
-        <w:t>synchronize this folder, I want it locally only</w:t>
-      </w:r>
-    </w:p>
-    <w:p>
-      <w:pPr>
-        <w:pStyle w:val="ListParagraph"/>
-        <w:numPr>
-          <w:ilvl w:val="1"/>
-          <w:numId w:val="4"/>
-        </w:numPr>
-      </w:pPr>
-      <w:r>
-        <w:br/>
-      </w:r>
+          <w:numId w:val="5"/>
+        </w:numPr>
+      </w:pPr>
     </w:p>
     <w:p>
       <w:pPr>
@@ -868,6 +676,7 @@
         <w:rPr>
           <w:b/>
           <w:bCs/>
+          <w:highlight w:val="yellow"/>
         </w:rPr>
       </w:pPr>
       <w:r>
@@ -876,6 +685,757 @@
           <w:bCs/>
           <w:highlight w:val="yellow"/>
         </w:rPr>
+        <w:t>3/21/2026</w:t>
+      </w:r>
+    </w:p>
+    <w:p>
+      <w:pPr>
+        <w:pStyle w:val="ListParagraph"/>
+        <w:numPr>
+          <w:ilvl w:val="0"/>
+          <w:numId w:val="5"/>
+        </w:numPr>
+        <w:rPr>
+          <w:strike/>
+        </w:rPr>
+      </w:pPr>
+      <w:r>
+        <w:rPr>
+          <w:strike/>
+        </w:rPr>
+        <w:t xml:space="preserve">Change name to </w:t>
+      </w:r>
+      <w:proofErr w:type="spellStart"/>
+      <w:r>
+        <w:rPr>
+          <w:strike/>
+        </w:rPr>
+        <w:t>caremometer</w:t>
+      </w:r>
+      <w:proofErr w:type="spellEnd"/>
+    </w:p>
+    <w:p>
+      <w:pPr>
+        <w:pStyle w:val="ListParagraph"/>
+        <w:numPr>
+          <w:ilvl w:val="0"/>
+          <w:numId w:val="5"/>
+        </w:numPr>
+      </w:pPr>
+      <w:r>
+        <w:t>Have the first caregiver in the providers tab be pre-loaded as myself in a neutral grey color</w:t>
+      </w:r>
+    </w:p>
+    <w:p>
+      <w:pPr>
+        <w:pStyle w:val="ListParagraph"/>
+        <w:numPr>
+          <w:ilvl w:val="0"/>
+          <w:numId w:val="5"/>
+        </w:numPr>
+      </w:pPr>
+      <w:r>
+        <w:t>Figure out exact child questions</w:t>
+      </w:r>
+    </w:p>
+    <w:p>
+      <w:pPr>
+        <w:pStyle w:val="ListParagraph"/>
+        <w:numPr>
+          <w:ilvl w:val="0"/>
+          <w:numId w:val="5"/>
+        </w:numPr>
+        <w:rPr>
+          <w:strike/>
+        </w:rPr>
+      </w:pPr>
+      <w:r>
+        <w:rPr>
+          <w:strike/>
+        </w:rPr>
+        <w:t xml:space="preserve">Including entry question about relationship </w:t>
+      </w:r>
+      <w:proofErr w:type="gramStart"/>
+      <w:r>
+        <w:rPr>
+          <w:strike/>
+        </w:rPr>
+        <w:t>to</w:t>
+      </w:r>
+      <w:proofErr w:type="gramEnd"/>
+      <w:r>
+        <w:rPr>
+          <w:strike/>
+        </w:rPr>
+        <w:t xml:space="preserve"> child (i.e., biological mother, </w:t>
+      </w:r>
+      <w:proofErr w:type="spellStart"/>
+      <w:r>
+        <w:rPr>
+          <w:strike/>
+        </w:rPr>
+        <w:t>etc</w:t>
+      </w:r>
+      <w:proofErr w:type="spellEnd"/>
+      <w:r>
+        <w:rPr>
+          <w:strike/>
+        </w:rPr>
+        <w:t>)</w:t>
+      </w:r>
+    </w:p>
+    <w:p>
+      <w:pPr>
+        <w:pStyle w:val="ListParagraph"/>
+        <w:numPr>
+          <w:ilvl w:val="0"/>
+          <w:numId w:val="5"/>
+        </w:numPr>
+        <w:rPr>
+          <w:strike/>
+        </w:rPr>
+      </w:pPr>
+      <w:r>
+        <w:rPr>
+          <w:strike/>
+        </w:rPr>
+        <w:t>Figure out Stanford Server</w:t>
+      </w:r>
+    </w:p>
+    <w:p>
+      <w:pPr>
+        <w:pStyle w:val="ListParagraph"/>
+        <w:numPr>
+          <w:ilvl w:val="0"/>
+          <w:numId w:val="5"/>
+        </w:numPr>
+      </w:pPr>
+      <w:r>
+        <w:t>Figure out entry vs weekly</w:t>
+      </w:r>
+    </w:p>
+    <w:p>
+      <w:pPr>
+        <w:pStyle w:val="ListParagraph"/>
+        <w:numPr>
+          <w:ilvl w:val="0"/>
+          <w:numId w:val="5"/>
+        </w:numPr>
+      </w:pPr>
+      <w:r>
+        <w:t xml:space="preserve">Figure out </w:t>
+      </w:r>
+      <w:proofErr w:type="spellStart"/>
+      <w:r>
+        <w:t>qualtrics</w:t>
+      </w:r>
+      <w:proofErr w:type="spellEnd"/>
+      <w:r>
+        <w:t xml:space="preserve"> adaptation</w:t>
+      </w:r>
+    </w:p>
+    <w:p>
+      <w:pPr>
+        <w:pStyle w:val="ListParagraph"/>
+        <w:numPr>
+          <w:ilvl w:val="0"/>
+          <w:numId w:val="5"/>
+        </w:numPr>
+        <w:rPr>
+          <w:strike/>
+        </w:rPr>
+      </w:pPr>
+      <w:r>
+        <w:rPr>
+          <w:strike/>
+        </w:rPr>
+        <w:t>Figure out mobile browser version</w:t>
+      </w:r>
+    </w:p>
+    <w:p>
+      <w:pPr>
+        <w:pStyle w:val="ListParagraph"/>
+        <w:numPr>
+          <w:ilvl w:val="0"/>
+          <w:numId w:val="5"/>
+        </w:numPr>
+        <w:rPr>
+          <w:strike/>
+        </w:rPr>
+      </w:pPr>
+      <w:proofErr w:type="gramStart"/>
+      <w:r>
+        <w:rPr>
+          <w:strike/>
+        </w:rPr>
+        <w:t>Check on</w:t>
+      </w:r>
+      <w:proofErr w:type="gramEnd"/>
+      <w:r>
+        <w:rPr>
+          <w:strike/>
+        </w:rPr>
+        <w:t xml:space="preserve"> the items below</w:t>
+      </w:r>
+    </w:p>
+    <w:p>
+      <w:pPr>
+        <w:pStyle w:val="ListParagraph"/>
+        <w:numPr>
+          <w:ilvl w:val="0"/>
+          <w:numId w:val="5"/>
+        </w:numPr>
+        <w:rPr>
+          <w:strike/>
+        </w:rPr>
+      </w:pPr>
+      <w:r>
+        <w:rPr>
+          <w:strike/>
+        </w:rPr>
+        <w:t>Adjust child age</w:t>
+      </w:r>
+    </w:p>
+    <w:p>
+      <w:pPr>
+        <w:rPr>
+          <w:b/>
+          <w:bCs/>
+          <w:highlight w:val="yellow"/>
+        </w:rPr>
+      </w:pPr>
+      <w:r>
+        <w:rPr>
+          <w:b/>
+          <w:bCs/>
+          <w:highlight w:val="yellow"/>
+        </w:rPr>
+        <w:t>3/18/2026</w:t>
+      </w:r>
+    </w:p>
+    <w:p>
+      <w:pPr>
+        <w:pStyle w:val="ListParagraph"/>
+        <w:numPr>
+          <w:ilvl w:val="0"/>
+          <w:numId w:val="4"/>
+        </w:numPr>
+        <w:rPr>
+          <w:strike/>
+        </w:rPr>
+      </w:pPr>
+      <w:r>
+        <w:rPr>
+          <w:strike/>
+        </w:rPr>
+        <w:t>2 Provider</w:t>
+      </w:r>
+    </w:p>
+    <w:p>
+      <w:pPr>
+        <w:pStyle w:val="ListParagraph"/>
+        <w:numPr>
+          <w:ilvl w:val="0"/>
+          <w:numId w:val="4"/>
+        </w:numPr>
+        <w:rPr>
+          <w:strike/>
+        </w:rPr>
+      </w:pPr>
+      <w:r>
+        <w:rPr>
+          <w:strike/>
+        </w:rPr>
+        <w:t>3 affordability</w:t>
+      </w:r>
+    </w:p>
+    <w:p>
+      <w:pPr>
+        <w:pStyle w:val="ListParagraph"/>
+        <w:numPr>
+          <w:ilvl w:val="1"/>
+          <w:numId w:val="4"/>
+        </w:numPr>
+        <w:rPr>
+          <w:strike/>
+        </w:rPr>
+      </w:pPr>
+      <w:r>
+        <w:rPr>
+          <w:strike/>
+        </w:rPr>
+        <w:t xml:space="preserve">Have </w:t>
+      </w:r>
+      <w:proofErr w:type="gramStart"/>
+      <w:r>
+        <w:rPr>
+          <w:strike/>
+        </w:rPr>
+        <w:t>them</w:t>
+      </w:r>
+      <w:proofErr w:type="gramEnd"/>
+      <w:r>
+        <w:rPr>
+          <w:strike/>
+        </w:rPr>
+        <w:t xml:space="preserve"> put the percentage open. Include instruction: if you don’t know exactly, you can put an approximation</w:t>
+      </w:r>
+    </w:p>
+    <w:p>
+      <w:pPr>
+        <w:pStyle w:val="ListParagraph"/>
+        <w:numPr>
+          <w:ilvl w:val="0"/>
+          <w:numId w:val="4"/>
+        </w:numPr>
+      </w:pPr>
+      <w:r>
+        <w:t xml:space="preserve">4 </w:t>
+      </w:r>
+      <w:proofErr w:type="gramStart"/>
+      <w:r>
+        <w:t>effort</w:t>
+      </w:r>
+      <w:proofErr w:type="gramEnd"/>
+    </w:p>
+    <w:p>
+      <w:pPr>
+        <w:pStyle w:val="ListParagraph"/>
+        <w:numPr>
+          <w:ilvl w:val="1"/>
+          <w:numId w:val="4"/>
+        </w:numPr>
+        <w:rPr>
+          <w:strike/>
+        </w:rPr>
+      </w:pPr>
+      <w:r>
+        <w:rPr>
+          <w:strike/>
+        </w:rPr>
+        <w:t>Have them put minutes openly instead of choosing</w:t>
+      </w:r>
+    </w:p>
+    <w:p>
+      <w:pPr>
+        <w:pStyle w:val="ListParagraph"/>
+        <w:numPr>
+          <w:ilvl w:val="1"/>
+          <w:numId w:val="4"/>
+        </w:numPr>
+        <w:rPr>
+          <w:strike/>
+        </w:rPr>
+      </w:pPr>
+      <w:r>
+        <w:rPr>
+          <w:strike/>
+        </w:rPr>
+        <w:t xml:space="preserve">Last question “how difficult” </w:t>
+      </w:r>
+      <w:r>
+        <w:rPr>
+          <w:strike/>
+        </w:rPr>
+        <w:t xml:space="preserve">-&gt; do not </w:t>
+      </w:r>
+      <w:proofErr w:type="gramStart"/>
+      <w:r>
+        <w:rPr>
+          <w:strike/>
+        </w:rPr>
+        <w:t>have not</w:t>
+      </w:r>
+      <w:proofErr w:type="gramEnd"/>
+      <w:r>
+        <w:rPr>
+          <w:strike/>
+        </w:rPr>
+        <w:t xml:space="preserve"> applicable as 0</w:t>
+      </w:r>
+    </w:p>
+    <w:p>
+      <w:pPr>
+        <w:pStyle w:val="ListParagraph"/>
+        <w:numPr>
+          <w:ilvl w:val="1"/>
+          <w:numId w:val="4"/>
+        </w:numPr>
+      </w:pPr>
+      <w:r>
+        <w:t>For every question, include a side-option as “</w:t>
+      </w:r>
+      <w:proofErr w:type="spellStart"/>
+      <w:r>
+        <w:t>Don’t’know</w:t>
+      </w:r>
+      <w:proofErr w:type="spellEnd"/>
+      <w:r>
+        <w:t>/Not applicable”</w:t>
+      </w:r>
+    </w:p>
+    <w:p>
+      <w:pPr>
+        <w:pStyle w:val="ListParagraph"/>
+        <w:numPr>
+          <w:ilvl w:val="0"/>
+          <w:numId w:val="4"/>
+        </w:numPr>
+      </w:pPr>
+      <w:r>
+        <w:t>5 child dev</w:t>
+      </w:r>
+    </w:p>
+    <w:p>
+      <w:pPr>
+        <w:pStyle w:val="ListParagraph"/>
+        <w:numPr>
+          <w:ilvl w:val="1"/>
+          <w:numId w:val="4"/>
+        </w:numPr>
+      </w:pPr>
+      <w:r>
+        <w:lastRenderedPageBreak/>
+        <w:t xml:space="preserve">Not allowing me to click </w:t>
+      </w:r>
+      <w:r>
+        <w:t xml:space="preserve">any of the </w:t>
+      </w:r>
+      <w:proofErr w:type="gramStart"/>
+      <w:r>
+        <w:t>multiple choice</w:t>
+      </w:r>
+      <w:proofErr w:type="gramEnd"/>
+      <w:r>
+        <w:t xml:space="preserve"> question</w:t>
+      </w:r>
+      <w:r>
+        <w:t>s in this section</w:t>
+      </w:r>
+      <w:r>
+        <w:t xml:space="preserve">. There might be something wrong with the questions settings here. </w:t>
+      </w:r>
+    </w:p>
+    <w:p>
+      <w:pPr>
+        <w:pStyle w:val="ListParagraph"/>
+        <w:numPr>
+          <w:ilvl w:val="0"/>
+          <w:numId w:val="4"/>
+        </w:numPr>
+        <w:rPr>
+          <w:strike/>
+        </w:rPr>
+      </w:pPr>
+      <w:r>
+        <w:rPr>
+          <w:strike/>
+        </w:rPr>
+        <w:t xml:space="preserve">11 </w:t>
+      </w:r>
+      <w:proofErr w:type="gramStart"/>
+      <w:r>
+        <w:rPr>
+          <w:strike/>
+        </w:rPr>
+        <w:t>review</w:t>
+      </w:r>
+      <w:proofErr w:type="gramEnd"/>
+      <w:r>
+        <w:rPr>
+          <w:strike/>
+        </w:rPr>
+        <w:t xml:space="preserve"> and </w:t>
+      </w:r>
+      <w:proofErr w:type="gramStart"/>
+      <w:r>
+        <w:rPr>
+          <w:strike/>
+        </w:rPr>
+        <w:t>submit</w:t>
+      </w:r>
+      <w:proofErr w:type="gramEnd"/>
+      <w:r>
+        <w:rPr>
+          <w:strike/>
+        </w:rPr>
+        <w:t>:</w:t>
+      </w:r>
+    </w:p>
+    <w:p>
+      <w:pPr>
+        <w:pStyle w:val="ListParagraph"/>
+        <w:numPr>
+          <w:ilvl w:val="1"/>
+          <w:numId w:val="4"/>
+        </w:numPr>
+        <w:rPr>
+          <w:strike/>
+        </w:rPr>
+      </w:pPr>
+      <w:r>
+        <w:rPr>
+          <w:strike/>
+        </w:rPr>
+        <w:t>Do not show summary like that, leave it open for now</w:t>
+      </w:r>
+    </w:p>
+    <w:p>
+      <w:pPr>
+        <w:pStyle w:val="ListParagraph"/>
+        <w:numPr>
+          <w:ilvl w:val="0"/>
+          <w:numId w:val="4"/>
+        </w:numPr>
+      </w:pPr>
+      <w:r>
+        <w:t>Weekly check in</w:t>
+      </w:r>
+    </w:p>
+    <w:p>
+      <w:pPr>
+        <w:pStyle w:val="ListParagraph"/>
+        <w:numPr>
+          <w:ilvl w:val="1"/>
+          <w:numId w:val="4"/>
+        </w:numPr>
+        <w:rPr>
+          <w:strike/>
+        </w:rPr>
+      </w:pPr>
+      <w:r>
+        <w:rPr>
+          <w:strike/>
+        </w:rPr>
+        <w:t>Exclude new waitlist question</w:t>
+      </w:r>
+    </w:p>
+    <w:p>
+      <w:pPr>
+        <w:pStyle w:val="ListParagraph"/>
+        <w:numPr>
+          <w:ilvl w:val="1"/>
+          <w:numId w:val="4"/>
+        </w:numPr>
+        <w:rPr>
+          <w:strike/>
+        </w:rPr>
+      </w:pPr>
+      <w:r>
+        <w:rPr>
+          <w:strike/>
+        </w:rPr>
+        <w:t xml:space="preserve">For “removed from waitlist question”. Phrase it differently like “did you get </w:t>
+      </w:r>
+      <w:proofErr w:type="gramStart"/>
+      <w:r>
+        <w:rPr>
+          <w:strike/>
+        </w:rPr>
+        <w:t>off of</w:t>
+      </w:r>
+      <w:proofErr w:type="gramEnd"/>
+      <w:r>
+        <w:rPr>
+          <w:strike/>
+        </w:rPr>
+        <w:t xml:space="preserve"> any waitlists, as in, got a spot in a </w:t>
+      </w:r>
+      <w:r>
+        <w:rPr>
+          <w:strike/>
+        </w:rPr>
+        <w:t xml:space="preserve">new childcare </w:t>
+      </w:r>
+      <w:r>
+        <w:rPr>
+          <w:strike/>
+        </w:rPr>
+        <w:t>option where you were previously on a waitlist</w:t>
+      </w:r>
+      <w:r>
+        <w:rPr>
+          <w:strike/>
+        </w:rPr>
+        <w:t>?</w:t>
+      </w:r>
+    </w:p>
+    <w:p>
+      <w:pPr>
+        <w:pStyle w:val="ListParagraph"/>
+        <w:numPr>
+          <w:ilvl w:val="2"/>
+          <w:numId w:val="4"/>
+        </w:numPr>
+        <w:rPr>
+          <w:strike/>
+        </w:rPr>
+      </w:pPr>
+      <w:r>
+        <w:rPr>
+          <w:strike/>
+        </w:rPr>
+        <w:t xml:space="preserve">If yes, </w:t>
+      </w:r>
+      <w:r>
+        <w:rPr>
+          <w:strike/>
+        </w:rPr>
+        <w:t xml:space="preserve">ask if any other potential “confounders” also changed and thus </w:t>
+      </w:r>
+      <w:r>
+        <w:rPr>
+          <w:strike/>
+        </w:rPr>
+        <w:t>led to getting of the waitlist like “got a new job”, “got a raise”</w:t>
+      </w:r>
+      <w:r>
+        <w:rPr>
+          <w:strike/>
+        </w:rPr>
+        <w:t>, “moved to a new home”, etc.</w:t>
+      </w:r>
+    </w:p>
+    <w:p>
+      <w:pPr>
+        <w:pStyle w:val="ListParagraph"/>
+        <w:numPr>
+          <w:ilvl w:val="1"/>
+          <w:numId w:val="4"/>
+        </w:numPr>
+        <w:rPr>
+          <w:strike/>
+        </w:rPr>
+      </w:pPr>
+      <w:r>
+        <w:rPr>
+          <w:strike/>
+        </w:rPr>
+        <w:t>Do not display review or computed metrics to participant</w:t>
+      </w:r>
+    </w:p>
+    <w:p>
+      <w:pPr>
+        <w:pStyle w:val="ListParagraph"/>
+        <w:numPr>
+          <w:ilvl w:val="0"/>
+          <w:numId w:val="4"/>
+        </w:numPr>
+        <w:rPr>
+          <w:strike/>
+        </w:rPr>
+      </w:pPr>
+      <w:r>
+        <w:rPr>
+          <w:strike/>
+        </w:rPr>
+        <w:t>Other edits:</w:t>
+      </w:r>
+    </w:p>
+    <w:p>
+      <w:pPr>
+        <w:pStyle w:val="ListParagraph"/>
+        <w:numPr>
+          <w:ilvl w:val="1"/>
+          <w:numId w:val="4"/>
+        </w:numPr>
+        <w:rPr>
+          <w:strike/>
+        </w:rPr>
+      </w:pPr>
+      <w:r>
+        <w:rPr>
+          <w:strike/>
+        </w:rPr>
+        <w:t xml:space="preserve">I edited the file structure, now there is </w:t>
+      </w:r>
+      <w:proofErr w:type="gramStart"/>
+      <w:r>
+        <w:rPr>
+          <w:strike/>
+        </w:rPr>
+        <w:t>not</w:t>
+      </w:r>
+      <w:proofErr w:type="gramEnd"/>
+      <w:r>
+        <w:rPr>
+          <w:strike/>
+        </w:rPr>
+        <w:t xml:space="preserve"> parent folder anymore, it is just the childcare-precarity-tool folder. </w:t>
+      </w:r>
+    </w:p>
+    <w:p>
+      <w:pPr>
+        <w:pStyle w:val="ListParagraph"/>
+        <w:numPr>
+          <w:ilvl w:val="1"/>
+          <w:numId w:val="4"/>
+        </w:numPr>
+        <w:rPr>
+          <w:strike/>
+        </w:rPr>
+      </w:pPr>
+      <w:r>
+        <w:rPr>
+          <w:strike/>
+        </w:rPr>
+        <w:t xml:space="preserve">I excluded some files and moved some to a folder called archive. Please have </w:t>
+      </w:r>
+      <w:proofErr w:type="spellStart"/>
+      <w:r>
+        <w:rPr>
+          <w:strike/>
+        </w:rPr>
+        <w:t>github</w:t>
+      </w:r>
+      <w:proofErr w:type="spellEnd"/>
+      <w:r>
+        <w:rPr>
+          <w:strike/>
+        </w:rPr>
+        <w:t xml:space="preserve"> ignore and not </w:t>
+      </w:r>
+      <w:r>
+        <w:rPr>
+          <w:strike/>
+        </w:rPr>
+        <w:t>synchronize this folder, I want it locally only</w:t>
+      </w:r>
+    </w:p>
+    <w:p>
+      <w:pPr>
+        <w:pStyle w:val="ListParagraph"/>
+        <w:numPr>
+          <w:ilvl w:val="1"/>
+          <w:numId w:val="4"/>
+        </w:numPr>
+      </w:pPr>
+      <w:r>
+        <w:br/>
+      </w:r>
+    </w:p>
+    <w:p>
+      <w:pPr>
+        <w:rPr>
+          <w:b/>
+          <w:bCs/>
+          <w:highlight w:val="yellow"/>
+        </w:rPr>
+      </w:pPr>
+    </w:p>
+    <w:p>
+      <w:pPr>
+        <w:rPr>
+          <w:b/>
+          <w:bCs/>
+        </w:rPr>
+      </w:pPr>
+      <w:r>
+        <w:rPr>
+          <w:b/>
+          <w:bCs/>
+          <w:highlight w:val="yellow"/>
+        </w:rPr>
         <w:t>3/17/2026</w:t>
       </w:r>
     </w:p>
@@ -896,7 +1456,6 @@
           <w:b/>
           <w:bCs/>
         </w:rPr>
-        <w:lastRenderedPageBreak/>
         <w:t>Entry and exit</w:t>
       </w:r>
       <w:r>
@@ -1089,6 +1648,7 @@
           <w:b/>
           <w:bCs/>
         </w:rPr>
+        <w:lastRenderedPageBreak/>
         <w:t>Access + precarity</w:t>
       </w:r>
     </w:p>
@@ -1239,8 +1799,13 @@
         <w:t xml:space="preserve">? </w:t>
       </w:r>
       <w:r>
-        <w:t>Provider has degree?</w:t>
-      </w:r>
+        <w:t xml:space="preserve">Provider has </w:t>
+      </w:r>
+      <w:proofErr w:type="gramStart"/>
+      <w:r>
+        <w:t>degree?</w:t>
+      </w:r>
+      <w:proofErr w:type="gramEnd"/>
     </w:p>
     <w:p>
       <w:pPr>
@@ -1289,8 +1854,13 @@
           <w:numId w:val="3"/>
         </w:numPr>
       </w:pPr>
-      <w:r>
-        <w:t>Meet parents’ needs</w:t>
+      <w:proofErr w:type="gramStart"/>
+      <w:r>
+        <w:t>Meet</w:t>
+      </w:r>
+      <w:proofErr w:type="gramEnd"/>
+      <w:r>
+        <w:t xml:space="preserve"> parents’ needs</w:t>
       </w:r>
     </w:p>
     <w:p>
@@ -1446,7 +2016,6 @@
         </w:numPr>
       </w:pPr>
       <w:r>
-        <w:lastRenderedPageBreak/>
         <w:t>Race/ethnicity</w:t>
       </w:r>
     </w:p>
@@ -1529,6 +2098,7 @@
         <w:rPr>
           <w:noProof/>
         </w:rPr>
+        <w:lastRenderedPageBreak/>
         <w:drawing>
           <wp:inline distT="0" distB="0" distL="0" distR="0" wp14:anchorId="6D8414E2" wp14:editId="68B1D156">
             <wp:extent cx="5614988" cy="2009638"/>
@@ -1545,7 +2115,7 @@
                     <pic:cNvPicPr/>
                   </pic:nvPicPr>
                   <pic:blipFill>
-                    <a:blip r:embed="rId5"/>
+                    <a:blip r:embed="rId7"/>
                     <a:stretch>
                       <a:fillRect/>
                     </a:stretch>
@@ -1600,7 +2170,7 @@
           <w:tab w:val="left" w:pos="7898"/>
         </w:tabs>
       </w:pPr>
-      <w:hyperlink r:id="rId6" w:history="1">
+      <w:hyperlink r:id="rId8" w:history="1">
         <w:r>
           <w:rPr>
             <w:rStyle w:val="Hyperlink"/>
@@ -1763,9 +2333,11 @@
           <w:tab w:val="left" w:pos="7898"/>
         </w:tabs>
       </w:pPr>
+      <w:proofErr w:type="spellStart"/>
       <w:r>
         <w:t>Etc</w:t>
       </w:r>
+      <w:proofErr w:type="spellEnd"/>
     </w:p>
     <w:p>
       <w:pPr>
@@ -1794,7 +2366,15 @@
         </w:tabs>
       </w:pPr>
       <w:r>
-        <w:t>Parents: precarity (instability + smth), work-status, stress, cognition?</w:t>
+        <w:t xml:space="preserve">Parents: precarity (instability + </w:t>
+      </w:r>
+      <w:proofErr w:type="spellStart"/>
+      <w:r>
+        <w:t>smth</w:t>
+      </w:r>
+      <w:proofErr w:type="spellEnd"/>
+      <w:r>
+        <w:t>), work-status, stress, cognition?</w:t>
       </w:r>
     </w:p>
     <w:p>
@@ -1824,7 +2404,6 @@
         </w:tabs>
       </w:pPr>
       <w:r>
-        <w:lastRenderedPageBreak/>
         <w:t xml:space="preserve">Kids: once at study entry, once </w:t>
       </w:r>
       <w:r>
@@ -1843,7 +2422,15 @@
         </w:tabs>
       </w:pPr>
       <w:r>
-        <w:t xml:space="preserve">Think about design carefully: how much time, when to measure, how long should the study be, etc. </w:t>
+        <w:t xml:space="preserve">Think about design carefully: how much time, when to measure, how long </w:t>
+      </w:r>
+      <w:proofErr w:type="gramStart"/>
+      <w:r>
+        <w:t>should the study</w:t>
+      </w:r>
+      <w:proofErr w:type="gramEnd"/>
+      <w:r>
+        <w:t xml:space="preserve"> be, etc. </w:t>
       </w:r>
     </w:p>
     <w:p>
@@ -1887,8 +2474,13 @@
         <w:t xml:space="preserve">Phil said to go community based, </w:t>
       </w:r>
       <w:r>
-        <w:t>make it useful, blablabla</w:t>
-      </w:r>
+        <w:t xml:space="preserve">make it useful, </w:t>
+      </w:r>
+      <w:proofErr w:type="spellStart"/>
+      <w:r>
+        <w:t>blablabla</w:t>
+      </w:r>
+      <w:proofErr w:type="spellEnd"/>
     </w:p>
     <w:p>
       <w:pPr>
@@ -1921,6 +2513,7 @@
         </w:tabs>
       </w:pPr>
       <w:r>
+        <w:lastRenderedPageBreak/>
         <w:t>We ask them to plan at the beginning of each week, they can use to orient themselves, just like a regular calendar</w:t>
       </w:r>
     </w:p>
@@ -2431,6 +3024,119 @@
     </w:lvl>
   </w:abstractNum>
   <w:abstractNum w:abstractNumId="3" w15:restartNumberingAfterBreak="0">
+    <w:nsid w:val="3F525B9C"/>
+    <w:multiLevelType w:val="hybridMultilevel"/>
+    <w:tmpl w:val="879E2A82"/>
+    <w:lvl w:ilvl="0" w:tplc="04090001">
+      <w:start w:val="1"/>
+      <w:numFmt w:val="bullet"/>
+      <w:lvlText w:val=""/>
+      <w:lvlJc w:val="left"/>
+      <w:pPr>
+        <w:ind w:left="720" w:hanging="360"/>
+      </w:pPr>
+      <w:rPr>
+        <w:rFonts w:ascii="Symbol" w:hAnsi="Symbol" w:hint="default"/>
+      </w:rPr>
+    </w:lvl>
+    <w:lvl w:ilvl="1" w:tplc="04090003">
+      <w:start w:val="1"/>
+      <w:numFmt w:val="bullet"/>
+      <w:lvlText w:val="o"/>
+      <w:lvlJc w:val="left"/>
+      <w:pPr>
+        <w:ind w:left="1440" w:hanging="360"/>
+      </w:pPr>
+      <w:rPr>
+        <w:rFonts w:ascii="Courier New" w:hAnsi="Courier New" w:cs="Courier New" w:hint="default"/>
+      </w:rPr>
+    </w:lvl>
+    <w:lvl w:ilvl="2" w:tplc="04090005" w:tentative="1">
+      <w:start w:val="1"/>
+      <w:numFmt w:val="bullet"/>
+      <w:lvlText w:val=""/>
+      <w:lvlJc w:val="left"/>
+      <w:pPr>
+        <w:ind w:left="2160" w:hanging="360"/>
+      </w:pPr>
+      <w:rPr>
+        <w:rFonts w:ascii="Wingdings" w:hAnsi="Wingdings" w:hint="default"/>
+      </w:rPr>
+    </w:lvl>
+    <w:lvl w:ilvl="3" w:tplc="04090001" w:tentative="1">
+      <w:start w:val="1"/>
+      <w:numFmt w:val="bullet"/>
+      <w:lvlText w:val=""/>
+      <w:lvlJc w:val="left"/>
+      <w:pPr>
+        <w:ind w:left="2880" w:hanging="360"/>
+      </w:pPr>
+      <w:rPr>
+        <w:rFonts w:ascii="Symbol" w:hAnsi="Symbol" w:hint="default"/>
+      </w:rPr>
+    </w:lvl>
+    <w:lvl w:ilvl="4" w:tplc="04090003" w:tentative="1">
+      <w:start w:val="1"/>
+      <w:numFmt w:val="bullet"/>
+      <w:lvlText w:val="o"/>
+      <w:lvlJc w:val="left"/>
+      <w:pPr>
+        <w:ind w:left="3600" w:hanging="360"/>
+      </w:pPr>
+      <w:rPr>
+        <w:rFonts w:ascii="Courier New" w:hAnsi="Courier New" w:cs="Courier New" w:hint="default"/>
+      </w:rPr>
+    </w:lvl>
+    <w:lvl w:ilvl="5" w:tplc="04090005" w:tentative="1">
+      <w:start w:val="1"/>
+      <w:numFmt w:val="bullet"/>
+      <w:lvlText w:val=""/>
+      <w:lvlJc w:val="left"/>
+      <w:pPr>
+        <w:ind w:left="4320" w:hanging="360"/>
+      </w:pPr>
+      <w:rPr>
+        <w:rFonts w:ascii="Wingdings" w:hAnsi="Wingdings" w:hint="default"/>
+      </w:rPr>
+    </w:lvl>
+    <w:lvl w:ilvl="6" w:tplc="04090001" w:tentative="1">
+      <w:start w:val="1"/>
+      <w:numFmt w:val="bullet"/>
+      <w:lvlText w:val=""/>
+      <w:lvlJc w:val="left"/>
+      <w:pPr>
+        <w:ind w:left="5040" w:hanging="360"/>
+      </w:pPr>
+      <w:rPr>
+        <w:rFonts w:ascii="Symbol" w:hAnsi="Symbol" w:hint="default"/>
+      </w:rPr>
+    </w:lvl>
+    <w:lvl w:ilvl="7" w:tplc="04090003" w:tentative="1">
+      <w:start w:val="1"/>
+      <w:numFmt w:val="bullet"/>
+      <w:lvlText w:val="o"/>
+      <w:lvlJc w:val="left"/>
+      <w:pPr>
+        <w:ind w:left="5760" w:hanging="360"/>
+      </w:pPr>
+      <w:rPr>
+        <w:rFonts w:ascii="Courier New" w:hAnsi="Courier New" w:cs="Courier New" w:hint="default"/>
+      </w:rPr>
+    </w:lvl>
+    <w:lvl w:ilvl="8" w:tplc="04090005" w:tentative="1">
+      <w:start w:val="1"/>
+      <w:numFmt w:val="bullet"/>
+      <w:lvlText w:val=""/>
+      <w:lvlJc w:val="left"/>
+      <w:pPr>
+        <w:ind w:left="6480" w:hanging="360"/>
+      </w:pPr>
+      <w:rPr>
+        <w:rFonts w:ascii="Wingdings" w:hAnsi="Wingdings" w:hint="default"/>
+      </w:rPr>
+    </w:lvl>
+  </w:abstractNum>
+  <w:abstractNum w:abstractNumId="4" w15:restartNumberingAfterBreak="0">
     <w:nsid w:val="440E073A"/>
     <w:multiLevelType w:val="hybridMultilevel"/>
     <w:tmpl w:val="C4C43F04"/>
@@ -2543,7 +3249,7 @@
       </w:rPr>
     </w:lvl>
   </w:abstractNum>
-  <w:abstractNum w:abstractNumId="4" w15:restartNumberingAfterBreak="0">
+  <w:abstractNum w:abstractNumId="5" w15:restartNumberingAfterBreak="0">
     <w:nsid w:val="453A0D2D"/>
     <w:multiLevelType w:val="hybridMultilevel"/>
     <w:tmpl w:val="57F4930A"/>
@@ -2656,7 +3362,120 @@
       </w:rPr>
     </w:lvl>
   </w:abstractNum>
-  <w:abstractNum w:abstractNumId="5" w15:restartNumberingAfterBreak="0">
+  <w:abstractNum w:abstractNumId="6" w15:restartNumberingAfterBreak="0">
+    <w:nsid w:val="53E66467"/>
+    <w:multiLevelType w:val="hybridMultilevel"/>
+    <w:tmpl w:val="40EADE80"/>
+    <w:lvl w:ilvl="0" w:tplc="04090001">
+      <w:start w:val="1"/>
+      <w:numFmt w:val="bullet"/>
+      <w:lvlText w:val=""/>
+      <w:lvlJc w:val="left"/>
+      <w:pPr>
+        <w:ind w:left="720" w:hanging="360"/>
+      </w:pPr>
+      <w:rPr>
+        <w:rFonts w:ascii="Symbol" w:hAnsi="Symbol" w:hint="default"/>
+      </w:rPr>
+    </w:lvl>
+    <w:lvl w:ilvl="1" w:tplc="04090003">
+      <w:start w:val="1"/>
+      <w:numFmt w:val="bullet"/>
+      <w:lvlText w:val="o"/>
+      <w:lvlJc w:val="left"/>
+      <w:pPr>
+        <w:ind w:left="1440" w:hanging="360"/>
+      </w:pPr>
+      <w:rPr>
+        <w:rFonts w:ascii="Courier New" w:hAnsi="Courier New" w:cs="Courier New" w:hint="default"/>
+      </w:rPr>
+    </w:lvl>
+    <w:lvl w:ilvl="2" w:tplc="04090005">
+      <w:start w:val="1"/>
+      <w:numFmt w:val="bullet"/>
+      <w:lvlText w:val=""/>
+      <w:lvlJc w:val="left"/>
+      <w:pPr>
+        <w:ind w:left="2160" w:hanging="360"/>
+      </w:pPr>
+      <w:rPr>
+        <w:rFonts w:ascii="Wingdings" w:hAnsi="Wingdings" w:hint="default"/>
+      </w:rPr>
+    </w:lvl>
+    <w:lvl w:ilvl="3" w:tplc="04090001" w:tentative="1">
+      <w:start w:val="1"/>
+      <w:numFmt w:val="bullet"/>
+      <w:lvlText w:val=""/>
+      <w:lvlJc w:val="left"/>
+      <w:pPr>
+        <w:ind w:left="2880" w:hanging="360"/>
+      </w:pPr>
+      <w:rPr>
+        <w:rFonts w:ascii="Symbol" w:hAnsi="Symbol" w:hint="default"/>
+      </w:rPr>
+    </w:lvl>
+    <w:lvl w:ilvl="4" w:tplc="04090003" w:tentative="1">
+      <w:start w:val="1"/>
+      <w:numFmt w:val="bullet"/>
+      <w:lvlText w:val="o"/>
+      <w:lvlJc w:val="left"/>
+      <w:pPr>
+        <w:ind w:left="3600" w:hanging="360"/>
+      </w:pPr>
+      <w:rPr>
+        <w:rFonts w:ascii="Courier New" w:hAnsi="Courier New" w:cs="Courier New" w:hint="default"/>
+      </w:rPr>
+    </w:lvl>
+    <w:lvl w:ilvl="5" w:tplc="04090005" w:tentative="1">
+      <w:start w:val="1"/>
+      <w:numFmt w:val="bullet"/>
+      <w:lvlText w:val=""/>
+      <w:lvlJc w:val="left"/>
+      <w:pPr>
+        <w:ind w:left="4320" w:hanging="360"/>
+      </w:pPr>
+      <w:rPr>
+        <w:rFonts w:ascii="Wingdings" w:hAnsi="Wingdings" w:hint="default"/>
+      </w:rPr>
+    </w:lvl>
+    <w:lvl w:ilvl="6" w:tplc="04090001" w:tentative="1">
+      <w:start w:val="1"/>
+      <w:numFmt w:val="bullet"/>
+      <w:lvlText w:val=""/>
+      <w:lvlJc w:val="left"/>
+      <w:pPr>
+        <w:ind w:left="5040" w:hanging="360"/>
+      </w:pPr>
+      <w:rPr>
+        <w:rFonts w:ascii="Symbol" w:hAnsi="Symbol" w:hint="default"/>
+      </w:rPr>
+    </w:lvl>
+    <w:lvl w:ilvl="7" w:tplc="04090003" w:tentative="1">
+      <w:start w:val="1"/>
+      <w:numFmt w:val="bullet"/>
+      <w:lvlText w:val="o"/>
+      <w:lvlJc w:val="left"/>
+      <w:pPr>
+        <w:ind w:left="5760" w:hanging="360"/>
+      </w:pPr>
+      <w:rPr>
+        <w:rFonts w:ascii="Courier New" w:hAnsi="Courier New" w:cs="Courier New" w:hint="default"/>
+      </w:rPr>
+    </w:lvl>
+    <w:lvl w:ilvl="8" w:tplc="04090005" w:tentative="1">
+      <w:start w:val="1"/>
+      <w:numFmt w:val="bullet"/>
+      <w:lvlText w:val=""/>
+      <w:lvlJc w:val="left"/>
+      <w:pPr>
+        <w:ind w:left="6480" w:hanging="360"/>
+      </w:pPr>
+      <w:rPr>
+        <w:rFonts w:ascii="Wingdings" w:hAnsi="Wingdings" w:hint="default"/>
+      </w:rPr>
+    </w:lvl>
+  </w:abstractNum>
+  <w:abstractNum w:abstractNumId="7" w15:restartNumberingAfterBreak="0">
     <w:nsid w:val="69C87589"/>
     <w:multiLevelType w:val="hybridMultilevel"/>
     <w:tmpl w:val="D20EEE36"/>
@@ -2779,12 +3598,18 @@
     <w:abstractNumId w:val="2"/>
   </w:num>
   <w:num w:numId="4" w16cid:durableId="396711410">
+    <w:abstractNumId w:val="7"/>
+  </w:num>
+  <w:num w:numId="5" w16cid:durableId="54668405">
     <w:abstractNumId w:val="5"/>
   </w:num>
-  <w:num w:numId="5" w16cid:durableId="54668405">
+  <w:num w:numId="6" w16cid:durableId="1629512001">
     <w:abstractNumId w:val="4"/>
   </w:num>
-  <w:num w:numId="6" w16cid:durableId="1629512001">
+  <w:num w:numId="7" w16cid:durableId="1792900513">
+    <w:abstractNumId w:val="6"/>
+  </w:num>
+  <w:num w:numId="8" w16cid:durableId="1702632414">
     <w:abstractNumId w:val="3"/>
   </w:num>
 </w:numbering>

</xml_diff>